<commit_message>
feat: added powerups in Breakout, changed paddle form
</commit_message>
<xml_diff>
--- a/Assets/project/Dokumentationen/dokumentation TicTacTo.docx
+++ b/Assets/project/Dokumentationen/dokumentation TicTacTo.docx
@@ -256,7 +256,7 @@
     <w:p>
       <w:r>
         <w:pict w14:anchorId="69A64FC2">
-          <v:rect id="_x0000_i1031" style="width:0;height:1.5pt" o:hralign="center" o:hrstd="t" o:hr="t" fillcolor="#a0a0a0" stroked="f"/>
+          <v:rect id="_x0000_i1025" style="width:0;height:1.5pt" o:hralign="center" o:hrstd="t" o:hr="t" fillcolor="#a0a0a0" stroked="f"/>
         </w:pict>
       </w:r>
     </w:p>
@@ -630,6 +630,9 @@
         </w:rPr>
       </w:pPr>
       <w:r>
+        <w:rPr>
+          <w:lang w:val="de-DE"/>
+        </w:rPr>
         <w:t>┌</w:t>
       </w:r>
     </w:p>
@@ -655,196 +658,584 @@
       </w:pPr>
     </w:p>
     <w:p>
-      <w:r>
+      <w:pPr>
+        <w:rPr>
+          <w:lang w:val="de-DE"/>
+        </w:rPr>
+      </w:pPr>
+      <w:r>
+        <w:rPr>
+          <w:lang w:val="de-DE"/>
+        </w:rPr>
         <w:t>───────────────────────────────┐</w:t>
       </w:r>
     </w:p>
     <w:p>
-      <w:r>
+      <w:pPr>
+        <w:rPr>
+          <w:lang w:val="de-DE"/>
+        </w:rPr>
+      </w:pPr>
+      <w:r>
+        <w:rPr>
+          <w:lang w:val="de-DE"/>
+        </w:rPr>
         <w:t xml:space="preserve">│        </w:t>
       </w:r>
       <w:proofErr w:type="spellStart"/>
       <w:r>
+        <w:rPr>
+          <w:lang w:val="de-DE"/>
+        </w:rPr>
         <w:t>TicTacToManager</w:t>
       </w:r>
       <w:proofErr w:type="spellEnd"/>
       <w:r>
+        <w:rPr>
+          <w:lang w:val="de-DE"/>
+        </w:rPr>
         <w:t xml:space="preserve">        │</w:t>
       </w:r>
     </w:p>
     <w:p>
+      <w:pPr>
+        <w:rPr>
+          <w:lang w:val="de-DE"/>
+        </w:rPr>
+      </w:pPr>
       <w:r>
         <w:rPr>
           <w:rFonts w:ascii="MS Gothic" w:eastAsia="MS Gothic" w:hAnsi="MS Gothic" w:cs="MS Gothic" w:hint="eastAsia"/>
+          <w:lang w:val="de-DE"/>
         </w:rPr>
         <w:t>├</w:t>
       </w:r>
       <w:r>
         <w:rPr>
           <w:rFonts w:ascii="Calibri" w:hAnsi="Calibri" w:cs="Calibri"/>
+          <w:lang w:val="de-DE"/>
         </w:rPr>
         <w:t>───────────────────────────────</w:t>
       </w:r>
       <w:r>
         <w:rPr>
           <w:rFonts w:ascii="MS Gothic" w:eastAsia="MS Gothic" w:hAnsi="MS Gothic" w:cs="MS Gothic" w:hint="eastAsia"/>
+          <w:lang w:val="de-DE"/>
         </w:rPr>
         <w:t>┤</w:t>
       </w:r>
     </w:p>
     <w:p>
-      <w:r>
+      <w:pPr>
+        <w:rPr>
+          <w:lang w:val="de-DE"/>
+        </w:rPr>
+      </w:pPr>
+      <w:r>
+        <w:rPr>
+          <w:lang w:val="de-DE"/>
+        </w:rPr>
         <w:t xml:space="preserve">│ + </w:t>
       </w:r>
       <w:proofErr w:type="spellStart"/>
       <w:r>
+        <w:rPr>
+          <w:lang w:val="de-DE"/>
+        </w:rPr>
         <w:t>infoText</w:t>
       </w:r>
       <w:proofErr w:type="spellEnd"/>
       <w:r>
+        <w:rPr>
+          <w:lang w:val="de-DE"/>
+        </w:rPr>
         <w:t xml:space="preserve">: </w:t>
       </w:r>
       <w:proofErr w:type="spellStart"/>
       <w:r>
+        <w:rPr>
+          <w:lang w:val="de-DE"/>
+        </w:rPr>
         <w:t>TextMeshProUGUI</w:t>
       </w:r>
       <w:proofErr w:type="spellEnd"/>
       <w:r>
+        <w:rPr>
+          <w:lang w:val="de-DE"/>
+        </w:rPr>
         <w:t xml:space="preserve">   │</w:t>
       </w:r>
     </w:p>
     <w:p>
-      <w:r>
+      <w:pPr>
+        <w:rPr>
+          <w:lang w:val="de-DE"/>
+        </w:rPr>
+      </w:pPr>
+      <w:r>
+        <w:rPr>
+          <w:lang w:val="de-DE"/>
+        </w:rPr>
         <w:lastRenderedPageBreak/>
         <w:t xml:space="preserve">│ + </w:t>
       </w:r>
       <w:proofErr w:type="spellStart"/>
       <w:r>
+        <w:rPr>
+          <w:lang w:val="de-DE"/>
+        </w:rPr>
         <w:t>restartButton</w:t>
       </w:r>
       <w:proofErr w:type="spellEnd"/>
       <w:r>
+        <w:rPr>
+          <w:lang w:val="de-DE"/>
+        </w:rPr>
+        <w:t>: Button      │</w:t>
+      </w:r>
+    </w:p>
+    <w:p>
+      <w:pPr>
+        <w:rPr>
+          <w:lang w:val="en-US"/>
+        </w:rPr>
+      </w:pPr>
+      <w:r>
+        <w:rPr>
+          <w:lang w:val="en-US"/>
+        </w:rPr>
+        <w:t>│ + bombButtonPlayer1: Button  │</w:t>
+      </w:r>
+    </w:p>
+    <w:p>
+      <w:pPr>
+        <w:rPr>
+          <w:lang w:val="en-US"/>
+        </w:rPr>
+      </w:pPr>
+      <w:r>
+        <w:rPr>
+          <w:lang w:val="en-US"/>
+        </w:rPr>
+        <w:t>│ + bombButtonPlayer2: Button  │</w:t>
+      </w:r>
+    </w:p>
+    <w:p>
+      <w:pPr>
+        <w:rPr>
+          <w:lang w:val="en-US"/>
+        </w:rPr>
+      </w:pPr>
+      <w:r>
+        <w:rPr>
+          <w:lang w:val="en-US"/>
+        </w:rPr>
+        <w:t xml:space="preserve">│ + featureButtonsPlayer1: </w:t>
+      </w:r>
+      <w:proofErr w:type="spellStart"/>
+      <w:r>
+        <w:rPr>
+          <w:lang w:val="en-US"/>
+        </w:rPr>
+        <w:t>Btn</w:t>
+      </w:r>
+      <w:proofErr w:type="spellEnd"/>
+      <w:r>
+        <w:rPr>
+          <w:lang w:val="en-US"/>
+        </w:rPr>
+        <w:t>[]│</w:t>
+      </w:r>
+    </w:p>
+    <w:p>
+      <w:pPr>
+        <w:rPr>
+          <w:lang w:val="en-US"/>
+        </w:rPr>
+      </w:pPr>
+      <w:r>
+        <w:rPr>
+          <w:lang w:val="en-US"/>
+        </w:rPr>
+        <w:t xml:space="preserve">│ + featureButtonsPlayer2: </w:t>
+      </w:r>
+      <w:proofErr w:type="spellStart"/>
+      <w:r>
+        <w:rPr>
+          <w:lang w:val="en-US"/>
+        </w:rPr>
+        <w:t>Btn</w:t>
+      </w:r>
+      <w:proofErr w:type="spellEnd"/>
+      <w:r>
+        <w:rPr>
+          <w:lang w:val="en-US"/>
+        </w:rPr>
+        <w:t>[]│</w:t>
+      </w:r>
+    </w:p>
+    <w:p>
+      <w:pPr>
+        <w:rPr>
+          <w:lang w:val="en-US"/>
+        </w:rPr>
+      </w:pPr>
+      <w:r>
+        <w:rPr>
+          <w:lang w:val="en-US"/>
+        </w:rPr>
+        <w:t xml:space="preserve">│ + </w:t>
+      </w:r>
+      <w:proofErr w:type="spellStart"/>
+      <w:r>
+        <w:rPr>
+          <w:lang w:val="en-US"/>
+        </w:rPr>
+        <w:t>fieldButtons</w:t>
+      </w:r>
+      <w:proofErr w:type="spellEnd"/>
+      <w:r>
+        <w:rPr>
+          <w:lang w:val="en-US"/>
+        </w:rPr>
+        <w:t>: FieldButton[]│</w:t>
+      </w:r>
+    </w:p>
+    <w:p>
+      <w:pPr>
+        <w:rPr>
+          <w:lang w:val="en-US"/>
+        </w:rPr>
+      </w:pPr>
+      <w:r>
+        <w:rPr>
+          <w:lang w:val="en-US"/>
+        </w:rPr>
+        <w:t>│                               │</w:t>
+      </w:r>
+    </w:p>
+    <w:p>
+      <w:pPr>
+        <w:rPr>
+          <w:lang w:val="en-US"/>
+        </w:rPr>
+      </w:pPr>
+      <w:r>
+        <w:rPr>
+          <w:lang w:val="en-US"/>
+        </w:rPr>
+        <w:t xml:space="preserve">│ - </w:t>
+      </w:r>
+      <w:proofErr w:type="spellStart"/>
+      <w:r>
+        <w:rPr>
+          <w:lang w:val="en-US"/>
+        </w:rPr>
+        <w:t>currentPlayer</w:t>
+      </w:r>
+      <w:proofErr w:type="spellEnd"/>
+      <w:r>
+        <w:rPr>
+          <w:lang w:val="en-US"/>
+        </w:rPr>
+        <w:t>: int          │</w:t>
+      </w:r>
+    </w:p>
+    <w:p>
+      <w:pPr>
+        <w:rPr>
+          <w:lang w:val="en-US"/>
+        </w:rPr>
+      </w:pPr>
+      <w:r>
+        <w:rPr>
+          <w:lang w:val="en-US"/>
+        </w:rPr>
+        <w:t xml:space="preserve">│ - </w:t>
+      </w:r>
+      <w:proofErr w:type="spellStart"/>
+      <w:r>
+        <w:rPr>
+          <w:lang w:val="en-US"/>
+        </w:rPr>
+        <w:t>gameEnded</w:t>
+      </w:r>
+      <w:proofErr w:type="spellEnd"/>
+      <w:r>
+        <w:rPr>
+          <w:lang w:val="en-US"/>
+        </w:rPr>
+        <w:t>: bool             │</w:t>
+      </w:r>
+    </w:p>
+    <w:p>
+      <w:pPr>
+        <w:rPr>
+          <w:lang w:val="en-US"/>
+        </w:rPr>
+      </w:pPr>
+      <w:r>
+        <w:rPr>
+          <w:lang w:val="en-US"/>
+        </w:rPr>
+        <w:t xml:space="preserve">│ - </w:t>
+      </w:r>
+      <w:proofErr w:type="spellStart"/>
+      <w:r>
+        <w:rPr>
+          <w:lang w:val="en-US"/>
+        </w:rPr>
+        <w:t>gameStarted</w:t>
+      </w:r>
+      <w:proofErr w:type="spellEnd"/>
+      <w:r>
+        <w:rPr>
+          <w:lang w:val="en-US"/>
+        </w:rPr>
+        <w:t>: bool           │</w:t>
+      </w:r>
+    </w:p>
+    <w:p>
+      <w:pPr>
+        <w:rPr>
+          <w:lang w:val="en-US"/>
+        </w:rPr>
+      </w:pPr>
+      <w:r>
+        <w:rPr>
+          <w:lang w:val="en-US"/>
+        </w:rPr>
+        <w:t>│                               │</w:t>
+      </w:r>
+    </w:p>
+    <w:p>
+      <w:pPr>
+        <w:rPr>
+          <w:lang w:val="en-US"/>
+        </w:rPr>
+      </w:pPr>
+      <w:r>
+        <w:rPr>
+          <w:lang w:val="en-US"/>
+        </w:rPr>
+        <w:t xml:space="preserve">│ - </w:t>
+      </w:r>
+      <w:proofErr w:type="spellStart"/>
+      <w:r>
+        <w:rPr>
+          <w:lang w:val="en-US"/>
+        </w:rPr>
+        <w:t>activeFeature</w:t>
+      </w:r>
+      <w:proofErr w:type="spellEnd"/>
+      <w:r>
+        <w:rPr>
+          <w:lang w:val="en-US"/>
+        </w:rPr>
         <w:t xml:space="preserve">: </w:t>
       </w:r>
       <w:proofErr w:type="spellStart"/>
       <w:r>
-        <w:t>Button</w:t>
-      </w:r>
-      <w:proofErr w:type="spellEnd"/>
-      <w:r>
-        <w:t xml:space="preserve">      │</w:t>
-      </w:r>
-    </w:p>
-    <w:p>
-      <w:pPr>
-        <w:rPr>
-          <w:lang w:val="en-US"/>
-        </w:rPr>
-      </w:pPr>
-      <w:r>
-        <w:rPr>
-          <w:lang w:val="en-US"/>
-        </w:rPr>
-        <w:t xml:space="preserve">│ + bombButtonPlayer1: </w:t>
-      </w:r>
-      <w:proofErr w:type="gramStart"/>
-      <w:r>
-        <w:rPr>
-          <w:lang w:val="en-US"/>
-        </w:rPr>
-        <w:t>Button  │</w:t>
-      </w:r>
-      <w:proofErr w:type="gramEnd"/>
-    </w:p>
-    <w:p>
-      <w:pPr>
-        <w:rPr>
-          <w:lang w:val="en-US"/>
-        </w:rPr>
-      </w:pPr>
-      <w:r>
-        <w:rPr>
-          <w:lang w:val="en-US"/>
-        </w:rPr>
-        <w:t xml:space="preserve">│ + bombButtonPlayer2: </w:t>
-      </w:r>
-      <w:proofErr w:type="gramStart"/>
-      <w:r>
-        <w:rPr>
-          <w:lang w:val="en-US"/>
-        </w:rPr>
-        <w:t>Button  │</w:t>
-      </w:r>
-      <w:proofErr w:type="gramEnd"/>
-    </w:p>
-    <w:p>
-      <w:pPr>
-        <w:rPr>
-          <w:lang w:val="en-US"/>
-        </w:rPr>
-      </w:pPr>
-      <w:r>
-        <w:rPr>
-          <w:lang w:val="en-US"/>
-        </w:rPr>
-        <w:t xml:space="preserve">│ + featureButtonsPlayer1: </w:t>
-      </w:r>
-      <w:proofErr w:type="spellStart"/>
-      <w:proofErr w:type="gramStart"/>
-      <w:r>
-        <w:rPr>
-          <w:lang w:val="en-US"/>
-        </w:rPr>
-        <w:t>Btn</w:t>
-      </w:r>
-      <w:proofErr w:type="spellEnd"/>
-      <w:r>
-        <w:rPr>
-          <w:lang w:val="en-US"/>
-        </w:rPr>
-        <w:t>[</w:t>
-      </w:r>
-      <w:proofErr w:type="gramEnd"/>
-      <w:r>
-        <w:rPr>
-          <w:lang w:val="en-US"/>
-        </w:rPr>
-        <w:t>]│</w:t>
-      </w:r>
-    </w:p>
-    <w:p>
-      <w:pPr>
-        <w:rPr>
-          <w:lang w:val="en-US"/>
-        </w:rPr>
-      </w:pPr>
-      <w:r>
-        <w:rPr>
-          <w:lang w:val="en-US"/>
-        </w:rPr>
-        <w:t xml:space="preserve">│ + featureButtonsPlayer2: </w:t>
-      </w:r>
-      <w:proofErr w:type="spellStart"/>
-      <w:proofErr w:type="gramStart"/>
-      <w:r>
-        <w:rPr>
-          <w:lang w:val="en-US"/>
-        </w:rPr>
-        <w:t>Btn</w:t>
-      </w:r>
-      <w:proofErr w:type="spellEnd"/>
-      <w:r>
-        <w:rPr>
-          <w:lang w:val="en-US"/>
-        </w:rPr>
-        <w:t>[</w:t>
-      </w:r>
-      <w:proofErr w:type="gramEnd"/>
-      <w:r>
-        <w:rPr>
-          <w:lang w:val="en-US"/>
-        </w:rPr>
-        <w:t>]│</w:t>
+        <w:rPr>
+          <w:lang w:val="en-US"/>
+        </w:rPr>
+        <w:t>FeatureType</w:t>
+      </w:r>
+      <w:proofErr w:type="spellEnd"/>
+      <w:r>
+        <w:rPr>
+          <w:lang w:val="en-US"/>
+        </w:rPr>
+        <w:t>? │</w:t>
+      </w:r>
+    </w:p>
+    <w:p>
+      <w:pPr>
+        <w:rPr>
+          <w:lang w:val="en-US"/>
+        </w:rPr>
+      </w:pPr>
+      <w:r>
+        <w:rPr>
+          <w:lang w:val="en-US"/>
+        </w:rPr>
+        <w:t xml:space="preserve">│ - </w:t>
+      </w:r>
+      <w:proofErr w:type="spellStart"/>
+      <w:r>
+        <w:rPr>
+          <w:lang w:val="en-US"/>
+        </w:rPr>
+        <w:t>extraTurnsRemaining</w:t>
+      </w:r>
+      <w:proofErr w:type="spellEnd"/>
+      <w:r>
+        <w:rPr>
+          <w:lang w:val="en-US"/>
+        </w:rPr>
+        <w:t>: int    │</w:t>
+      </w:r>
+    </w:p>
+    <w:p>
+      <w:pPr>
+        <w:rPr>
+          <w:lang w:val="en-US"/>
+        </w:rPr>
+      </w:pPr>
+      <w:r>
+        <w:rPr>
+          <w:lang w:val="en-US"/>
+        </w:rPr>
+        <w:t xml:space="preserve">│ - </w:t>
+      </w:r>
+      <w:proofErr w:type="spellStart"/>
+      <w:r>
+        <w:rPr>
+          <w:lang w:val="en-US"/>
+        </w:rPr>
+        <w:t>isBombActive</w:t>
+      </w:r>
+      <w:proofErr w:type="spellEnd"/>
+      <w:r>
+        <w:rPr>
+          <w:lang w:val="en-US"/>
+        </w:rPr>
+        <w:t>: bool          │</w:t>
+      </w:r>
+    </w:p>
+    <w:p>
+      <w:pPr>
+        <w:rPr>
+          <w:lang w:val="en-US"/>
+        </w:rPr>
+      </w:pPr>
+      <w:r>
+        <w:rPr>
+          <w:lang w:val="en-US"/>
+        </w:rPr>
+        <w:t xml:space="preserve">│ - </w:t>
+      </w:r>
+      <w:proofErr w:type="spellStart"/>
+      <w:r>
+        <w:rPr>
+          <w:lang w:val="en-US"/>
+        </w:rPr>
+        <w:t>bombUsed</w:t>
+      </w:r>
+      <w:proofErr w:type="spellEnd"/>
+      <w:r>
+        <w:rPr>
+          <w:lang w:val="en-US"/>
+        </w:rPr>
+        <w:t>: bool[]            │</w:t>
+      </w:r>
+    </w:p>
+    <w:p>
+      <w:pPr>
+        <w:rPr>
+          <w:lang w:val="en-US"/>
+        </w:rPr>
+      </w:pPr>
+      <w:r>
+        <w:rPr>
+          <w:lang w:val="en-US"/>
+        </w:rPr>
+        <w:t xml:space="preserve">│ - </w:t>
+      </w:r>
+      <w:proofErr w:type="spellStart"/>
+      <w:r>
+        <w:rPr>
+          <w:lang w:val="en-US"/>
+        </w:rPr>
+        <w:t>movesPerPlayer</w:t>
+      </w:r>
+      <w:proofErr w:type="spellEnd"/>
+      <w:r>
+        <w:rPr>
+          <w:lang w:val="en-US"/>
+        </w:rPr>
+        <w:t>: int[]       │</w:t>
+      </w:r>
+    </w:p>
+    <w:p>
+      <w:pPr>
+        <w:rPr>
+          <w:lang w:val="en-US"/>
+        </w:rPr>
+      </w:pPr>
+      <w:r>
+        <w:rPr>
+          <w:lang w:val="en-US"/>
+        </w:rPr>
+        <w:t>│                               │</w:t>
+      </w:r>
+    </w:p>
+    <w:p>
+      <w:pPr>
+        <w:rPr>
+          <w:lang w:val="en-US"/>
+        </w:rPr>
+      </w:pPr>
+      <w:r>
+        <w:rPr>
+          <w:lang w:val="en-US"/>
+        </w:rPr>
+        <w:t xml:space="preserve">│ - </w:t>
+      </w:r>
+      <w:proofErr w:type="spellStart"/>
+      <w:r>
+        <w:rPr>
+          <w:lang w:val="en-US"/>
+        </w:rPr>
+        <w:t>winningCombinations</w:t>
+      </w:r>
+      <w:proofErr w:type="spellEnd"/>
+      <w:r>
+        <w:rPr>
+          <w:lang w:val="en-US"/>
+        </w:rPr>
+        <w:t>: int[][]│</w:t>
+      </w:r>
+    </w:p>
+    <w:p>
+      <w:pPr>
+        <w:rPr>
+          <w:lang w:val="en-US"/>
+        </w:rPr>
+      </w:pPr>
+      <w:r>
+        <w:rPr>
+          <w:rFonts w:ascii="MS Gothic" w:eastAsia="MS Gothic" w:hAnsi="MS Gothic" w:cs="MS Gothic" w:hint="eastAsia"/>
+          <w:lang w:val="en-US"/>
+        </w:rPr>
+        <w:t>├</w:t>
+      </w:r>
+      <w:r>
+        <w:rPr>
+          <w:rFonts w:ascii="Calibri" w:hAnsi="Calibri" w:cs="Calibri"/>
+          <w:lang w:val="en-US"/>
+        </w:rPr>
+        <w:t>───────────────────────────────</w:t>
+      </w:r>
+      <w:r>
+        <w:rPr>
+          <w:rFonts w:ascii="MS Gothic" w:eastAsia="MS Gothic" w:hAnsi="MS Gothic" w:cs="MS Gothic" w:hint="eastAsia"/>
+          <w:lang w:val="en-US"/>
+        </w:rPr>
+        <w:t>┤</w:t>
+      </w:r>
+    </w:p>
+    <w:p>
+      <w:pPr>
+        <w:rPr>
+          <w:lang w:val="en-US"/>
+        </w:rPr>
+      </w:pPr>
+      <w:r>
+        <w:rPr>
+          <w:lang w:val="en-US"/>
+        </w:rPr>
+        <w:t>│ + Start(): void               │</w:t>
       </w:r>
     </w:p>
     <w:p>
@@ -864,402 +1255,14 @@
         <w:rPr>
           <w:lang w:val="en-US"/>
         </w:rPr>
-        <w:t>fieldButtons</w:t>
-      </w:r>
-      <w:proofErr w:type="spellEnd"/>
-      <w:r>
-        <w:rPr>
-          <w:lang w:val="en-US"/>
-        </w:rPr>
-        <w:t xml:space="preserve">: </w:t>
-      </w:r>
-      <w:proofErr w:type="spellStart"/>
-      <w:proofErr w:type="gramStart"/>
-      <w:r>
-        <w:rPr>
-          <w:lang w:val="en-US"/>
-        </w:rPr>
-        <w:t>FieldButton</w:t>
-      </w:r>
-      <w:proofErr w:type="spellEnd"/>
-      <w:r>
-        <w:rPr>
-          <w:lang w:val="en-US"/>
-        </w:rPr>
-        <w:t>[</w:t>
-      </w:r>
-      <w:proofErr w:type="gramEnd"/>
-      <w:r>
-        <w:rPr>
-          <w:lang w:val="en-US"/>
-        </w:rPr>
-        <w:t>]│</w:t>
-      </w:r>
-    </w:p>
-    <w:p>
-      <w:pPr>
-        <w:rPr>
-          <w:lang w:val="en-US"/>
-        </w:rPr>
-      </w:pPr>
-      <w:r>
-        <w:rPr>
-          <w:lang w:val="en-US"/>
-        </w:rPr>
-        <w:t>│                               │</w:t>
-      </w:r>
-    </w:p>
-    <w:p>
-      <w:pPr>
-        <w:rPr>
-          <w:lang w:val="en-US"/>
-        </w:rPr>
-      </w:pPr>
-      <w:r>
-        <w:rPr>
-          <w:lang w:val="en-US"/>
-        </w:rPr>
-        <w:t xml:space="preserve">│ - </w:t>
-      </w:r>
-      <w:proofErr w:type="spellStart"/>
-      <w:r>
-        <w:rPr>
-          <w:lang w:val="en-US"/>
-        </w:rPr>
-        <w:t>currentPlayer</w:t>
-      </w:r>
-      <w:proofErr w:type="spellEnd"/>
-      <w:r>
-        <w:rPr>
-          <w:lang w:val="en-US"/>
-        </w:rPr>
-        <w:t>: int          │</w:t>
-      </w:r>
-    </w:p>
-    <w:p>
-      <w:pPr>
-        <w:rPr>
-          <w:lang w:val="en-US"/>
-        </w:rPr>
-      </w:pPr>
-      <w:r>
-        <w:rPr>
-          <w:lang w:val="en-US"/>
-        </w:rPr>
-        <w:t xml:space="preserve">│ - </w:t>
-      </w:r>
-      <w:proofErr w:type="spellStart"/>
-      <w:r>
-        <w:rPr>
-          <w:lang w:val="en-US"/>
-        </w:rPr>
-        <w:t>gameEnded</w:t>
-      </w:r>
-      <w:proofErr w:type="spellEnd"/>
-      <w:r>
-        <w:rPr>
-          <w:lang w:val="en-US"/>
-        </w:rPr>
-        <w:t>: bool             │</w:t>
-      </w:r>
-    </w:p>
-    <w:p>
-      <w:pPr>
-        <w:rPr>
-          <w:lang w:val="en-US"/>
-        </w:rPr>
-      </w:pPr>
-      <w:r>
-        <w:rPr>
-          <w:lang w:val="en-US"/>
-        </w:rPr>
-        <w:t xml:space="preserve">│ - </w:t>
-      </w:r>
-      <w:proofErr w:type="spellStart"/>
-      <w:r>
-        <w:rPr>
-          <w:lang w:val="en-US"/>
-        </w:rPr>
-        <w:t>gameStarted</w:t>
-      </w:r>
-      <w:proofErr w:type="spellEnd"/>
-      <w:r>
-        <w:rPr>
-          <w:lang w:val="en-US"/>
-        </w:rPr>
-        <w:t>: bool           │</w:t>
-      </w:r>
-    </w:p>
-    <w:p>
-      <w:pPr>
-        <w:rPr>
-          <w:lang w:val="en-US"/>
-        </w:rPr>
-      </w:pPr>
-      <w:r>
-        <w:rPr>
-          <w:lang w:val="en-US"/>
-        </w:rPr>
-        <w:t>│                               │</w:t>
-      </w:r>
-    </w:p>
-    <w:p>
-      <w:pPr>
-        <w:rPr>
-          <w:lang w:val="en-US"/>
-        </w:rPr>
-      </w:pPr>
-      <w:r>
-        <w:rPr>
-          <w:lang w:val="en-US"/>
-        </w:rPr>
-        <w:t xml:space="preserve">│ - </w:t>
-      </w:r>
-      <w:proofErr w:type="spellStart"/>
-      <w:r>
-        <w:rPr>
-          <w:lang w:val="en-US"/>
-        </w:rPr>
-        <w:t>activeFeature</w:t>
-      </w:r>
-      <w:proofErr w:type="spellEnd"/>
-      <w:r>
-        <w:rPr>
-          <w:lang w:val="en-US"/>
-        </w:rPr>
-        <w:t xml:space="preserve">: </w:t>
-      </w:r>
-      <w:proofErr w:type="spellStart"/>
-      <w:r>
-        <w:rPr>
-          <w:lang w:val="en-US"/>
-        </w:rPr>
-        <w:t>FeatureType</w:t>
-      </w:r>
-      <w:proofErr w:type="spellEnd"/>
-      <w:r>
-        <w:rPr>
-          <w:lang w:val="en-US"/>
-        </w:rPr>
-        <w:t>? │</w:t>
-      </w:r>
-    </w:p>
-    <w:p>
-      <w:pPr>
-        <w:rPr>
-          <w:lang w:val="en-US"/>
-        </w:rPr>
-      </w:pPr>
-      <w:r>
-        <w:rPr>
-          <w:lang w:val="en-US"/>
-        </w:rPr>
-        <w:t xml:space="preserve">│ - </w:t>
-      </w:r>
-      <w:proofErr w:type="spellStart"/>
-      <w:r>
-        <w:rPr>
-          <w:lang w:val="en-US"/>
-        </w:rPr>
-        <w:t>extraTurnsRemaining</w:t>
-      </w:r>
-      <w:proofErr w:type="spellEnd"/>
-      <w:r>
-        <w:rPr>
-          <w:lang w:val="en-US"/>
-        </w:rPr>
-        <w:t>: int    │</w:t>
-      </w:r>
-    </w:p>
-    <w:p>
-      <w:pPr>
-        <w:rPr>
-          <w:lang w:val="en-US"/>
-        </w:rPr>
-      </w:pPr>
-      <w:r>
-        <w:rPr>
-          <w:lang w:val="en-US"/>
-        </w:rPr>
-        <w:t xml:space="preserve">│ - </w:t>
-      </w:r>
-      <w:proofErr w:type="spellStart"/>
-      <w:r>
-        <w:rPr>
-          <w:lang w:val="en-US"/>
-        </w:rPr>
-        <w:t>isBombActive</w:t>
-      </w:r>
-      <w:proofErr w:type="spellEnd"/>
-      <w:r>
-        <w:rPr>
-          <w:lang w:val="en-US"/>
-        </w:rPr>
-        <w:t>: bool          │</w:t>
-      </w:r>
-    </w:p>
-    <w:p>
-      <w:pPr>
-        <w:rPr>
-          <w:lang w:val="en-US"/>
-        </w:rPr>
-      </w:pPr>
-      <w:r>
-        <w:rPr>
-          <w:lang w:val="en-US"/>
-        </w:rPr>
-        <w:t xml:space="preserve">│ - </w:t>
-      </w:r>
-      <w:proofErr w:type="spellStart"/>
-      <w:r>
-        <w:rPr>
-          <w:lang w:val="en-US"/>
-        </w:rPr>
-        <w:t>bombUsed</w:t>
-      </w:r>
-      <w:proofErr w:type="spellEnd"/>
-      <w:r>
-        <w:rPr>
-          <w:lang w:val="en-US"/>
-        </w:rPr>
-        <w:t xml:space="preserve">: </w:t>
-      </w:r>
-      <w:proofErr w:type="gramStart"/>
-      <w:r>
-        <w:rPr>
-          <w:lang w:val="en-US"/>
-        </w:rPr>
-        <w:t>bool[</w:t>
-      </w:r>
-      <w:proofErr w:type="gramEnd"/>
-      <w:r>
-        <w:rPr>
-          <w:lang w:val="en-US"/>
-        </w:rPr>
-        <w:t>]            │</w:t>
-      </w:r>
-    </w:p>
-    <w:p>
-      <w:pPr>
-        <w:rPr>
-          <w:lang w:val="en-US"/>
-        </w:rPr>
-      </w:pPr>
-      <w:r>
-        <w:rPr>
-          <w:lang w:val="en-US"/>
-        </w:rPr>
-        <w:t xml:space="preserve">│ - </w:t>
-      </w:r>
-      <w:proofErr w:type="spellStart"/>
-      <w:r>
-        <w:rPr>
-          <w:lang w:val="en-US"/>
-        </w:rPr>
-        <w:t>movesPerPlayer</w:t>
-      </w:r>
-      <w:proofErr w:type="spellEnd"/>
-      <w:r>
-        <w:rPr>
-          <w:lang w:val="en-US"/>
-        </w:rPr>
-        <w:t xml:space="preserve">: </w:t>
-      </w:r>
-      <w:proofErr w:type="gramStart"/>
-      <w:r>
-        <w:rPr>
-          <w:lang w:val="en-US"/>
-        </w:rPr>
-        <w:t>int[</w:t>
-      </w:r>
-      <w:proofErr w:type="gramEnd"/>
-      <w:r>
-        <w:rPr>
-          <w:lang w:val="en-US"/>
-        </w:rPr>
-        <w:t>]       │</w:t>
-      </w:r>
-    </w:p>
-    <w:p>
-      <w:pPr>
-        <w:rPr>
-          <w:lang w:val="en-US"/>
-        </w:rPr>
-      </w:pPr>
-      <w:r>
-        <w:rPr>
-          <w:lang w:val="en-US"/>
-        </w:rPr>
-        <w:t>│                               │</w:t>
-      </w:r>
-    </w:p>
-    <w:p>
-      <w:pPr>
-        <w:rPr>
-          <w:lang w:val="en-US"/>
-        </w:rPr>
-      </w:pPr>
-      <w:r>
-        <w:rPr>
-          <w:lang w:val="en-US"/>
-        </w:rPr>
-        <w:t xml:space="preserve">│ - </w:t>
-      </w:r>
-      <w:proofErr w:type="spellStart"/>
-      <w:r>
-        <w:rPr>
-          <w:lang w:val="en-US"/>
-        </w:rPr>
-        <w:t>winningCombinations</w:t>
-      </w:r>
-      <w:proofErr w:type="spellEnd"/>
-      <w:r>
-        <w:rPr>
-          <w:lang w:val="en-US"/>
-        </w:rPr>
-        <w:t xml:space="preserve">: </w:t>
-      </w:r>
-      <w:proofErr w:type="gramStart"/>
-      <w:r>
-        <w:rPr>
-          <w:lang w:val="en-US"/>
-        </w:rPr>
-        <w:t>int[</w:t>
-      </w:r>
-      <w:proofErr w:type="gramEnd"/>
-      <w:r>
-        <w:rPr>
-          <w:lang w:val="en-US"/>
-        </w:rPr>
-        <w:t>][]│</w:t>
-      </w:r>
-    </w:p>
-    <w:p>
-      <w:pPr>
-        <w:rPr>
-          <w:lang w:val="en-US"/>
-        </w:rPr>
-      </w:pPr>
-      <w:r>
-        <w:rPr>
-          <w:rFonts w:ascii="MS Gothic" w:eastAsia="MS Gothic" w:hAnsi="MS Gothic" w:cs="MS Gothic" w:hint="eastAsia"/>
-          <w:lang w:val="en-US"/>
-        </w:rPr>
-        <w:t>├</w:t>
-      </w:r>
-      <w:r>
-        <w:rPr>
-          <w:rFonts w:ascii="Calibri" w:hAnsi="Calibri" w:cs="Calibri"/>
-          <w:lang w:val="en-US"/>
-        </w:rPr>
-        <w:t>───────────────────────────────</w:t>
-      </w:r>
-      <w:r>
-        <w:rPr>
-          <w:rFonts w:ascii="MS Gothic" w:eastAsia="MS Gothic" w:hAnsi="MS Gothic" w:cs="MS Gothic" w:hint="eastAsia"/>
-          <w:lang w:val="en-US"/>
-        </w:rPr>
-        <w:t>┤</w:t>
+        <w:t>StartGame</w:t>
+      </w:r>
+      <w:proofErr w:type="spellEnd"/>
+      <w:r>
+        <w:rPr>
+          <w:lang w:val="en-US"/>
+        </w:rPr>
+        <w:t>(): void           │</w:t>
       </w:r>
     </w:p>
     <w:p>
@@ -1274,19 +1277,19 @@
         </w:rPr>
         <w:t xml:space="preserve">│ + </w:t>
       </w:r>
-      <w:proofErr w:type="gramStart"/>
-      <w:r>
-        <w:rPr>
-          <w:lang w:val="en-US"/>
-        </w:rPr>
-        <w:t>Start(</w:t>
-      </w:r>
-      <w:proofErr w:type="gramEnd"/>
-      <w:r>
-        <w:rPr>
-          <w:lang w:val="en-US"/>
-        </w:rPr>
-        <w:t>): void               │</w:t>
+      <w:proofErr w:type="spellStart"/>
+      <w:r>
+        <w:rPr>
+          <w:lang w:val="en-US"/>
+        </w:rPr>
+        <w:t>OnButtonClickedInManager</w:t>
+      </w:r>
+      <w:proofErr w:type="spellEnd"/>
+      <w:r>
+        <w:rPr>
+          <w:lang w:val="en-US"/>
+        </w:rPr>
+        <w:t>()  │</w:t>
       </w:r>
     </w:p>
     <w:p>
@@ -1302,26 +1305,18 @@
         <w:t xml:space="preserve">│ + </w:t>
       </w:r>
       <w:proofErr w:type="spellStart"/>
-      <w:proofErr w:type="gramStart"/>
-      <w:r>
-        <w:rPr>
-          <w:lang w:val="en-US"/>
-        </w:rPr>
-        <w:t>StartGame</w:t>
-      </w:r>
-      <w:proofErr w:type="spellEnd"/>
-      <w:r>
-        <w:rPr>
-          <w:lang w:val="en-US"/>
-        </w:rPr>
-        <w:t>(</w:t>
-      </w:r>
-      <w:proofErr w:type="gramEnd"/>
-      <w:r>
-        <w:rPr>
-          <w:lang w:val="en-US"/>
-        </w:rPr>
-        <w:t>): void           │</w:t>
+      <w:r>
+        <w:rPr>
+          <w:lang w:val="en-US"/>
+        </w:rPr>
+        <w:t>ActivateFeature</w:t>
+      </w:r>
+      <w:proofErr w:type="spellEnd"/>
+      <w:r>
+        <w:rPr>
+          <w:lang w:val="en-US"/>
+        </w:rPr>
+        <w:t>(): void     │</w:t>
       </w:r>
     </w:p>
     <w:p>
@@ -1337,26 +1332,18 @@
         <w:t xml:space="preserve">│ + </w:t>
       </w:r>
       <w:proofErr w:type="spellStart"/>
-      <w:proofErr w:type="gramStart"/>
-      <w:r>
-        <w:rPr>
-          <w:lang w:val="en-US"/>
-        </w:rPr>
-        <w:t>OnButtonClickedInManager</w:t>
-      </w:r>
-      <w:proofErr w:type="spellEnd"/>
-      <w:r>
-        <w:rPr>
-          <w:lang w:val="en-US"/>
-        </w:rPr>
-        <w:t>(</w:t>
-      </w:r>
-      <w:proofErr w:type="gramEnd"/>
-      <w:r>
-        <w:rPr>
-          <w:lang w:val="en-US"/>
-        </w:rPr>
-        <w:t>)  │</w:t>
+      <w:r>
+        <w:rPr>
+          <w:lang w:val="en-US"/>
+        </w:rPr>
+        <w:t>EndTurn</w:t>
+      </w:r>
+      <w:proofErr w:type="spellEnd"/>
+      <w:r>
+        <w:rPr>
+          <w:lang w:val="en-US"/>
+        </w:rPr>
+        <w:t>(): void             │</w:t>
       </w:r>
     </w:p>
     <w:p>
@@ -1372,26 +1359,18 @@
         <w:t xml:space="preserve">│ + </w:t>
       </w:r>
       <w:proofErr w:type="spellStart"/>
-      <w:proofErr w:type="gramStart"/>
-      <w:r>
-        <w:rPr>
-          <w:lang w:val="en-US"/>
-        </w:rPr>
-        <w:t>ActivateFeature</w:t>
-      </w:r>
-      <w:proofErr w:type="spellEnd"/>
-      <w:r>
-        <w:rPr>
-          <w:lang w:val="en-US"/>
-        </w:rPr>
-        <w:t>(</w:t>
-      </w:r>
-      <w:proofErr w:type="gramEnd"/>
-      <w:r>
-        <w:rPr>
-          <w:lang w:val="en-US"/>
-        </w:rPr>
-        <w:t>): void     │</w:t>
+      <w:r>
+        <w:rPr>
+          <w:lang w:val="en-US"/>
+        </w:rPr>
+        <w:t>ActivateBomb</w:t>
+      </w:r>
+      <w:proofErr w:type="spellEnd"/>
+      <w:r>
+        <w:rPr>
+          <w:lang w:val="en-US"/>
+        </w:rPr>
+        <w:t>(): void        │</w:t>
       </w:r>
     </w:p>
     <w:p>
@@ -1407,140 +1386,52 @@
         <w:t xml:space="preserve">│ + </w:t>
       </w:r>
       <w:proofErr w:type="spellStart"/>
-      <w:proofErr w:type="gramStart"/>
-      <w:r>
-        <w:rPr>
-          <w:lang w:val="en-US"/>
-        </w:rPr>
-        <w:t>EndTurn</w:t>
-      </w:r>
-      <w:proofErr w:type="spellEnd"/>
-      <w:r>
-        <w:rPr>
-          <w:lang w:val="en-US"/>
-        </w:rPr>
-        <w:t>(</w:t>
-      </w:r>
-      <w:proofErr w:type="gramEnd"/>
-      <w:r>
-        <w:rPr>
-          <w:lang w:val="en-US"/>
-        </w:rPr>
-        <w:t>): void             │</w:t>
-      </w:r>
-    </w:p>
-    <w:p>
-      <w:pPr>
-        <w:rPr>
-          <w:lang w:val="en-US"/>
-        </w:rPr>
-      </w:pPr>
-      <w:r>
-        <w:rPr>
-          <w:lang w:val="en-US"/>
-        </w:rPr>
+      <w:r>
+        <w:rPr>
+          <w:lang w:val="en-US"/>
+        </w:rPr>
+        <w:t>HandleBomb</w:t>
+      </w:r>
+      <w:proofErr w:type="spellEnd"/>
+      <w:r>
+        <w:rPr>
+          <w:lang w:val="en-US"/>
+        </w:rPr>
+        <w:t>(): void          │</w:t>
+      </w:r>
+    </w:p>
+    <w:p>
+      <w:r>
         <w:t xml:space="preserve">│ + </w:t>
       </w:r>
       <w:proofErr w:type="spellStart"/>
-      <w:proofErr w:type="gramStart"/>
-      <w:r>
-        <w:rPr>
-          <w:lang w:val="en-US"/>
-        </w:rPr>
-        <w:t>ActivateBomb</w:t>
-      </w:r>
-      <w:proofErr w:type="spellEnd"/>
-      <w:r>
-        <w:rPr>
-          <w:lang w:val="en-US"/>
-        </w:rPr>
-        <w:t>(</w:t>
-      </w:r>
-      <w:proofErr w:type="gramEnd"/>
-      <w:r>
-        <w:rPr>
-          <w:lang w:val="en-US"/>
-        </w:rPr>
-        <w:t>): void        │</w:t>
-      </w:r>
-    </w:p>
-    <w:p>
-      <w:pPr>
-        <w:rPr>
-          <w:lang w:val="en-US"/>
-        </w:rPr>
-      </w:pPr>
-      <w:r>
-        <w:rPr>
-          <w:lang w:val="en-US"/>
-        </w:rPr>
+      <w:r>
+        <w:t>CheckForWinOrDraw</w:t>
+      </w:r>
+      <w:proofErr w:type="spellEnd"/>
+      <w:r>
+        <w:t xml:space="preserve">(): </w:t>
+      </w:r>
+      <w:proofErr w:type="spellStart"/>
+      <w:r>
+        <w:t>void</w:t>
+      </w:r>
+      <w:proofErr w:type="spellEnd"/>
+      <w:r>
+        <w:t xml:space="preserve">   │</w:t>
+      </w:r>
+    </w:p>
+    <w:p>
+      <w:r>
         <w:t xml:space="preserve">│ + </w:t>
       </w:r>
       <w:proofErr w:type="spellStart"/>
-      <w:proofErr w:type="gramStart"/>
-      <w:r>
-        <w:rPr>
-          <w:lang w:val="en-US"/>
-        </w:rPr>
-        <w:t>HandleBomb</w:t>
-      </w:r>
-      <w:proofErr w:type="spellEnd"/>
-      <w:r>
-        <w:rPr>
-          <w:lang w:val="en-US"/>
-        </w:rPr>
-        <w:t>(</w:t>
-      </w:r>
-      <w:proofErr w:type="gramEnd"/>
-      <w:r>
-        <w:rPr>
-          <w:lang w:val="en-US"/>
-        </w:rPr>
-        <w:t>): void          │</w:t>
-      </w:r>
-    </w:p>
-    <w:p>
-      <w:r>
-        <w:t xml:space="preserve">│ + </w:t>
-      </w:r>
-      <w:proofErr w:type="spellStart"/>
-      <w:proofErr w:type="gramStart"/>
-      <w:r>
-        <w:t>CheckForWinOrDraw</w:t>
-      </w:r>
-      <w:proofErr w:type="spellEnd"/>
-      <w:r>
-        <w:t>(</w:t>
-      </w:r>
-      <w:proofErr w:type="gramEnd"/>
-      <w:r>
-        <w:t xml:space="preserve">): </w:t>
-      </w:r>
-      <w:proofErr w:type="spellStart"/>
-      <w:r>
-        <w:t>void</w:t>
-      </w:r>
-      <w:proofErr w:type="spellEnd"/>
-      <w:r>
-        <w:t xml:space="preserve">   │</w:t>
-      </w:r>
-    </w:p>
-    <w:p>
-      <w:r>
-        <w:t xml:space="preserve">│ + </w:t>
-      </w:r>
-      <w:proofErr w:type="spellStart"/>
-      <w:proofErr w:type="gramStart"/>
       <w:r>
         <w:t>RestartWithSound</w:t>
       </w:r>
       <w:proofErr w:type="spellEnd"/>
       <w:r>
-        <w:t>(</w:t>
-      </w:r>
-      <w:proofErr w:type="gramEnd"/>
-      <w:r>
-        <w:t xml:space="preserve">): </w:t>
+        <w:t xml:space="preserve">(): </w:t>
       </w:r>
       <w:proofErr w:type="spellStart"/>
       <w:r>
@@ -1562,12 +1453,6 @@
         <w:gridCol w:w="3520"/>
       </w:tblGrid>
       <w:tr>
-        <w:tblPrEx>
-          <w:tblCellMar>
-            <w:top w:w="0" w:type="dxa"/>
-            <w:bottom w:w="0" w:type="dxa"/>
-          </w:tblCellMar>
-        </w:tblPrEx>
         <w:tc>
           <w:tcPr>
             <w:tcW w:w="3520" w:type="dxa"/>
@@ -1919,21 +1804,37 @@
         <w:rPr>
           <w:lang w:val="en-US"/>
         </w:rPr>
+        <w:t>│ + Start(): void               │</w:t>
+      </w:r>
+    </w:p>
+    <w:p>
+      <w:pPr>
+        <w:tabs>
+          <w:tab w:val="left" w:pos="1380"/>
+        </w:tabs>
+        <w:rPr>
+          <w:lang w:val="en-US"/>
+        </w:rPr>
+      </w:pPr>
+      <w:r>
+        <w:rPr>
+          <w:lang w:val="en-US"/>
+        </w:rPr>
         <w:t xml:space="preserve">│ + </w:t>
       </w:r>
-      <w:proofErr w:type="gramStart"/>
-      <w:r>
-        <w:rPr>
-          <w:lang w:val="en-US"/>
-        </w:rPr>
-        <w:t>Start(</w:t>
-      </w:r>
-      <w:proofErr w:type="gramEnd"/>
-      <w:r>
-        <w:rPr>
-          <w:lang w:val="en-US"/>
-        </w:rPr>
-        <w:t>): void               │</w:t>
+      <w:proofErr w:type="spellStart"/>
+      <w:r>
+        <w:rPr>
+          <w:lang w:val="en-US"/>
+        </w:rPr>
+        <w:t>OnButtonClicked</w:t>
+      </w:r>
+      <w:proofErr w:type="spellEnd"/>
+      <w:r>
+        <w:rPr>
+          <w:lang w:val="en-US"/>
+        </w:rPr>
+        <w:t>(): void     │</w:t>
       </w:r>
     </w:p>
     <w:p>
@@ -1952,26 +1853,18 @@
         <w:t xml:space="preserve">│ + </w:t>
       </w:r>
       <w:proofErr w:type="spellStart"/>
-      <w:proofErr w:type="gramStart"/>
-      <w:r>
-        <w:rPr>
-          <w:lang w:val="en-US"/>
-        </w:rPr>
-        <w:t>OnButtonClicked</w:t>
-      </w:r>
-      <w:proofErr w:type="spellEnd"/>
-      <w:r>
-        <w:rPr>
-          <w:lang w:val="en-US"/>
-        </w:rPr>
-        <w:t>(</w:t>
-      </w:r>
-      <w:proofErr w:type="gramEnd"/>
-      <w:r>
-        <w:rPr>
-          <w:lang w:val="en-US"/>
-        </w:rPr>
-        <w:t>): void     │</w:t>
+      <w:r>
+        <w:rPr>
+          <w:lang w:val="en-US"/>
+        </w:rPr>
+        <w:t>SetField</w:t>
+      </w:r>
+      <w:proofErr w:type="spellEnd"/>
+      <w:r>
+        <w:rPr>
+          <w:lang w:val="en-US"/>
+        </w:rPr>
+        <w:t>(): void            │</w:t>
       </w:r>
     </w:p>
     <w:p>
@@ -1990,26 +1883,18 @@
         <w:t xml:space="preserve">│ + </w:t>
       </w:r>
       <w:proofErr w:type="spellStart"/>
-      <w:proofErr w:type="gramStart"/>
-      <w:r>
-        <w:rPr>
-          <w:lang w:val="en-US"/>
-        </w:rPr>
-        <w:t>SetField</w:t>
-      </w:r>
-      <w:proofErr w:type="spellEnd"/>
-      <w:r>
-        <w:rPr>
-          <w:lang w:val="en-US"/>
-        </w:rPr>
-        <w:t>(</w:t>
-      </w:r>
-      <w:proofErr w:type="gramEnd"/>
-      <w:r>
-        <w:rPr>
-          <w:lang w:val="en-US"/>
-        </w:rPr>
-        <w:t>): void            │</w:t>
+      <w:r>
+        <w:rPr>
+          <w:lang w:val="en-US"/>
+        </w:rPr>
+        <w:t>ForceSetField</w:t>
+      </w:r>
+      <w:proofErr w:type="spellEnd"/>
+      <w:r>
+        <w:rPr>
+          <w:lang w:val="en-US"/>
+        </w:rPr>
+        <w:t>(): void       │</w:t>
       </w:r>
     </w:p>
     <w:p>
@@ -2025,29 +1910,37 @@
         <w:rPr>
           <w:lang w:val="en-US"/>
         </w:rPr>
+        <w:t>│ + SetBlocked(): void          │</w:t>
+      </w:r>
+    </w:p>
+    <w:p>
+      <w:pPr>
+        <w:tabs>
+          <w:tab w:val="left" w:pos="1380"/>
+        </w:tabs>
+        <w:rPr>
+          <w:lang w:val="en-US"/>
+        </w:rPr>
+      </w:pPr>
+      <w:r>
+        <w:rPr>
+          <w:lang w:val="en-US"/>
+        </w:rPr>
         <w:t xml:space="preserve">│ + </w:t>
       </w:r>
       <w:proofErr w:type="spellStart"/>
-      <w:proofErr w:type="gramStart"/>
-      <w:r>
-        <w:rPr>
-          <w:lang w:val="en-US"/>
-        </w:rPr>
-        <w:t>ForceSetField</w:t>
-      </w:r>
-      <w:proofErr w:type="spellEnd"/>
-      <w:r>
-        <w:rPr>
-          <w:lang w:val="en-US"/>
-        </w:rPr>
-        <w:t>(</w:t>
-      </w:r>
-      <w:proofErr w:type="gramEnd"/>
-      <w:r>
-        <w:rPr>
-          <w:lang w:val="en-US"/>
-        </w:rPr>
-        <w:t>): void       │</w:t>
+      <w:r>
+        <w:rPr>
+          <w:lang w:val="en-US"/>
+        </w:rPr>
+        <w:t>ReleaseBlock</w:t>
+      </w:r>
+      <w:proofErr w:type="spellEnd"/>
+      <w:r>
+        <w:rPr>
+          <w:lang w:val="en-US"/>
+        </w:rPr>
+        <w:t>(): void        │</w:t>
       </w:r>
     </w:p>
     <w:p>
@@ -2065,76 +1958,7 @@
         </w:rPr>
         <w:t xml:space="preserve">│ + </w:t>
       </w:r>
-      <w:proofErr w:type="gramStart"/>
-      <w:r>
-        <w:rPr>
-          <w:lang w:val="en-US"/>
-        </w:rPr>
-        <w:t>SetBlocked(</w:t>
-      </w:r>
-      <w:proofErr w:type="gramEnd"/>
-      <w:r>
-        <w:rPr>
-          <w:lang w:val="en-US"/>
-        </w:rPr>
-        <w:t>): void          │</w:t>
-      </w:r>
-    </w:p>
-    <w:p>
-      <w:pPr>
-        <w:tabs>
-          <w:tab w:val="left" w:pos="1380"/>
-        </w:tabs>
-        <w:rPr>
-          <w:lang w:val="en-US"/>
-        </w:rPr>
-      </w:pPr>
-      <w:r>
-        <w:rPr>
-          <w:lang w:val="en-US"/>
-        </w:rPr>
-        <w:t xml:space="preserve">│ + </w:t>
-      </w:r>
-      <w:proofErr w:type="spellStart"/>
-      <w:proofErr w:type="gramStart"/>
-      <w:r>
-        <w:rPr>
-          <w:lang w:val="en-US"/>
-        </w:rPr>
-        <w:t>ReleaseBlock</w:t>
-      </w:r>
-      <w:proofErr w:type="spellEnd"/>
-      <w:r>
-        <w:rPr>
-          <w:lang w:val="en-US"/>
-        </w:rPr>
-        <w:t>(</w:t>
-      </w:r>
-      <w:proofErr w:type="gramEnd"/>
-      <w:r>
-        <w:rPr>
-          <w:lang w:val="en-US"/>
-        </w:rPr>
-        <w:t>): void        │</w:t>
-      </w:r>
-    </w:p>
-    <w:p>
-      <w:pPr>
-        <w:tabs>
-          <w:tab w:val="left" w:pos="1380"/>
-        </w:tabs>
-        <w:rPr>
-          <w:lang w:val="en-US"/>
-        </w:rPr>
-      </w:pPr>
-      <w:r>
-        <w:rPr>
-          <w:lang w:val="en-US"/>
-        </w:rPr>
-        <w:t xml:space="preserve">│ + </w:t>
-      </w:r>
-      <w:proofErr w:type="spellStart"/>
-      <w:proofErr w:type="gramStart"/>
+      <w:proofErr w:type="spellStart"/>
       <w:r>
         <w:rPr>
           <w:lang w:val="en-US"/>
@@ -2146,14 +1970,7 @@
         <w:rPr>
           <w:lang w:val="en-US"/>
         </w:rPr>
-        <w:t>(</w:t>
-      </w:r>
-      <w:proofErr w:type="gramEnd"/>
-      <w:r>
-        <w:rPr>
-          <w:lang w:val="en-US"/>
-        </w:rPr>
-        <w:t>): void          │</w:t>
+        <w:t>(): void          │</w:t>
       </w:r>
     </w:p>
     <w:p>
@@ -2575,13 +2392,13 @@
     <w:p>
       <w:pPr>
         <w:rPr>
-          <w:lang w:val="de-DE"/>
-        </w:rPr>
-      </w:pPr>
-      <w:proofErr w:type="spellStart"/>
-      <w:r>
-        <w:rPr>
-          <w:lang w:val="de-DE"/>
+          <w:lang w:val="en-US"/>
+        </w:rPr>
+      </w:pPr>
+      <w:proofErr w:type="spellStart"/>
+      <w:r>
+        <w:rPr>
+          <w:lang w:val="en-US"/>
         </w:rPr>
         <w:t>programmablauf</w:t>
       </w:r>
@@ -2640,7 +2457,6 @@
         <w:t>[</w:t>
       </w:r>
       <w:proofErr w:type="spellStart"/>
-      <w:proofErr w:type="gramStart"/>
       <w:r>
         <w:rPr>
           <w:lang w:val="en-US"/>
@@ -2652,14 +2468,7 @@
         <w:rPr>
           <w:lang w:val="en-US"/>
         </w:rPr>
-        <w:t>(</w:t>
-      </w:r>
-      <w:proofErr w:type="gramEnd"/>
-      <w:r>
-        <w:rPr>
-          <w:lang w:val="en-US"/>
-        </w:rPr>
-        <w:t>)]</w:t>
+        <w:t>()]</w:t>
       </w:r>
     </w:p>
     <w:p>
@@ -2760,7 +2569,6 @@
         <w:t xml:space="preserve">[Bombe aktiv?] ── Ja → </w:t>
       </w:r>
       <w:proofErr w:type="spellStart"/>
-      <w:proofErr w:type="gramStart"/>
       <w:r>
         <w:rPr>
           <w:lang w:val="de-DE"/>
@@ -2772,14 +2580,7 @@
         <w:rPr>
           <w:lang w:val="de-DE"/>
         </w:rPr>
-        <w:t>(</w:t>
-      </w:r>
-      <w:proofErr w:type="gramEnd"/>
-      <w:r>
-        <w:rPr>
-          <w:lang w:val="de-DE"/>
-        </w:rPr>
-        <w:t>)</w:t>
+        <w:t>()</w:t>
       </w:r>
     </w:p>
     <w:p>
@@ -2808,7 +2609,6 @@
         <w:t xml:space="preserve">[Feature aktiv?] ── Ja → </w:t>
       </w:r>
       <w:proofErr w:type="spellStart"/>
-      <w:proofErr w:type="gramStart"/>
       <w:r>
         <w:rPr>
           <w:lang w:val="de-DE"/>
@@ -2820,14 +2620,7 @@
         <w:rPr>
           <w:lang w:val="de-DE"/>
         </w:rPr>
-        <w:t>(</w:t>
-      </w:r>
-      <w:proofErr w:type="gramEnd"/>
-      <w:r>
-        <w:rPr>
-          <w:lang w:val="de-DE"/>
-        </w:rPr>
-        <w:t>)</w:t>
+        <w:t>()</w:t>
       </w:r>
     </w:p>
     <w:p>
@@ -2888,7 +2681,6 @@
         <w:t>[</w:t>
       </w:r>
       <w:proofErr w:type="spellStart"/>
-      <w:proofErr w:type="gramStart"/>
       <w:r>
         <w:rPr>
           <w:lang w:val="en-US"/>
@@ -2900,14 +2692,7 @@
         <w:rPr>
           <w:lang w:val="en-US"/>
         </w:rPr>
-        <w:t>(</w:t>
-      </w:r>
-      <w:proofErr w:type="gramEnd"/>
-      <w:r>
-        <w:rPr>
-          <w:lang w:val="en-US"/>
-        </w:rPr>
-        <w:t>)]</w:t>
+        <w:t>()]</w:t>
       </w:r>
     </w:p>
     <w:p>
@@ -2936,7 +2721,6 @@
         <w:t>[</w:t>
       </w:r>
       <w:proofErr w:type="spellStart"/>
-      <w:proofErr w:type="gramStart"/>
       <w:r>
         <w:rPr>
           <w:lang w:val="en-US"/>
@@ -2948,14 +2732,7 @@
         <w:rPr>
           <w:lang w:val="en-US"/>
         </w:rPr>
-        <w:t>(</w:t>
-      </w:r>
-      <w:proofErr w:type="gramEnd"/>
-      <w:r>
-        <w:rPr>
-          <w:lang w:val="en-US"/>
-        </w:rPr>
-        <w:t>)]</w:t>
+        <w:t>()]</w:t>
       </w:r>
     </w:p>
     <w:p>
@@ -2999,6 +2776,11 @@
       </w:r>
     </w:p>
     <w:p>
+      <w:pPr>
+        <w:rPr>
+          <w:lang w:val="de-DE"/>
+        </w:rPr>
+      </w:pPr>
       <w:r>
         <w:rPr>
           <w:lang w:val="de-DE"/>
@@ -3012,6 +2794,7 @@
         <w:br/>
         <w:t xml:space="preserve">Der </w:t>
       </w:r>
+      <w:proofErr w:type="spellStart"/>
       <w:r>
         <w:rPr>
           <w:b/>
@@ -3020,12 +2803,14 @@
         </w:rPr>
         <w:t>TicTacToManager</w:t>
       </w:r>
+      <w:proofErr w:type="spellEnd"/>
       <w:r>
         <w:rPr>
           <w:lang w:val="de-DE"/>
         </w:rPr>
         <w:t xml:space="preserve"> übernimmt die komplette Spiellogik, während </w:t>
       </w:r>
+      <w:proofErr w:type="spellStart"/>
       <w:r>
         <w:rPr>
           <w:b/>
@@ -3034,6 +2819,7 @@
         </w:rPr>
         <w:t>FieldButton</w:t>
       </w:r>
+      <w:proofErr w:type="spellEnd"/>
       <w:r>
         <w:rPr>
           <w:lang w:val="de-DE"/>
@@ -3046,77 +2832,315 @@
         </w:rPr>
         <w:br/>
       </w:r>
-      <w:proofErr w:type="spellStart"/>
-      <w:r>
-        <w:t>Diese</w:t>
-      </w:r>
-      <w:proofErr w:type="spellEnd"/>
-      <w:r>
+      <w:r>
+        <w:rPr>
+          <w:lang w:val="de-DE"/>
+        </w:rPr>
+        <w:t>Diese Trennung erleichtert Wartung, Erweiterung und Übersichtlichkeit des Codes.</w:t>
+      </w:r>
+    </w:p>
+    <w:p>
+      <w:pPr>
+        <w:rPr>
+          <w:lang w:val="de-DE"/>
+        </w:rPr>
+      </w:pPr>
+    </w:p>
+    <w:p>
+      <w:pPr>
+        <w:rPr>
+          <w:lang w:val="de-DE"/>
+        </w:rPr>
+      </w:pPr>
+    </w:p>
+    <w:p>
+      <w:pPr>
+        <w:rPr>
+          <w:lang w:val="de-DE"/>
+        </w:rPr>
+      </w:pPr>
+    </w:p>
+    <w:p>
+      <w:pPr>
+        <w:rPr>
+          <w:lang w:val="de-DE"/>
+        </w:rPr>
+      </w:pPr>
+    </w:p>
+    <w:p>
+      <w:pPr>
+        <w:rPr>
+          <w:lang w:val="de-DE"/>
+        </w:rPr>
+      </w:pPr>
+    </w:p>
+    <w:p>
+      <w:pPr>
+        <w:rPr>
+          <w:lang w:val="de-DE"/>
+        </w:rPr>
+      </w:pPr>
+      <w:proofErr w:type="spellStart"/>
+      <w:r>
+        <w:rPr>
+          <w:lang w:val="de-DE"/>
+        </w:rPr>
+        <w:lastRenderedPageBreak/>
+        <w:t>Tictacto</w:t>
+      </w:r>
+      <w:proofErr w:type="spellEnd"/>
+    </w:p>
+    <w:p>
+      <w:pPr>
+        <w:rPr>
+          <w:lang w:val="en-US"/>
+        </w:rPr>
+      </w:pPr>
+      <w:r>
+        <w:rPr>
+          <w:lang w:val="en-US"/>
+        </w:rPr>
+        <w:t>Start</w:t>
+      </w:r>
+    </w:p>
+    <w:p>
+      <w:pPr>
+        <w:rPr>
+          <w:lang w:val="en-US"/>
+        </w:rPr>
+      </w:pPr>
+      <w:r>
+        <w:rPr>
+          <w:lang w:val="en-US"/>
+        </w:rPr>
+        <w:t>B</w:t>
+      </w:r>
+      <w:r>
+        <w:rPr>
+          <w:lang w:val="en-US"/>
+        </w:rPr>
+        <w:t xml:space="preserve">ackground: </w:t>
+      </w:r>
+      <w:r>
+        <w:rPr>
+          <w:lang w:val="en-US"/>
+        </w:rPr>
+        <w:t>https://opengameart.org/content/forest</w:t>
+      </w:r>
+    </w:p>
+    <w:p>
+      <w:pPr>
+        <w:rPr>
+          <w:lang w:val="en-US"/>
+        </w:rPr>
+      </w:pPr>
+      <w:r>
+        <w:rPr>
+          <w:lang w:val="en-US"/>
+        </w:rPr>
+        <w:t>Buttons</w:t>
+      </w:r>
+    </w:p>
+    <w:p>
+      <w:pPr>
+        <w:rPr>
+          <w:lang w:val="en-US"/>
+        </w:rPr>
+      </w:pPr>
+      <w:r>
+        <w:rPr>
+          <w:lang w:val="en-US"/>
+        </w:rPr>
+        <w:t>Draw</w:t>
+      </w:r>
+    </w:p>
+    <w:p>
+      <w:pPr>
+        <w:rPr>
+          <w:lang w:val="en-US"/>
+        </w:rPr>
+      </w:pPr>
+      <w:r>
+        <w:rPr>
+          <w:lang w:val="en-US"/>
+        </w:rPr>
+        <w:t>Win</w:t>
+      </w:r>
+    </w:p>
+    <w:p>
+      <w:pPr>
+        <w:rPr>
+          <w:lang w:val="en-US"/>
+        </w:rPr>
+      </w:pPr>
+      <w:r>
+        <w:rPr>
+          <w:lang w:val="en-US"/>
+        </w:rPr>
+        <w:t>Lose</w:t>
+      </w:r>
+    </w:p>
+    <w:p>
+      <w:pPr>
+        <w:rPr>
+          <w:lang w:val="en-US"/>
+        </w:rPr>
+      </w:pPr>
+      <w:r>
+        <w:rPr>
+          <w:lang w:val="en-US"/>
+        </w:rPr>
+        <w:t xml:space="preserve">Bomb feature: </w:t>
+      </w:r>
+      <w:r>
+        <w:rPr>
+          <w:lang w:val="en-US"/>
+        </w:rPr>
+        <w:t>https://pixabay.com/de/sound-effects/film-spezialeffekte-glitter-sparkle-423283/</w:t>
+      </w:r>
+    </w:p>
+    <w:p>
+      <w:pPr>
+        <w:rPr>
+          <w:lang w:val="en-US"/>
+        </w:rPr>
+      </w:pPr>
+    </w:p>
+    <w:p>
+      <w:pPr>
+        <w:rPr>
+          <w:lang w:val="en-US"/>
+        </w:rPr>
+      </w:pPr>
+      <w:r>
+        <w:rPr>
+          <w:lang w:val="en-US"/>
+        </w:rPr>
+        <w:t>Block Breaker</w:t>
+      </w:r>
+    </w:p>
+    <w:p>
+      <w:pPr>
+        <w:rPr>
+          <w:lang w:val="en-US"/>
+        </w:rPr>
+      </w:pPr>
+      <w:r>
+        <w:rPr>
+          <w:lang w:val="en-US"/>
+        </w:rPr>
+        <w:t>B</w:t>
+      </w:r>
+      <w:r>
+        <w:rPr>
+          <w:lang w:val="en-US"/>
+        </w:rPr>
+        <w:t>utton</w:t>
+      </w:r>
+      <w:r>
+        <w:rPr>
+          <w:lang w:val="en-US"/>
+        </w:rPr>
+        <w:t xml:space="preserve">s </w:t>
+      </w:r>
+    </w:p>
+    <w:p>
+      <w:pPr>
+        <w:rPr>
+          <w:lang w:val="en-US"/>
+        </w:rPr>
+      </w:pPr>
+      <w:r>
+        <w:rPr>
+          <w:lang w:val="en-US"/>
+        </w:rPr>
+        <w:t xml:space="preserve">background music: </w:t>
+      </w:r>
+      <w:hyperlink r:id="rId5" w:history="1">
+        <w:r>
+          <w:rPr>
+            <w:rStyle w:val="a4"/>
+            <w:lang w:val="en-US"/>
+          </w:rPr>
+          <w:t>https://pixabay.com/de/sound-effects/musical-8bit-music-for-game-68698/</w:t>
+        </w:r>
+      </w:hyperlink>
+    </w:p>
+    <w:p>
+      <w:pPr>
+        <w:rPr>
+          <w:lang w:val="en-US"/>
+        </w:rPr>
+      </w:pPr>
+      <w:r>
+        <w:rPr>
+          <w:lang w:val="en-US"/>
+        </w:rPr>
+        <w:t xml:space="preserve">Start: </w:t>
+      </w:r>
+      <w:hyperlink r:id="rId6" w:history="1">
+        <w:r>
+          <w:rPr>
+            <w:rStyle w:val="a4"/>
+            <w:lang w:val="en-US"/>
+          </w:rPr>
+          <w:t>https://pixabay.com/de/sound-effects/film-spezialeffekte-gameboy-pluck-41265/</w:t>
+        </w:r>
+      </w:hyperlink>
+    </w:p>
+    <w:p>
+      <w:pPr>
+        <w:rPr>
+          <w:lang w:val="en-US"/>
+        </w:rPr>
+      </w:pPr>
+    </w:p>
+    <w:p>
+      <w:pPr>
+        <w:rPr>
+          <w:lang w:val="en-US"/>
+        </w:rPr>
+      </w:pPr>
+      <w:r>
+        <w:rPr>
+          <w:lang w:val="en-US"/>
+        </w:rPr>
+        <w:t>Main Menu:</w:t>
+      </w:r>
+    </w:p>
+    <w:p>
+      <w:pPr>
+        <w:rPr>
+          <w:lang w:val="en-US"/>
+        </w:rPr>
+      </w:pPr>
+      <w:r>
+        <w:rPr>
+          <w:lang w:val="en-US"/>
+        </w:rPr>
+        <w:t>https://pixabay.com/music/beats-lost-in-the-clouds-lofi-291087/</w:t>
+      </w:r>
+    </w:p>
+    <w:p>
+      <w:pPr>
+        <w:rPr>
+          <w:lang w:val="en-US"/>
+        </w:rPr>
+      </w:pPr>
+      <w:hyperlink r:id="rId7" w:history="1">
+        <w:r>
+          <w:rPr>
+            <w:rStyle w:val="a4"/>
+            <w:lang w:val="en-US"/>
+          </w:rPr>
+          <w:t>https://realvektyr.itch.io/casual-game-buttons-vol-02/download/eyJleHBpcmVzIjoxNzcwMjMwNjkzLCJpZCI6MTA5NzIyMn0%3d.ePEukeGIJpejeijCEcdMdvI3bQM%3d</w:t>
+        </w:r>
+      </w:hyperlink>
+      <w:r>
+        <w:rPr>
+          <w:lang w:val="en-US"/>
+        </w:rPr>
         <w:t xml:space="preserve"> </w:t>
-      </w:r>
-      <w:proofErr w:type="spellStart"/>
-      <w:r>
-        <w:t>Trennung</w:t>
-      </w:r>
-      <w:proofErr w:type="spellEnd"/>
-      <w:r>
-        <w:t xml:space="preserve"> </w:t>
-      </w:r>
-      <w:proofErr w:type="spellStart"/>
-      <w:r>
-        <w:t>erleichtert</w:t>
-      </w:r>
-      <w:proofErr w:type="spellEnd"/>
-      <w:r>
-        <w:t xml:space="preserve"> </w:t>
-      </w:r>
-      <w:proofErr w:type="spellStart"/>
-      <w:r>
-        <w:t>Wartung</w:t>
-      </w:r>
-      <w:proofErr w:type="spellEnd"/>
-      <w:r>
-        <w:t xml:space="preserve">, </w:t>
-      </w:r>
-      <w:proofErr w:type="spellStart"/>
-      <w:r>
-        <w:t>Erweiterung</w:t>
-      </w:r>
-      <w:proofErr w:type="spellEnd"/>
-      <w:r>
-        <w:t xml:space="preserve"> </w:t>
-      </w:r>
-      <w:proofErr w:type="spellStart"/>
-      <w:r>
-        <w:t>und</w:t>
-      </w:r>
-      <w:proofErr w:type="spellEnd"/>
-      <w:r>
-        <w:t xml:space="preserve"> </w:t>
-      </w:r>
-      <w:proofErr w:type="spellStart"/>
-      <w:r>
-        <w:t>Übersichtlichkeit</w:t>
-      </w:r>
-      <w:proofErr w:type="spellEnd"/>
-      <w:r>
-        <w:t xml:space="preserve"> </w:t>
-      </w:r>
-      <w:proofErr w:type="spellStart"/>
-      <w:r>
-        <w:t>des</w:t>
-      </w:r>
-      <w:proofErr w:type="spellEnd"/>
-      <w:r>
-        <w:t xml:space="preserve"> </w:t>
-      </w:r>
-      <w:proofErr w:type="spellStart"/>
-      <w:r>
-        <w:t>Codes</w:t>
-      </w:r>
-      <w:proofErr w:type="spellEnd"/>
-      <w:r>
-        <w:t>.</w:t>
       </w:r>
     </w:p>
     <w:p>
@@ -4151,6 +4175,7 @@
   <w:style w:type="character" w:default="1" w:styleId="a0">
     <w:name w:val="Default Paragraph Font"/>
     <w:uiPriority w:val="1"/>
+    <w:semiHidden/>
     <w:unhideWhenUsed/>
   </w:style>
   <w:style w:type="table" w:default="1" w:styleId="a1">
@@ -4192,6 +4217,29 @@
         <w:insideV w:val="single" w:sz="4" w:space="0" w:color="auto"/>
       </w:tblBorders>
     </w:tblPr>
+  </w:style>
+  <w:style w:type="character" w:styleId="a4">
+    <w:name w:val="Hyperlink"/>
+    <w:basedOn w:val="a0"/>
+    <w:uiPriority w:val="99"/>
+    <w:unhideWhenUsed/>
+    <w:rsid w:val="00B92BBE"/>
+    <w:rPr>
+      <w:color w:val="0563C1" w:themeColor="hyperlink"/>
+      <w:u w:val="single"/>
+    </w:rPr>
+  </w:style>
+  <w:style w:type="character" w:styleId="a5">
+    <w:name w:val="Unresolved Mention"/>
+    <w:basedOn w:val="a0"/>
+    <w:uiPriority w:val="99"/>
+    <w:semiHidden/>
+    <w:unhideWhenUsed/>
+    <w:rsid w:val="00B92BBE"/>
+    <w:rPr>
+      <w:color w:val="605E5C"/>
+      <w:shd w:val="clear" w:color="auto" w:fill="E1DFDD"/>
+    </w:rPr>
   </w:style>
 </w:styles>
 </file>

</xml_diff>

<commit_message>
feat: finished Breakout, changed design and added new features in Pong
</commit_message>
<xml_diff>
--- a/Assets/project/Dokumentationen/dokumentation TicTacTo.docx
+++ b/Assets/project/Dokumentationen/dokumentation TicTacTo.docx
@@ -804,21 +804,37 @@
         <w:rPr>
           <w:lang w:val="en-US"/>
         </w:rPr>
-        <w:t>│ + bombButtonPlayer1: Button  │</w:t>
-      </w:r>
-    </w:p>
-    <w:p>
-      <w:pPr>
-        <w:rPr>
-          <w:lang w:val="en-US"/>
-        </w:rPr>
-      </w:pPr>
-      <w:r>
-        <w:rPr>
-          <w:lang w:val="en-US"/>
-        </w:rPr>
-        <w:t>│ + bombButtonPlayer2: Button  │</w:t>
-      </w:r>
+        <w:t xml:space="preserve">│ + bombButtonPlayer1: </w:t>
+      </w:r>
+      <w:proofErr w:type="gramStart"/>
+      <w:r>
+        <w:rPr>
+          <w:lang w:val="en-US"/>
+        </w:rPr>
+        <w:t>Button  │</w:t>
+      </w:r>
+      <w:proofErr w:type="gramEnd"/>
+    </w:p>
+    <w:p>
+      <w:pPr>
+        <w:rPr>
+          <w:lang w:val="en-US"/>
+        </w:rPr>
+      </w:pPr>
+      <w:r>
+        <w:rPr>
+          <w:lang w:val="en-US"/>
+        </w:rPr>
+        <w:t xml:space="preserve">│ + bombButtonPlayer2: </w:t>
+      </w:r>
+      <w:proofErr w:type="gramStart"/>
+      <w:r>
+        <w:rPr>
+          <w:lang w:val="en-US"/>
+        </w:rPr>
+        <w:t>Button  │</w:t>
+      </w:r>
+      <w:proofErr w:type="gramEnd"/>
     </w:p>
     <w:p>
       <w:pPr>
@@ -833,6 +849,7 @@
         <w:t xml:space="preserve">│ + featureButtonsPlayer1: </w:t>
       </w:r>
       <w:proofErr w:type="spellStart"/>
+      <w:proofErr w:type="gramStart"/>
       <w:r>
         <w:rPr>
           <w:lang w:val="en-US"/>
@@ -844,7 +861,14 @@
         <w:rPr>
           <w:lang w:val="en-US"/>
         </w:rPr>
-        <w:t>[]│</w:t>
+        <w:t>[</w:t>
+      </w:r>
+      <w:proofErr w:type="gramEnd"/>
+      <w:r>
+        <w:rPr>
+          <w:lang w:val="en-US"/>
+        </w:rPr>
+        <w:t>]│</w:t>
       </w:r>
     </w:p>
     <w:p>
@@ -860,6 +884,7 @@
         <w:t xml:space="preserve">│ + featureButtonsPlayer2: </w:t>
       </w:r>
       <w:proofErr w:type="spellStart"/>
+      <w:proofErr w:type="gramStart"/>
       <w:r>
         <w:rPr>
           <w:lang w:val="en-US"/>
@@ -871,7 +896,14 @@
         <w:rPr>
           <w:lang w:val="en-US"/>
         </w:rPr>
-        <w:t>[]│</w:t>
+        <w:t>[</w:t>
+      </w:r>
+      <w:proofErr w:type="gramEnd"/>
+      <w:r>
+        <w:rPr>
+          <w:lang w:val="en-US"/>
+        </w:rPr>
+        <w:t>]│</w:t>
       </w:r>
     </w:p>
     <w:p>
@@ -898,7 +930,21 @@
         <w:rPr>
           <w:lang w:val="en-US"/>
         </w:rPr>
-        <w:t>: FieldButton[]│</w:t>
+        <w:t xml:space="preserve">: </w:t>
+      </w:r>
+      <w:proofErr w:type="gramStart"/>
+      <w:r>
+        <w:rPr>
+          <w:lang w:val="en-US"/>
+        </w:rPr>
+        <w:t>FieldButton[</w:t>
+      </w:r>
+      <w:proofErr w:type="gramEnd"/>
+      <w:r>
+        <w:rPr>
+          <w:lang w:val="en-US"/>
+        </w:rPr>
+        <w:t>]│</w:t>
       </w:r>
     </w:p>
     <w:p>
@@ -1127,7 +1173,21 @@
         <w:rPr>
           <w:lang w:val="en-US"/>
         </w:rPr>
-        <w:t>: bool[]            │</w:t>
+        <w:t xml:space="preserve">: </w:t>
+      </w:r>
+      <w:proofErr w:type="gramStart"/>
+      <w:r>
+        <w:rPr>
+          <w:lang w:val="en-US"/>
+        </w:rPr>
+        <w:t>bool[</w:t>
+      </w:r>
+      <w:proofErr w:type="gramEnd"/>
+      <w:r>
+        <w:rPr>
+          <w:lang w:val="en-US"/>
+        </w:rPr>
+        <w:t>]            │</w:t>
       </w:r>
     </w:p>
     <w:p>
@@ -1154,7 +1214,21 @@
         <w:rPr>
           <w:lang w:val="en-US"/>
         </w:rPr>
-        <w:t>: int[]       │</w:t>
+        <w:t xml:space="preserve">: </w:t>
+      </w:r>
+      <w:proofErr w:type="gramStart"/>
+      <w:r>
+        <w:rPr>
+          <w:lang w:val="en-US"/>
+        </w:rPr>
+        <w:t>int[</w:t>
+      </w:r>
+      <w:proofErr w:type="gramEnd"/>
+      <w:r>
+        <w:rPr>
+          <w:lang w:val="en-US"/>
+        </w:rPr>
+        <w:t>]       │</w:t>
       </w:r>
     </w:p>
     <w:p>
@@ -1194,7 +1268,21 @@
         <w:rPr>
           <w:lang w:val="en-US"/>
         </w:rPr>
-        <w:t>: int[][]│</w:t>
+        <w:t xml:space="preserve">: </w:t>
+      </w:r>
+      <w:proofErr w:type="gramStart"/>
+      <w:r>
+        <w:rPr>
+          <w:lang w:val="en-US"/>
+        </w:rPr>
+        <w:t>int[</w:t>
+      </w:r>
+      <w:proofErr w:type="gramEnd"/>
+      <w:r>
+        <w:rPr>
+          <w:lang w:val="en-US"/>
+        </w:rPr>
+        <w:t>][]│</w:t>
       </w:r>
     </w:p>
     <w:p>
@@ -1235,22 +1323,37 @@
         <w:rPr>
           <w:lang w:val="en-US"/>
         </w:rPr>
-        <w:t>│ + Start(): void               │</w:t>
-      </w:r>
-    </w:p>
-    <w:p>
-      <w:pPr>
-        <w:rPr>
-          <w:lang w:val="en-US"/>
-        </w:rPr>
-      </w:pPr>
-      <w:r>
-        <w:rPr>
-          <w:lang w:val="en-US"/>
-        </w:rPr>
         <w:t xml:space="preserve">│ + </w:t>
       </w:r>
-      <w:proofErr w:type="spellStart"/>
+      <w:proofErr w:type="gramStart"/>
+      <w:r>
+        <w:rPr>
+          <w:lang w:val="en-US"/>
+        </w:rPr>
+        <w:t>Start(</w:t>
+      </w:r>
+      <w:proofErr w:type="gramEnd"/>
+      <w:r>
+        <w:rPr>
+          <w:lang w:val="en-US"/>
+        </w:rPr>
+        <w:t>): void               │</w:t>
+      </w:r>
+    </w:p>
+    <w:p>
+      <w:pPr>
+        <w:rPr>
+          <w:lang w:val="en-US"/>
+        </w:rPr>
+      </w:pPr>
+      <w:r>
+        <w:rPr>
+          <w:lang w:val="en-US"/>
+        </w:rPr>
+        <w:t xml:space="preserve">│ + </w:t>
+      </w:r>
+      <w:proofErr w:type="spellStart"/>
+      <w:proofErr w:type="gramStart"/>
       <w:r>
         <w:rPr>
           <w:lang w:val="en-US"/>
@@ -1262,7 +1365,14 @@
         <w:rPr>
           <w:lang w:val="en-US"/>
         </w:rPr>
-        <w:t>(): void           │</w:t>
+        <w:t>(</w:t>
+      </w:r>
+      <w:proofErr w:type="gramEnd"/>
+      <w:r>
+        <w:rPr>
+          <w:lang w:val="en-US"/>
+        </w:rPr>
+        <w:t>): void           │</w:t>
       </w:r>
     </w:p>
     <w:p>
@@ -1278,6 +1388,7 @@
         <w:t xml:space="preserve">│ + </w:t>
       </w:r>
       <w:proofErr w:type="spellStart"/>
+      <w:proofErr w:type="gramStart"/>
       <w:r>
         <w:rPr>
           <w:lang w:val="en-US"/>
@@ -1289,7 +1400,14 @@
         <w:rPr>
           <w:lang w:val="en-US"/>
         </w:rPr>
-        <w:t>()  │</w:t>
+        <w:t>(</w:t>
+      </w:r>
+      <w:proofErr w:type="gramEnd"/>
+      <w:r>
+        <w:rPr>
+          <w:lang w:val="en-US"/>
+        </w:rPr>
+        <w:t>)  │</w:t>
       </w:r>
     </w:p>
     <w:p>
@@ -1305,6 +1423,7 @@
         <w:t xml:space="preserve">│ + </w:t>
       </w:r>
       <w:proofErr w:type="spellStart"/>
+      <w:proofErr w:type="gramStart"/>
       <w:r>
         <w:rPr>
           <w:lang w:val="en-US"/>
@@ -1316,7 +1435,14 @@
         <w:rPr>
           <w:lang w:val="en-US"/>
         </w:rPr>
-        <w:t>(): void     │</w:t>
+        <w:t>(</w:t>
+      </w:r>
+      <w:proofErr w:type="gramEnd"/>
+      <w:r>
+        <w:rPr>
+          <w:lang w:val="en-US"/>
+        </w:rPr>
+        <w:t>): void     │</w:t>
       </w:r>
     </w:p>
     <w:p>
@@ -1332,6 +1458,7 @@
         <w:t xml:space="preserve">│ + </w:t>
       </w:r>
       <w:proofErr w:type="spellStart"/>
+      <w:proofErr w:type="gramStart"/>
       <w:r>
         <w:rPr>
           <w:lang w:val="en-US"/>
@@ -1343,7 +1470,14 @@
         <w:rPr>
           <w:lang w:val="en-US"/>
         </w:rPr>
-        <w:t>(): void             │</w:t>
+        <w:t>(</w:t>
+      </w:r>
+      <w:proofErr w:type="gramEnd"/>
+      <w:r>
+        <w:rPr>
+          <w:lang w:val="en-US"/>
+        </w:rPr>
+        <w:t>): void             │</w:t>
       </w:r>
     </w:p>
     <w:p>
@@ -1359,6 +1493,7 @@
         <w:t xml:space="preserve">│ + </w:t>
       </w:r>
       <w:proofErr w:type="spellStart"/>
+      <w:proofErr w:type="gramStart"/>
       <w:r>
         <w:rPr>
           <w:lang w:val="en-US"/>
@@ -1370,7 +1505,14 @@
         <w:rPr>
           <w:lang w:val="en-US"/>
         </w:rPr>
-        <w:t>(): void        │</w:t>
+        <w:t>(</w:t>
+      </w:r>
+      <w:proofErr w:type="gramEnd"/>
+      <w:r>
+        <w:rPr>
+          <w:lang w:val="en-US"/>
+        </w:rPr>
+        <w:t>): void        │</w:t>
       </w:r>
     </w:p>
     <w:p>
@@ -1386,6 +1528,7 @@
         <w:t xml:space="preserve">│ + </w:t>
       </w:r>
       <w:proofErr w:type="spellStart"/>
+      <w:proofErr w:type="gramStart"/>
       <w:r>
         <w:rPr>
           <w:lang w:val="en-US"/>
@@ -1397,7 +1540,14 @@
         <w:rPr>
           <w:lang w:val="en-US"/>
         </w:rPr>
-        <w:t>(): void          │</w:t>
+        <w:t>(</w:t>
+      </w:r>
+      <w:proofErr w:type="gramEnd"/>
+      <w:r>
+        <w:rPr>
+          <w:lang w:val="en-US"/>
+        </w:rPr>
+        <w:t>): void          │</w:t>
       </w:r>
     </w:p>
     <w:p>
@@ -1405,12 +1555,17 @@
         <w:t xml:space="preserve">│ + </w:t>
       </w:r>
       <w:proofErr w:type="spellStart"/>
+      <w:proofErr w:type="gramStart"/>
       <w:r>
         <w:t>CheckForWinOrDraw</w:t>
       </w:r>
       <w:proofErr w:type="spellEnd"/>
       <w:r>
-        <w:t xml:space="preserve">(): </w:t>
+        <w:t>(</w:t>
+      </w:r>
+      <w:proofErr w:type="gramEnd"/>
+      <w:r>
+        <w:t xml:space="preserve">): </w:t>
       </w:r>
       <w:proofErr w:type="spellStart"/>
       <w:r>
@@ -1426,12 +1581,17 @@
         <w:t xml:space="preserve">│ + </w:t>
       </w:r>
       <w:proofErr w:type="spellStart"/>
+      <w:proofErr w:type="gramStart"/>
       <w:r>
         <w:t>RestartWithSound</w:t>
       </w:r>
       <w:proofErr w:type="spellEnd"/>
       <w:r>
-        <w:t xml:space="preserve">(): </w:t>
+        <w:t>(</w:t>
+      </w:r>
+      <w:proofErr w:type="gramEnd"/>
+      <w:r>
+        <w:t xml:space="preserve">): </w:t>
       </w:r>
       <w:proofErr w:type="spellStart"/>
       <w:r>
@@ -1804,7 +1964,21 @@
         <w:rPr>
           <w:lang w:val="en-US"/>
         </w:rPr>
-        <w:t>│ + Start(): void               │</w:t>
+        <w:t xml:space="preserve">│ + </w:t>
+      </w:r>
+      <w:proofErr w:type="gramStart"/>
+      <w:r>
+        <w:rPr>
+          <w:lang w:val="en-US"/>
+        </w:rPr>
+        <w:t>Start(</w:t>
+      </w:r>
+      <w:proofErr w:type="gramEnd"/>
+      <w:r>
+        <w:rPr>
+          <w:lang w:val="en-US"/>
+        </w:rPr>
+        <w:t>): void               │</w:t>
       </w:r>
     </w:p>
     <w:p>
@@ -1823,6 +1997,7 @@
         <w:t xml:space="preserve">│ + </w:t>
       </w:r>
       <w:proofErr w:type="spellStart"/>
+      <w:proofErr w:type="gramStart"/>
       <w:r>
         <w:rPr>
           <w:lang w:val="en-US"/>
@@ -1834,7 +2009,14 @@
         <w:rPr>
           <w:lang w:val="en-US"/>
         </w:rPr>
-        <w:t>(): void     │</w:t>
+        <w:t>(</w:t>
+      </w:r>
+      <w:proofErr w:type="gramEnd"/>
+      <w:r>
+        <w:rPr>
+          <w:lang w:val="en-US"/>
+        </w:rPr>
+        <w:t>): void     │</w:t>
       </w:r>
     </w:p>
     <w:p>
@@ -1853,6 +2035,7 @@
         <w:t xml:space="preserve">│ + </w:t>
       </w:r>
       <w:proofErr w:type="spellStart"/>
+      <w:proofErr w:type="gramStart"/>
       <w:r>
         <w:rPr>
           <w:lang w:val="en-US"/>
@@ -1864,7 +2047,14 @@
         <w:rPr>
           <w:lang w:val="en-US"/>
         </w:rPr>
-        <w:t>(): void            │</w:t>
+        <w:t>(</w:t>
+      </w:r>
+      <w:proofErr w:type="gramEnd"/>
+      <w:r>
+        <w:rPr>
+          <w:lang w:val="en-US"/>
+        </w:rPr>
+        <w:t>): void            │</w:t>
       </w:r>
     </w:p>
     <w:p>
@@ -1883,6 +2073,7 @@
         <w:t xml:space="preserve">│ + </w:t>
       </w:r>
       <w:proofErr w:type="spellStart"/>
+      <w:proofErr w:type="gramStart"/>
       <w:r>
         <w:rPr>
           <w:lang w:val="en-US"/>
@@ -1894,7 +2085,14 @@
         <w:rPr>
           <w:lang w:val="en-US"/>
         </w:rPr>
-        <w:t>(): void       │</w:t>
+        <w:t>(</w:t>
+      </w:r>
+      <w:proofErr w:type="gramEnd"/>
+      <w:r>
+        <w:rPr>
+          <w:lang w:val="en-US"/>
+        </w:rPr>
+        <w:t>): void       │</w:t>
       </w:r>
     </w:p>
     <w:p>
@@ -1910,7 +2108,21 @@
         <w:rPr>
           <w:lang w:val="en-US"/>
         </w:rPr>
-        <w:t>│ + SetBlocked(): void          │</w:t>
+        <w:t xml:space="preserve">│ + </w:t>
+      </w:r>
+      <w:proofErr w:type="gramStart"/>
+      <w:r>
+        <w:rPr>
+          <w:lang w:val="en-US"/>
+        </w:rPr>
+        <w:t>SetBlocked(</w:t>
+      </w:r>
+      <w:proofErr w:type="gramEnd"/>
+      <w:r>
+        <w:rPr>
+          <w:lang w:val="en-US"/>
+        </w:rPr>
+        <w:t>): void          │</w:t>
       </w:r>
     </w:p>
     <w:p>
@@ -1929,6 +2141,7 @@
         <w:t xml:space="preserve">│ + </w:t>
       </w:r>
       <w:proofErr w:type="spellStart"/>
+      <w:proofErr w:type="gramStart"/>
       <w:r>
         <w:rPr>
           <w:lang w:val="en-US"/>
@@ -1940,7 +2153,14 @@
         <w:rPr>
           <w:lang w:val="en-US"/>
         </w:rPr>
-        <w:t>(): void        │</w:t>
+        <w:t>(</w:t>
+      </w:r>
+      <w:proofErr w:type="gramEnd"/>
+      <w:r>
+        <w:rPr>
+          <w:lang w:val="en-US"/>
+        </w:rPr>
+        <w:t>): void        │</w:t>
       </w:r>
     </w:p>
     <w:p>
@@ -1959,6 +2179,7 @@
         <w:t xml:space="preserve">│ + </w:t>
       </w:r>
       <w:proofErr w:type="spellStart"/>
+      <w:proofErr w:type="gramStart"/>
       <w:r>
         <w:rPr>
           <w:lang w:val="en-US"/>
@@ -1970,7 +2191,14 @@
         <w:rPr>
           <w:lang w:val="en-US"/>
         </w:rPr>
-        <w:t>(): void          │</w:t>
+        <w:t>(</w:t>
+      </w:r>
+      <w:proofErr w:type="gramEnd"/>
+      <w:r>
+        <w:rPr>
+          <w:lang w:val="en-US"/>
+        </w:rPr>
+        <w:t>): void          │</w:t>
       </w:r>
     </w:p>
     <w:p>
@@ -2457,6 +2685,7 @@
         <w:t>[</w:t>
       </w:r>
       <w:proofErr w:type="spellStart"/>
+      <w:proofErr w:type="gramStart"/>
       <w:r>
         <w:rPr>
           <w:lang w:val="en-US"/>
@@ -2468,18 +2697,97 @@
         <w:rPr>
           <w:lang w:val="en-US"/>
         </w:rPr>
+        <w:t>(</w:t>
+      </w:r>
+      <w:proofErr w:type="gramEnd"/>
+      <w:r>
+        <w:rPr>
+          <w:lang w:val="en-US"/>
+        </w:rPr>
+        <w:t>)]</w:t>
+      </w:r>
+    </w:p>
+    <w:p>
+      <w:pPr>
+        <w:rPr>
+          <w:lang w:val="en-US"/>
+        </w:rPr>
+      </w:pPr>
+      <w:r>
+        <w:rPr>
+          <w:lang w:val="en-US"/>
+        </w:rPr>
+        <w:t xml:space="preserve">        ↓</w:t>
+      </w:r>
+    </w:p>
+    <w:p>
+      <w:pPr>
+        <w:rPr>
+          <w:lang w:val="en-US"/>
+        </w:rPr>
+      </w:pPr>
+      <w:r>
+        <w:rPr>
+          <w:lang w:val="en-US"/>
+        </w:rPr>
+        <w:t>[</w:t>
+      </w:r>
+      <w:proofErr w:type="spellStart"/>
+      <w:r>
+        <w:rPr>
+          <w:lang w:val="en-US"/>
+        </w:rPr>
+        <w:t>TicTacToManager.OnButtonClickedInManager</w:t>
+      </w:r>
+      <w:proofErr w:type="spellEnd"/>
+      <w:r>
+        <w:rPr>
+          <w:lang w:val="en-US"/>
+        </w:rPr>
         <w:t>()]</w:t>
       </w:r>
     </w:p>
     <w:p>
       <w:pPr>
         <w:rPr>
-          <w:lang w:val="en-US"/>
-        </w:rPr>
-      </w:pPr>
-      <w:r>
-        <w:rPr>
-          <w:lang w:val="en-US"/>
+          <w:lang w:val="de-DE"/>
+        </w:rPr>
+      </w:pPr>
+      <w:r>
+        <w:rPr>
+          <w:lang w:val="en-US"/>
+        </w:rPr>
+        <w:t xml:space="preserve">        </w:t>
+      </w:r>
+      <w:r>
+        <w:rPr>
+          <w:lang w:val="de-DE"/>
+        </w:rPr>
+        <w:t>↓</w:t>
+      </w:r>
+    </w:p>
+    <w:p>
+      <w:pPr>
+        <w:rPr>
+          <w:lang w:val="de-DE"/>
+        </w:rPr>
+      </w:pPr>
+      <w:r>
+        <w:rPr>
+          <w:lang w:val="de-DE"/>
+        </w:rPr>
+        <w:t>[Spiel gestartet? / nicht beendet?]</w:t>
+      </w:r>
+    </w:p>
+    <w:p>
+      <w:pPr>
+        <w:rPr>
+          <w:lang w:val="de-DE"/>
+        </w:rPr>
+      </w:pPr>
+      <w:r>
+        <w:rPr>
+          <w:lang w:val="de-DE"/>
         </w:rPr>
         <w:t xml:space="preserve">        ↓</w:t>
       </w:r>
@@ -2487,6 +2795,134 @@
     <w:p>
       <w:pPr>
         <w:rPr>
+          <w:lang w:val="de-DE"/>
+        </w:rPr>
+      </w:pPr>
+      <w:r>
+        <w:rPr>
+          <w:lang w:val="de-DE"/>
+        </w:rPr>
+        <w:t xml:space="preserve">[Bombe aktiv?] ── Ja → </w:t>
+      </w:r>
+      <w:proofErr w:type="spellStart"/>
+      <w:proofErr w:type="gramStart"/>
+      <w:r>
+        <w:rPr>
+          <w:lang w:val="de-DE"/>
+        </w:rPr>
+        <w:t>HandleBomb</w:t>
+      </w:r>
+      <w:proofErr w:type="spellEnd"/>
+      <w:r>
+        <w:rPr>
+          <w:lang w:val="de-DE"/>
+        </w:rPr>
+        <w:t>(</w:t>
+      </w:r>
+      <w:proofErr w:type="gramEnd"/>
+      <w:r>
+        <w:rPr>
+          <w:lang w:val="de-DE"/>
+        </w:rPr>
+        <w:t>)</w:t>
+      </w:r>
+    </w:p>
+    <w:p>
+      <w:pPr>
+        <w:rPr>
+          <w:lang w:val="de-DE"/>
+        </w:rPr>
+      </w:pPr>
+      <w:r>
+        <w:rPr>
+          <w:lang w:val="de-DE"/>
+        </w:rPr>
+        <w:t xml:space="preserve">        ↓ Nein</w:t>
+      </w:r>
+    </w:p>
+    <w:p>
+      <w:pPr>
+        <w:rPr>
+          <w:lang w:val="de-DE"/>
+        </w:rPr>
+      </w:pPr>
+      <w:r>
+        <w:rPr>
+          <w:lang w:val="de-DE"/>
+        </w:rPr>
+        <w:t xml:space="preserve">[Feature aktiv?] ── Ja → </w:t>
+      </w:r>
+      <w:proofErr w:type="spellStart"/>
+      <w:proofErr w:type="gramStart"/>
+      <w:r>
+        <w:rPr>
+          <w:lang w:val="de-DE"/>
+        </w:rPr>
+        <w:t>ApplyFeature</w:t>
+      </w:r>
+      <w:proofErr w:type="spellEnd"/>
+      <w:r>
+        <w:rPr>
+          <w:lang w:val="de-DE"/>
+        </w:rPr>
+        <w:t>(</w:t>
+      </w:r>
+      <w:proofErr w:type="gramEnd"/>
+      <w:r>
+        <w:rPr>
+          <w:lang w:val="de-DE"/>
+        </w:rPr>
+        <w:t>)</w:t>
+      </w:r>
+    </w:p>
+    <w:p>
+      <w:pPr>
+        <w:rPr>
+          <w:lang w:val="de-DE"/>
+        </w:rPr>
+      </w:pPr>
+      <w:r>
+        <w:rPr>
+          <w:lang w:val="de-DE"/>
+        </w:rPr>
+        <w:t xml:space="preserve">        ↓ Nein</w:t>
+      </w:r>
+    </w:p>
+    <w:p>
+      <w:pPr>
+        <w:rPr>
+          <w:lang w:val="de-DE"/>
+        </w:rPr>
+      </w:pPr>
+      <w:r>
+        <w:rPr>
+          <w:lang w:val="de-DE"/>
+        </w:rPr>
+        <w:t>[Feld frei &amp; nicht blockiert?]</w:t>
+      </w:r>
+    </w:p>
+    <w:p>
+      <w:pPr>
+        <w:rPr>
+          <w:lang w:val="en-US"/>
+        </w:rPr>
+      </w:pPr>
+      <w:r>
+        <w:rPr>
+          <w:lang w:val="de-DE"/>
+        </w:rPr>
+        <w:t xml:space="preserve">        </w:t>
+      </w:r>
+      <w:r>
+        <w:rPr>
+          <w:lang w:val="en-US"/>
+        </w:rPr>
+        <w:t>↓</w:t>
+      </w:r>
+    </w:p>
+    <w:p>
+      <w:pPr>
+        <w:rPr>
           <w:lang w:val="en-US"/>
         </w:rPr>
       </w:pPr>
@@ -2497,61 +2933,37 @@
         <w:t>[</w:t>
       </w:r>
       <w:proofErr w:type="spellStart"/>
-      <w:r>
-        <w:rPr>
-          <w:lang w:val="en-US"/>
-        </w:rPr>
-        <w:t>TicTacToManager.OnButtonClickedInManager</w:t>
-      </w:r>
-      <w:proofErr w:type="spellEnd"/>
-      <w:r>
-        <w:rPr>
-          <w:lang w:val="en-US"/>
-        </w:rPr>
-        <w:t>()]</w:t>
-      </w:r>
-    </w:p>
-    <w:p>
-      <w:pPr>
-        <w:rPr>
-          <w:lang w:val="de-DE"/>
-        </w:rPr>
-      </w:pPr>
-      <w:r>
-        <w:rPr>
-          <w:lang w:val="en-US"/>
-        </w:rPr>
-        <w:t xml:space="preserve">        </w:t>
-      </w:r>
-      <w:r>
-        <w:rPr>
-          <w:lang w:val="de-DE"/>
-        </w:rPr>
-        <w:t>↓</w:t>
-      </w:r>
-    </w:p>
-    <w:p>
-      <w:pPr>
-        <w:rPr>
-          <w:lang w:val="de-DE"/>
-        </w:rPr>
-      </w:pPr>
-      <w:r>
-        <w:rPr>
-          <w:lang w:val="de-DE"/>
-        </w:rPr>
-        <w:t>[Spiel gestartet? / nicht beendet?]</w:t>
-      </w:r>
-    </w:p>
-    <w:p>
-      <w:pPr>
-        <w:rPr>
-          <w:lang w:val="de-DE"/>
-        </w:rPr>
-      </w:pPr>
-      <w:r>
-        <w:rPr>
-          <w:lang w:val="de-DE"/>
+      <w:proofErr w:type="gramStart"/>
+      <w:r>
+        <w:rPr>
+          <w:lang w:val="en-US"/>
+        </w:rPr>
+        <w:t>SetField</w:t>
+      </w:r>
+      <w:proofErr w:type="spellEnd"/>
+      <w:r>
+        <w:rPr>
+          <w:lang w:val="en-US"/>
+        </w:rPr>
+        <w:t>(</w:t>
+      </w:r>
+      <w:proofErr w:type="gramEnd"/>
+      <w:r>
+        <w:rPr>
+          <w:lang w:val="en-US"/>
+        </w:rPr>
+        <w:t>)]</w:t>
+      </w:r>
+    </w:p>
+    <w:p>
+      <w:pPr>
+        <w:rPr>
+          <w:lang w:val="en-US"/>
+        </w:rPr>
+      </w:pPr>
+      <w:r>
+        <w:rPr>
+          <w:lang w:val="en-US"/>
         </w:rPr>
         <w:t xml:space="preserve">        ↓</w:t>
       </w:r>
@@ -2559,118 +2971,6 @@
     <w:p>
       <w:pPr>
         <w:rPr>
-          <w:lang w:val="de-DE"/>
-        </w:rPr>
-      </w:pPr>
-      <w:r>
-        <w:rPr>
-          <w:lang w:val="de-DE"/>
-        </w:rPr>
-        <w:t xml:space="preserve">[Bombe aktiv?] ── Ja → </w:t>
-      </w:r>
-      <w:proofErr w:type="spellStart"/>
-      <w:r>
-        <w:rPr>
-          <w:lang w:val="de-DE"/>
-        </w:rPr>
-        <w:t>HandleBomb</w:t>
-      </w:r>
-      <w:proofErr w:type="spellEnd"/>
-      <w:r>
-        <w:rPr>
-          <w:lang w:val="de-DE"/>
-        </w:rPr>
-        <w:t>()</w:t>
-      </w:r>
-    </w:p>
-    <w:p>
-      <w:pPr>
-        <w:rPr>
-          <w:lang w:val="de-DE"/>
-        </w:rPr>
-      </w:pPr>
-      <w:r>
-        <w:rPr>
-          <w:lang w:val="de-DE"/>
-        </w:rPr>
-        <w:t xml:space="preserve">        ↓ Nein</w:t>
-      </w:r>
-    </w:p>
-    <w:p>
-      <w:pPr>
-        <w:rPr>
-          <w:lang w:val="de-DE"/>
-        </w:rPr>
-      </w:pPr>
-      <w:r>
-        <w:rPr>
-          <w:lang w:val="de-DE"/>
-        </w:rPr>
-        <w:t xml:space="preserve">[Feature aktiv?] ── Ja → </w:t>
-      </w:r>
-      <w:proofErr w:type="spellStart"/>
-      <w:r>
-        <w:rPr>
-          <w:lang w:val="de-DE"/>
-        </w:rPr>
-        <w:t>ApplyFeature</w:t>
-      </w:r>
-      <w:proofErr w:type="spellEnd"/>
-      <w:r>
-        <w:rPr>
-          <w:lang w:val="de-DE"/>
-        </w:rPr>
-        <w:t>()</w:t>
-      </w:r>
-    </w:p>
-    <w:p>
-      <w:pPr>
-        <w:rPr>
-          <w:lang w:val="de-DE"/>
-        </w:rPr>
-      </w:pPr>
-      <w:r>
-        <w:rPr>
-          <w:lang w:val="de-DE"/>
-        </w:rPr>
-        <w:t xml:space="preserve">        ↓ Nein</w:t>
-      </w:r>
-    </w:p>
-    <w:p>
-      <w:pPr>
-        <w:rPr>
-          <w:lang w:val="de-DE"/>
-        </w:rPr>
-      </w:pPr>
-      <w:r>
-        <w:rPr>
-          <w:lang w:val="de-DE"/>
-        </w:rPr>
-        <w:t>[Feld frei &amp; nicht blockiert?]</w:t>
-      </w:r>
-    </w:p>
-    <w:p>
-      <w:pPr>
-        <w:rPr>
-          <w:lang w:val="en-US"/>
-        </w:rPr>
-      </w:pPr>
-      <w:r>
-        <w:rPr>
-          <w:lang w:val="de-DE"/>
-        </w:rPr>
-        <w:t xml:space="preserve">        </w:t>
-      </w:r>
-      <w:r>
-        <w:rPr>
-          <w:lang w:val="en-US"/>
-        </w:rPr>
-        <w:t>↓</w:t>
-      </w:r>
-    </w:p>
-    <w:p>
-      <w:pPr>
-        <w:rPr>
           <w:lang w:val="en-US"/>
         </w:rPr>
       </w:pPr>
@@ -2681,46 +2981,7 @@
         <w:t>[</w:t>
       </w:r>
       <w:proofErr w:type="spellStart"/>
-      <w:r>
-        <w:rPr>
-          <w:lang w:val="en-US"/>
-        </w:rPr>
-        <w:t>SetField</w:t>
-      </w:r>
-      <w:proofErr w:type="spellEnd"/>
-      <w:r>
-        <w:rPr>
-          <w:lang w:val="en-US"/>
-        </w:rPr>
-        <w:t>()]</w:t>
-      </w:r>
-    </w:p>
-    <w:p>
-      <w:pPr>
-        <w:rPr>
-          <w:lang w:val="en-US"/>
-        </w:rPr>
-      </w:pPr>
-      <w:r>
-        <w:rPr>
-          <w:lang w:val="en-US"/>
-        </w:rPr>
-        <w:t xml:space="preserve">        ↓</w:t>
-      </w:r>
-    </w:p>
-    <w:p>
-      <w:pPr>
-        <w:rPr>
-          <w:lang w:val="en-US"/>
-        </w:rPr>
-      </w:pPr>
-      <w:r>
-        <w:rPr>
-          <w:lang w:val="en-US"/>
-        </w:rPr>
-        <w:t>[</w:t>
-      </w:r>
-      <w:proofErr w:type="spellStart"/>
+      <w:proofErr w:type="gramStart"/>
       <w:r>
         <w:rPr>
           <w:lang w:val="en-US"/>
@@ -2732,7 +2993,14 @@
         <w:rPr>
           <w:lang w:val="en-US"/>
         </w:rPr>
-        <w:t>()]</w:t>
+        <w:t>(</w:t>
+      </w:r>
+      <w:proofErr w:type="gramEnd"/>
+      <w:r>
+        <w:rPr>
+          <w:lang w:val="en-US"/>
+        </w:rPr>
+        <w:t>)]</w:t>
       </w:r>
     </w:p>
     <w:p>
@@ -2940,6 +3208,40 @@
         </w:rPr>
         <w:t>Buttons</w:t>
       </w:r>
+      <w:r>
+        <w:rPr>
+          <w:lang w:val="en-US"/>
+        </w:rPr>
+        <w:t xml:space="preserve">; </w:t>
+      </w:r>
+      <w:hyperlink r:id="rId5" w:history="1">
+        <w:r>
+          <w:rPr>
+            <w:rStyle w:val="a4"/>
+            <w:lang w:val="en-US"/>
+          </w:rPr>
+          <w:t>https://pixabay.com/de/sound-effects/film-spezialeffekte-button-click-289742/</w:t>
+        </w:r>
+      </w:hyperlink>
+    </w:p>
+    <w:p>
+      <w:pPr>
+        <w:rPr>
+          <w:lang w:val="en-US"/>
+        </w:rPr>
+      </w:pPr>
+      <w:r>
+        <w:rPr>
+          <w:lang w:val="en-US"/>
+        </w:rPr>
+        <w:t xml:space="preserve">X and O sound: </w:t>
+      </w:r>
+      <w:r>
+        <w:rPr>
+          <w:lang w:val="en-US"/>
+        </w:rPr>
+        <w:t>https://pixabay.com/de/sound-effects/immersivecontrol-button-click-sound-463065/</w:t>
+      </w:r>
     </w:p>
     <w:p>
       <w:pPr>
@@ -2953,6 +3255,18 @@
         </w:rPr>
         <w:t>Draw</w:t>
       </w:r>
+      <w:r>
+        <w:rPr>
+          <w:lang w:val="en-US"/>
+        </w:rPr>
+        <w:t xml:space="preserve">: </w:t>
+      </w:r>
+      <w:r>
+        <w:rPr>
+          <w:lang w:val="en-US"/>
+        </w:rPr>
+        <w:t>https://pixabay.com/sound-effects/film-special-effects-game-over-arcade-6435/</w:t>
+      </w:r>
     </w:p>
     <w:p>
       <w:pPr>
@@ -2966,18 +3280,17 @@
         </w:rPr>
         <w:t>Win</w:t>
       </w:r>
-    </w:p>
-    <w:p>
-      <w:pPr>
-        <w:rPr>
-          <w:lang w:val="en-US"/>
-        </w:rPr>
-      </w:pPr>
-      <w:r>
-        <w:rPr>
-          <w:lang w:val="en-US"/>
-        </w:rPr>
-        <w:t>Lose</w:t>
+      <w:r>
+        <w:rPr>
+          <w:lang w:val="en-US"/>
+        </w:rPr>
+        <w:t xml:space="preserve">: </w:t>
+      </w:r>
+      <w:r>
+        <w:rPr>
+          <w:lang w:val="en-US"/>
+        </w:rPr>
+        <w:t>https://pixabay.com/de/sound-effects/film-spezialeffekte-winner-game-sound-404167/</w:t>
       </w:r>
     </w:p>
     <w:p>
@@ -3047,6 +3360,52 @@
     <w:p>
       <w:pPr>
         <w:rPr>
+          <w:lang w:val="de-DE"/>
+        </w:rPr>
+      </w:pPr>
+      <w:proofErr w:type="spellStart"/>
+      <w:r>
+        <w:rPr>
+          <w:lang w:val="de-DE"/>
+        </w:rPr>
+        <w:t>Powerup</w:t>
+      </w:r>
+      <w:proofErr w:type="spellEnd"/>
+      <w:r>
+        <w:rPr>
+          <w:lang w:val="de-DE"/>
+        </w:rPr>
+        <w:t xml:space="preserve"> einsammeln: </w:t>
+      </w:r>
+      <w:r>
+        <w:rPr>
+          <w:lang w:val="de-DE"/>
+        </w:rPr>
+        <w:t>https://pixabay.com/de/sound-effects/film-spezialeffekte-coin-c-02-102844/</w:t>
+      </w:r>
+    </w:p>
+    <w:p>
+      <w:pPr>
+        <w:rPr>
+          <w:lang w:val="de-DE"/>
+        </w:rPr>
+      </w:pPr>
+      <w:r>
+        <w:rPr>
+          <w:lang w:val="de-DE"/>
+        </w:rPr>
+        <w:t xml:space="preserve">Explosion: </w:t>
+      </w:r>
+      <w:r>
+        <w:rPr>
+          <w:lang w:val="de-DE"/>
+        </w:rPr>
+        <w:t>https://pixabay.com/de/sound-effects/film-spezialeffekte-coin-upaif-14631/</w:t>
+      </w:r>
+    </w:p>
+    <w:p>
+      <w:pPr>
+        <w:rPr>
           <w:lang w:val="en-US"/>
         </w:rPr>
       </w:pPr>
@@ -3056,7 +3415,7 @@
         </w:rPr>
         <w:t xml:space="preserve">background music: </w:t>
       </w:r>
-      <w:hyperlink r:id="rId5" w:history="1">
+      <w:hyperlink r:id="rId6" w:history="1">
         <w:r>
           <w:rPr>
             <w:rStyle w:val="a4"/>
@@ -3078,7 +3437,7 @@
         </w:rPr>
         <w:t xml:space="preserve">Start: </w:t>
       </w:r>
-      <w:hyperlink r:id="rId6" w:history="1">
+      <w:hyperlink r:id="rId7" w:history="1">
         <w:r>
           <w:rPr>
             <w:rStyle w:val="a4"/>
@@ -3094,6 +3453,71 @@
           <w:lang w:val="en-US"/>
         </w:rPr>
       </w:pPr>
+      <w:r>
+        <w:rPr>
+          <w:lang w:val="en-US"/>
+        </w:rPr>
+        <w:t xml:space="preserve">Lose: </w:t>
+      </w:r>
+      <w:hyperlink r:id="rId8" w:history="1">
+        <w:r>
+          <w:rPr>
+            <w:rStyle w:val="a4"/>
+            <w:lang w:val="en-US"/>
+          </w:rPr>
+          <w:t>https://pixabay.com/sound-effects/film-special-effects-game-over-arcade-6435/</w:t>
+        </w:r>
+      </w:hyperlink>
+    </w:p>
+    <w:p>
+      <w:pPr>
+        <w:rPr>
+          <w:lang w:val="en-US"/>
+        </w:rPr>
+      </w:pPr>
+      <w:r>
+        <w:rPr>
+          <w:lang w:val="en-US"/>
+        </w:rPr>
+        <w:t xml:space="preserve">Blocks break: </w:t>
+      </w:r>
+      <w:hyperlink r:id="rId9" w:history="1">
+        <w:r>
+          <w:rPr>
+            <w:rStyle w:val="a4"/>
+            <w:lang w:val="en-US"/>
+          </w:rPr>
+          <w:t>https://pixabay.com/de/sound-effects/film-spezialeffekte-retro-laser-1-236669/</w:t>
+        </w:r>
+      </w:hyperlink>
+    </w:p>
+    <w:p>
+      <w:pPr>
+        <w:rPr>
+          <w:lang w:val="de-DE"/>
+        </w:rPr>
+      </w:pPr>
+      <w:hyperlink r:id="rId10" w:history="1">
+        <w:r>
+          <w:rPr>
+            <w:rStyle w:val="a4"/>
+            <w:lang w:val="de-DE"/>
+          </w:rPr>
+          <w:t>https://pixabay.com/sound-effects/film-special-effects-retro-coin-4-236671/</w:t>
+        </w:r>
+      </w:hyperlink>
+      <w:r>
+        <w:rPr>
+          <w:lang w:val="de-DE"/>
+        </w:rPr>
+        <w:t xml:space="preserve"> DA</w:t>
+      </w:r>
+      <w:r>
+        <w:rPr>
+          <w:lang w:val="de-DE"/>
+        </w:rPr>
+        <w:t>S HIER</w:t>
+      </w:r>
     </w:p>
     <w:p>
       <w:pPr>
@@ -3127,7 +3551,7 @@
           <w:lang w:val="en-US"/>
         </w:rPr>
       </w:pPr>
-      <w:hyperlink r:id="rId7" w:history="1">
+      <w:hyperlink r:id="rId11" w:history="1">
         <w:r>
           <w:rPr>
             <w:rStyle w:val="a4"/>
@@ -3147,6 +3571,1425 @@
       <w:pPr>
         <w:rPr>
           <w:lang w:val="en-US"/>
+        </w:rPr>
+      </w:pPr>
+    </w:p>
+    <w:p>
+      <w:pPr>
+        <w:rPr>
+          <w:lang w:val="en-US"/>
+        </w:rPr>
+      </w:pPr>
+    </w:p>
+    <w:p>
+      <w:pPr>
+        <w:rPr>
+          <w:lang w:val="en-US"/>
+        </w:rPr>
+      </w:pPr>
+    </w:p>
+    <w:p>
+      <w:pPr>
+        <w:rPr>
+          <w:lang w:val="en-US"/>
+        </w:rPr>
+      </w:pPr>
+    </w:p>
+    <w:p>
+      <w:pPr>
+        <w:rPr>
+          <w:lang w:val="en-US"/>
+        </w:rPr>
+      </w:pPr>
+    </w:p>
+    <w:p>
+      <w:pPr>
+        <w:rPr>
+          <w:lang w:val="en-US"/>
+        </w:rPr>
+      </w:pPr>
+    </w:p>
+    <w:p>
+      <w:pPr>
+        <w:rPr>
+          <w:lang w:val="en-US"/>
+        </w:rPr>
+      </w:pPr>
+    </w:p>
+    <w:p>
+      <w:pPr>
+        <w:rPr>
+          <w:lang w:val="en-US"/>
+        </w:rPr>
+      </w:pPr>
+    </w:p>
+    <w:p>
+      <w:pPr>
+        <w:rPr>
+          <w:lang w:val="en-US"/>
+        </w:rPr>
+      </w:pPr>
+    </w:p>
+    <w:p>
+      <w:pPr>
+        <w:rPr>
+          <w:lang w:val="en-US"/>
+        </w:rPr>
+      </w:pPr>
+      <w:r>
+        <w:rPr>
+          <w:lang w:val="en-US"/>
+        </w:rPr>
+        <w:lastRenderedPageBreak/>
+        <w:t>Breakout</w:t>
+      </w:r>
+    </w:p>
+    <w:p>
+      <w:pPr>
+        <w:rPr>
+          <w:lang w:val="en-US"/>
+        </w:rPr>
+      </w:pPr>
+    </w:p>
+    <w:p>
+      <w:pPr>
+        <w:rPr>
+          <w:lang w:val="de-DE"/>
+        </w:rPr>
+      </w:pPr>
+      <w:r>
+        <w:rPr>
+          <w:lang w:val="de-DE"/>
+        </w:rPr>
+        <w:t xml:space="preserve">Das Projekt ist ein moderner </w:t>
+      </w:r>
+      <w:r>
+        <w:rPr>
+          <w:b/>
+          <w:bCs/>
+          <w:lang w:val="de-DE"/>
+        </w:rPr>
+        <w:t>Breakout-Klon</w:t>
+      </w:r>
+      <w:r>
+        <w:rPr>
+          <w:lang w:val="de-DE"/>
+        </w:rPr>
+        <w:t>, entwickelt mit Unity (C#). Das Ziel ist es, mit einem Ball alle Blöcke im Level zu zerstören, ohne dass der Ball den unteren Bildschirmrand berührt.</w:t>
+      </w:r>
+    </w:p>
+    <w:p>
+      <w:pPr>
+        <w:rPr>
+          <w:b/>
+          <w:bCs/>
+        </w:rPr>
+      </w:pPr>
+      <w:proofErr w:type="spellStart"/>
+      <w:r>
+        <w:rPr>
+          <w:b/>
+          <w:bCs/>
+        </w:rPr>
+        <w:t>Spezial-Features</w:t>
+      </w:r>
+      <w:proofErr w:type="spellEnd"/>
+    </w:p>
+    <w:p>
+      <w:pPr>
+        <w:numPr>
+          <w:ilvl w:val="0"/>
+          <w:numId w:val="5"/>
+        </w:numPr>
+        <w:rPr>
+          <w:lang w:val="de-DE"/>
+        </w:rPr>
+      </w:pPr>
+      <w:r>
+        <w:rPr>
+          <w:b/>
+          <w:bCs/>
+          <w:lang w:val="de-DE"/>
+        </w:rPr>
+        <w:t>Power-Up System:</w:t>
+      </w:r>
+      <w:r>
+        <w:rPr>
+          <w:lang w:val="de-DE"/>
+        </w:rPr>
+        <w:t xml:space="preserve"> Zufällige Drops (Großes Paddle, Kanonen, Explosion).</w:t>
+      </w:r>
+    </w:p>
+    <w:p>
+      <w:pPr>
+        <w:numPr>
+          <w:ilvl w:val="0"/>
+          <w:numId w:val="5"/>
+        </w:numPr>
+        <w:rPr>
+          <w:lang w:val="de-DE"/>
+        </w:rPr>
+      </w:pPr>
+      <w:r>
+        <w:rPr>
+          <w:b/>
+          <w:bCs/>
+          <w:lang w:val="de-DE"/>
+        </w:rPr>
+        <w:t>Geister-Modus:</w:t>
+      </w:r>
+      <w:r>
+        <w:rPr>
+          <w:lang w:val="de-DE"/>
+        </w:rPr>
+        <w:t xml:space="preserve"> Blöcke werden periodisch passierbar.</w:t>
+      </w:r>
+    </w:p>
+    <w:p>
+      <w:pPr>
+        <w:numPr>
+          <w:ilvl w:val="0"/>
+          <w:numId w:val="5"/>
+        </w:numPr>
+        <w:rPr>
+          <w:lang w:val="de-DE"/>
+        </w:rPr>
+      </w:pPr>
+      <w:r>
+        <w:rPr>
+          <w:b/>
+          <w:bCs/>
+          <w:lang w:val="de-DE"/>
+        </w:rPr>
+        <w:t>Explosions-Mechanik:</w:t>
+      </w:r>
+      <w:r>
+        <w:rPr>
+          <w:lang w:val="de-DE"/>
+        </w:rPr>
+        <w:t xml:space="preserve"> Manuelle Zündung am Ball per Leertaste.</w:t>
+      </w:r>
+    </w:p>
+    <w:p>
+      <w:pPr>
+        <w:numPr>
+          <w:ilvl w:val="0"/>
+          <w:numId w:val="5"/>
+        </w:numPr>
+        <w:rPr>
+          <w:lang w:val="de-DE"/>
+        </w:rPr>
+      </w:pPr>
+      <w:r>
+        <w:rPr>
+          <w:b/>
+          <w:bCs/>
+          <w:lang w:val="de-DE"/>
+        </w:rPr>
+        <w:t>Dynamische Physik:</w:t>
+      </w:r>
+      <w:r>
+        <w:rPr>
+          <w:lang w:val="de-DE"/>
+        </w:rPr>
+        <w:t xml:space="preserve"> </w:t>
+      </w:r>
+      <w:proofErr w:type="spellStart"/>
+      <w:r>
+        <w:rPr>
+          <w:lang w:val="de-DE"/>
+        </w:rPr>
+        <w:t>Abprallwinkel</w:t>
+      </w:r>
+      <w:proofErr w:type="spellEnd"/>
+      <w:r>
+        <w:rPr>
+          <w:lang w:val="de-DE"/>
+        </w:rPr>
+        <w:t xml:space="preserve"> wird durch den Auftreffpunkt am Paddle gesteuert.</w:t>
+      </w:r>
+    </w:p>
+    <w:p>
+      <w:pPr>
+        <w:numPr>
+          <w:ilvl w:val="0"/>
+          <w:numId w:val="5"/>
+        </w:numPr>
+        <w:rPr>
+          <w:lang w:val="de-DE"/>
+        </w:rPr>
+      </w:pPr>
+      <w:r>
+        <w:rPr>
+          <w:b/>
+          <w:bCs/>
+          <w:lang w:val="de-DE"/>
+        </w:rPr>
+        <w:t>Sound-System:</w:t>
+      </w:r>
+      <w:r>
+        <w:rPr>
+          <w:lang w:val="de-DE"/>
+        </w:rPr>
+        <w:t xml:space="preserve"> Dynamische Effekte für Treffer, Zerstörung und Power-</w:t>
+      </w:r>
+      <w:proofErr w:type="spellStart"/>
+      <w:r>
+        <w:rPr>
+          <w:lang w:val="de-DE"/>
+        </w:rPr>
+        <w:t>Ups</w:t>
+      </w:r>
+      <w:proofErr w:type="spellEnd"/>
+      <w:r>
+        <w:rPr>
+          <w:lang w:val="de-DE"/>
+        </w:rPr>
+        <w:t>.</w:t>
+      </w:r>
+    </w:p>
+    <w:p>
+      <w:pPr>
+        <w:rPr>
+          <w:b/>
+          <w:bCs/>
+          <w:lang w:val="de-DE"/>
+        </w:rPr>
+      </w:pPr>
+      <w:r>
+        <w:rPr>
+          <w:b/>
+          <w:bCs/>
+          <w:lang w:val="de-DE"/>
+        </w:rPr>
+        <w:t>1. Die "Gehirn"-Klasse: BreakoutManager</w:t>
+      </w:r>
+    </w:p>
+    <w:p>
+      <w:pPr>
+        <w:rPr>
+          <w:lang w:val="de-DE"/>
+        </w:rPr>
+      </w:pPr>
+      <w:r>
+        <w:rPr>
+          <w:lang w:val="de-DE"/>
+        </w:rPr>
+        <w:t xml:space="preserve">Der Manager ist ein </w:t>
+      </w:r>
+      <w:r>
+        <w:rPr>
+          <w:b/>
+          <w:bCs/>
+          <w:lang w:val="de-DE"/>
+        </w:rPr>
+        <w:t>Singleton</w:t>
+      </w:r>
+      <w:r>
+        <w:rPr>
+          <w:lang w:val="de-DE"/>
+        </w:rPr>
+        <w:t xml:space="preserve"> (instance). Das bedeutet, er existiert nur einmal und jedes andere Skript kann ihn sofort aufrufen.</w:t>
+      </w:r>
+    </w:p>
+    <w:p>
+      <w:pPr>
+        <w:numPr>
+          <w:ilvl w:val="0"/>
+          <w:numId w:val="6"/>
+        </w:numPr>
+      </w:pPr>
+      <w:r>
+        <w:rPr>
+          <w:b/>
+          <w:bCs/>
+          <w:lang w:val="de-DE"/>
+        </w:rPr>
+        <w:t>Verwaltung:</w:t>
+      </w:r>
+      <w:r>
+        <w:rPr>
+          <w:lang w:val="de-DE"/>
+        </w:rPr>
+        <w:t xml:space="preserve"> Er zählt die lives (Leben) und die remainingBlocks (verbleibende Blöcke). </w:t>
+      </w:r>
+      <w:proofErr w:type="spellStart"/>
+      <w:r>
+        <w:t>Er</w:t>
+      </w:r>
+      <w:proofErr w:type="spellEnd"/>
+      <w:r>
+        <w:t xml:space="preserve"> </w:t>
+      </w:r>
+      <w:proofErr w:type="spellStart"/>
+      <w:r>
+        <w:t>weiß</w:t>
+      </w:r>
+      <w:proofErr w:type="spellEnd"/>
+      <w:r>
+        <w:t xml:space="preserve">, </w:t>
+      </w:r>
+      <w:proofErr w:type="spellStart"/>
+      <w:r>
+        <w:t>wann</w:t>
+      </w:r>
+      <w:proofErr w:type="spellEnd"/>
+      <w:r>
+        <w:t xml:space="preserve"> </w:t>
+      </w:r>
+      <w:proofErr w:type="spellStart"/>
+      <w:r>
+        <w:t>das</w:t>
+      </w:r>
+      <w:proofErr w:type="spellEnd"/>
+      <w:r>
+        <w:t xml:space="preserve"> </w:t>
+      </w:r>
+      <w:proofErr w:type="spellStart"/>
+      <w:r>
+        <w:t>Spiel</w:t>
+      </w:r>
+      <w:proofErr w:type="spellEnd"/>
+      <w:r>
+        <w:t xml:space="preserve"> </w:t>
+      </w:r>
+      <w:proofErr w:type="spellStart"/>
+      <w:r>
+        <w:t>gewonnen</w:t>
+      </w:r>
+      <w:proofErr w:type="spellEnd"/>
+      <w:r>
+        <w:t xml:space="preserve"> </w:t>
+      </w:r>
+      <w:proofErr w:type="spellStart"/>
+      <w:r>
+        <w:t>oder</w:t>
+      </w:r>
+      <w:proofErr w:type="spellEnd"/>
+      <w:r>
+        <w:t xml:space="preserve"> </w:t>
+      </w:r>
+      <w:proofErr w:type="spellStart"/>
+      <w:r>
+        <w:t>verloren</w:t>
+      </w:r>
+      <w:proofErr w:type="spellEnd"/>
+      <w:r>
+        <w:t xml:space="preserve"> </w:t>
+      </w:r>
+      <w:proofErr w:type="spellStart"/>
+      <w:r>
+        <w:t>ist</w:t>
+      </w:r>
+      <w:proofErr w:type="spellEnd"/>
+      <w:r>
+        <w:t>.</w:t>
+      </w:r>
+    </w:p>
+    <w:p>
+      <w:pPr>
+        <w:numPr>
+          <w:ilvl w:val="0"/>
+          <w:numId w:val="6"/>
+        </w:numPr>
+        <w:rPr>
+          <w:lang w:val="de-DE"/>
+        </w:rPr>
+      </w:pPr>
+      <w:r>
+        <w:rPr>
+          <w:b/>
+          <w:bCs/>
+          <w:lang w:val="de-DE"/>
+        </w:rPr>
+        <w:t>Power-Up Logik:</w:t>
+      </w:r>
+      <w:r>
+        <w:rPr>
+          <w:lang w:val="de-DE"/>
+        </w:rPr>
+        <w:t xml:space="preserve"> Er speichert im Dictionary, welcher Block welches Item fallen lässt.</w:t>
+      </w:r>
+    </w:p>
+    <w:p>
+      <w:pPr>
+        <w:numPr>
+          <w:ilvl w:val="0"/>
+          <w:numId w:val="6"/>
+        </w:numPr>
+        <w:rPr>
+          <w:lang w:val="de-DE"/>
+        </w:rPr>
+      </w:pPr>
+      <w:r>
+        <w:rPr>
+          <w:b/>
+          <w:bCs/>
+          <w:lang w:val="de-DE"/>
+        </w:rPr>
+        <w:t>Audio:</w:t>
+      </w:r>
+      <w:r>
+        <w:rPr>
+          <w:lang w:val="de-DE"/>
+        </w:rPr>
+        <w:t xml:space="preserve"> Mit </w:t>
+      </w:r>
+      <w:proofErr w:type="gramStart"/>
+      <w:r>
+        <w:rPr>
+          <w:lang w:val="de-DE"/>
+        </w:rPr>
+        <w:t>PlaySFX(</w:t>
+      </w:r>
+      <w:proofErr w:type="gramEnd"/>
+      <w:r>
+        <w:rPr>
+          <w:lang w:val="de-DE"/>
+        </w:rPr>
+        <w:t>) ist er die zentrale Soundmaschine für das ganze Spiel.</w:t>
+      </w:r>
+    </w:p>
+    <w:p>
+      <w:pPr>
+        <w:rPr>
+          <w:b/>
+          <w:bCs/>
+        </w:rPr>
+      </w:pPr>
+      <w:r>
+        <w:rPr>
+          <w:b/>
+          <w:bCs/>
+        </w:rPr>
+        <w:t xml:space="preserve">2. Die </w:t>
+      </w:r>
+      <w:proofErr w:type="spellStart"/>
+      <w:r>
+        <w:rPr>
+          <w:b/>
+          <w:bCs/>
+        </w:rPr>
+        <w:t>Spieler-Einheit</w:t>
+      </w:r>
+      <w:proofErr w:type="spellEnd"/>
+      <w:r>
+        <w:rPr>
+          <w:b/>
+          <w:bCs/>
+        </w:rPr>
+        <w:t xml:space="preserve">: </w:t>
+      </w:r>
+      <w:proofErr w:type="spellStart"/>
+      <w:r>
+        <w:rPr>
+          <w:b/>
+          <w:bCs/>
+        </w:rPr>
+        <w:t>BreakoutPaddle</w:t>
+      </w:r>
+      <w:proofErr w:type="spellEnd"/>
+    </w:p>
+    <w:p>
+      <w:pPr>
+        <w:numPr>
+          <w:ilvl w:val="0"/>
+          <w:numId w:val="7"/>
+        </w:numPr>
+      </w:pPr>
+      <w:r>
+        <w:rPr>
+          <w:b/>
+          <w:bCs/>
+          <w:lang w:val="de-DE"/>
+        </w:rPr>
+        <w:t>Physik-Geber:</w:t>
+      </w:r>
+      <w:r>
+        <w:rPr>
+          <w:lang w:val="de-DE"/>
+        </w:rPr>
+        <w:t xml:space="preserve"> Wenn der Ball das Paddle trifft (OnCollisionEnter2D), berechnet das Paddle einen neuen Winkel und schickt diese </w:t>
+      </w:r>
+      <w:r>
+        <w:rPr>
+          <w:b/>
+          <w:bCs/>
+          <w:lang w:val="de-DE"/>
+        </w:rPr>
+        <w:t>Physik-Daten</w:t>
+      </w:r>
+      <w:r>
+        <w:rPr>
+          <w:lang w:val="de-DE"/>
+        </w:rPr>
+        <w:t xml:space="preserve"> an den Ball zurück. </w:t>
+      </w:r>
+      <w:proofErr w:type="spellStart"/>
+      <w:r>
+        <w:t>So</w:t>
+      </w:r>
+      <w:proofErr w:type="spellEnd"/>
+      <w:r>
+        <w:t xml:space="preserve"> </w:t>
+      </w:r>
+      <w:proofErr w:type="spellStart"/>
+      <w:r>
+        <w:t>steuerst</w:t>
+      </w:r>
+      <w:proofErr w:type="spellEnd"/>
+      <w:r>
+        <w:t xml:space="preserve"> </w:t>
+      </w:r>
+      <w:proofErr w:type="spellStart"/>
+      <w:r>
+        <w:t>du</w:t>
+      </w:r>
+      <w:proofErr w:type="spellEnd"/>
+      <w:r>
+        <w:t xml:space="preserve"> </w:t>
+      </w:r>
+      <w:proofErr w:type="spellStart"/>
+      <w:r>
+        <w:t>den</w:t>
+      </w:r>
+      <w:proofErr w:type="spellEnd"/>
+      <w:r>
+        <w:t xml:space="preserve"> </w:t>
+      </w:r>
+      <w:proofErr w:type="spellStart"/>
+      <w:r>
+        <w:t>Ball</w:t>
+      </w:r>
+      <w:proofErr w:type="spellEnd"/>
+      <w:r>
+        <w:t xml:space="preserve"> </w:t>
+      </w:r>
+      <w:proofErr w:type="spellStart"/>
+      <w:r>
+        <w:t>aktiv</w:t>
+      </w:r>
+      <w:proofErr w:type="spellEnd"/>
+      <w:r>
+        <w:t>.</w:t>
+      </w:r>
+    </w:p>
+    <w:p>
+      <w:pPr>
+        <w:numPr>
+          <w:ilvl w:val="0"/>
+          <w:numId w:val="7"/>
+        </w:numPr>
+        <w:rPr>
+          <w:lang w:val="de-DE"/>
+        </w:rPr>
+      </w:pPr>
+      <w:r>
+        <w:rPr>
+          <w:b/>
+          <w:bCs/>
+          <w:lang w:val="de-DE"/>
+        </w:rPr>
+        <w:t>Power-Up Empfänger:</w:t>
+      </w:r>
+      <w:r>
+        <w:rPr>
+          <w:lang w:val="de-DE"/>
+        </w:rPr>
+        <w:t xml:space="preserve"> Er enthält die Logik für das "Große Paddle" und die "Kanonen" (ActivateDoubleBall).</w:t>
+      </w:r>
+    </w:p>
+    <w:p>
+      <w:pPr>
+        <w:numPr>
+          <w:ilvl w:val="0"/>
+          <w:numId w:val="7"/>
+        </w:numPr>
+        <w:rPr>
+          <w:lang w:val="de-DE"/>
+        </w:rPr>
+      </w:pPr>
+      <w:r>
+        <w:rPr>
+          <w:b/>
+          <w:bCs/>
+          <w:lang w:val="de-DE"/>
+        </w:rPr>
+        <w:t>Kommunikation:</w:t>
+      </w:r>
+      <w:r>
+        <w:rPr>
+          <w:lang w:val="de-DE"/>
+        </w:rPr>
+        <w:t xml:space="preserve"> Er meldet dem Manager über OnBlockDestroyed, wenn eines seiner Projektile (DoubleBall) einen Block erwischt hat.</w:t>
+      </w:r>
+    </w:p>
+    <w:p>
+      <w:pPr>
+        <w:rPr>
+          <w:b/>
+          <w:bCs/>
+        </w:rPr>
+      </w:pPr>
+      <w:r>
+        <w:rPr>
+          <w:b/>
+          <w:bCs/>
+        </w:rPr>
+        <w:t xml:space="preserve">3. Die </w:t>
+      </w:r>
+      <w:proofErr w:type="spellStart"/>
+      <w:r>
+        <w:rPr>
+          <w:b/>
+          <w:bCs/>
+        </w:rPr>
+        <w:t>Ziele</w:t>
+      </w:r>
+      <w:proofErr w:type="spellEnd"/>
+      <w:r>
+        <w:rPr>
+          <w:b/>
+          <w:bCs/>
+        </w:rPr>
+        <w:t xml:space="preserve">: </w:t>
+      </w:r>
+      <w:proofErr w:type="spellStart"/>
+      <w:r>
+        <w:rPr>
+          <w:b/>
+          <w:bCs/>
+        </w:rPr>
+        <w:t>BreakoutBlock</w:t>
+      </w:r>
+      <w:proofErr w:type="spellEnd"/>
+    </w:p>
+    <w:p>
+      <w:pPr>
+        <w:numPr>
+          <w:ilvl w:val="0"/>
+          <w:numId w:val="8"/>
+        </w:numPr>
+        <w:rPr>
+          <w:lang w:val="de-DE"/>
+        </w:rPr>
+      </w:pPr>
+      <w:r>
+        <w:rPr>
+          <w:b/>
+          <w:bCs/>
+          <w:lang w:val="de-DE"/>
+        </w:rPr>
+        <w:t>Zustand:</w:t>
+      </w:r>
+      <w:r>
+        <w:rPr>
+          <w:lang w:val="de-DE"/>
+        </w:rPr>
+        <w:t xml:space="preserve"> Jeder Block weiß, wie viele Treffer er noch verträgt (currentHits).</w:t>
+      </w:r>
+    </w:p>
+    <w:p>
+      <w:pPr>
+        <w:numPr>
+          <w:ilvl w:val="0"/>
+          <w:numId w:val="8"/>
+        </w:numPr>
+        <w:rPr>
+          <w:lang w:val="de-DE"/>
+        </w:rPr>
+      </w:pPr>
+      <w:r>
+        <w:rPr>
+          <w:b/>
+          <w:bCs/>
+          <w:lang w:val="de-DE"/>
+        </w:rPr>
+        <w:t>Visualisierung:</w:t>
+      </w:r>
+      <w:r>
+        <w:rPr>
+          <w:lang w:val="de-DE"/>
+        </w:rPr>
+        <w:t xml:space="preserve"> Mit </w:t>
+      </w:r>
+      <w:proofErr w:type="gramStart"/>
+      <w:r>
+        <w:rPr>
+          <w:lang w:val="de-DE"/>
+        </w:rPr>
+        <w:t>UpdateCracks(</w:t>
+      </w:r>
+      <w:proofErr w:type="gramEnd"/>
+      <w:r>
+        <w:rPr>
+          <w:lang w:val="de-DE"/>
+        </w:rPr>
+        <w:t>) wechselt er die Bilder, um Schäden anzuzeigen.</w:t>
+      </w:r>
+    </w:p>
+    <w:p>
+      <w:pPr>
+        <w:numPr>
+          <w:ilvl w:val="0"/>
+          <w:numId w:val="8"/>
+        </w:numPr>
+        <w:rPr>
+          <w:lang w:val="de-DE"/>
+        </w:rPr>
+      </w:pPr>
+      <w:r>
+        <w:rPr>
+          <w:b/>
+          <w:bCs/>
+          <w:lang w:val="de-DE"/>
+        </w:rPr>
+        <w:t>Ghost-Mode:</w:t>
+      </w:r>
+      <w:r>
+        <w:rPr>
+          <w:lang w:val="de-DE"/>
+        </w:rPr>
+        <w:t xml:space="preserve"> Der Manager kann den Block über SetGhostMode "durchsichtig" machen, sodass der Ball einfach hindurchfliegt.</w:t>
+      </w:r>
+    </w:p>
+    <w:p>
+      <w:pPr>
+        <w:rPr>
+          <w:b/>
+          <w:bCs/>
+        </w:rPr>
+      </w:pPr>
+      <w:r>
+        <w:rPr>
+          <w:b/>
+          <w:bCs/>
+        </w:rPr>
+        <w:t xml:space="preserve">4. Das </w:t>
+      </w:r>
+      <w:proofErr w:type="spellStart"/>
+      <w:r>
+        <w:rPr>
+          <w:b/>
+          <w:bCs/>
+        </w:rPr>
+        <w:t>Herzstück</w:t>
+      </w:r>
+      <w:proofErr w:type="spellEnd"/>
+      <w:r>
+        <w:rPr>
+          <w:b/>
+          <w:bCs/>
+        </w:rPr>
+        <w:t xml:space="preserve">: </w:t>
+      </w:r>
+      <w:proofErr w:type="spellStart"/>
+      <w:r>
+        <w:rPr>
+          <w:b/>
+          <w:bCs/>
+        </w:rPr>
+        <w:t>BreakoutBall</w:t>
+      </w:r>
+      <w:proofErr w:type="spellEnd"/>
+    </w:p>
+    <w:p>
+      <w:pPr>
+        <w:numPr>
+          <w:ilvl w:val="0"/>
+          <w:numId w:val="9"/>
+        </w:numPr>
+        <w:rPr>
+          <w:lang w:val="de-DE"/>
+        </w:rPr>
+      </w:pPr>
+      <w:r>
+        <w:rPr>
+          <w:b/>
+          <w:bCs/>
+          <w:lang w:val="de-DE"/>
+        </w:rPr>
+        <w:t>Zwei Modi:</w:t>
+      </w:r>
+      <w:r>
+        <w:rPr>
+          <w:lang w:val="de-DE"/>
+        </w:rPr>
+        <w:t xml:space="preserve"> Wenn launched falsch ist, klebt er am Paddle. Wenn wahr, fliegt er mit ballSpeed.</w:t>
+      </w:r>
+    </w:p>
+    <w:p>
+      <w:pPr>
+        <w:numPr>
+          <w:ilvl w:val="0"/>
+          <w:numId w:val="9"/>
+        </w:numPr>
+        <w:rPr>
+          <w:lang w:val="de-DE"/>
+        </w:rPr>
+      </w:pPr>
+      <w:r>
+        <w:rPr>
+          <w:b/>
+          <w:bCs/>
+          <w:lang w:val="de-DE"/>
+        </w:rPr>
+        <w:t>Offset-Berechnung:</w:t>
+      </w:r>
+      <w:r>
+        <w:rPr>
+          <w:lang w:val="de-DE"/>
+        </w:rPr>
+        <w:t xml:space="preserve"> Er berechnet ständig den Abstand zum Paddle (CalculateOffset), damit er auch dann perfekt auf der Oberkante liegt, wenn das Paddle durch ein Power-Up breiter wird.</w:t>
+      </w:r>
+    </w:p>
+    <w:p>
+      <w:pPr>
+        <w:rPr>
+          <w:b/>
+          <w:bCs/>
+        </w:rPr>
+      </w:pPr>
+      <w:r>
+        <w:rPr>
+          <w:b/>
+          <w:bCs/>
+        </w:rPr>
+        <w:lastRenderedPageBreak/>
+        <w:t xml:space="preserve">5. </w:t>
+      </w:r>
+      <w:proofErr w:type="spellStart"/>
+      <w:r>
+        <w:rPr>
+          <w:b/>
+          <w:bCs/>
+        </w:rPr>
+        <w:t>Spezial-Objekte</w:t>
+      </w:r>
+      <w:proofErr w:type="spellEnd"/>
+      <w:r>
+        <w:rPr>
+          <w:b/>
+          <w:bCs/>
+        </w:rPr>
+        <w:t xml:space="preserve">: </w:t>
+      </w:r>
+      <w:proofErr w:type="spellStart"/>
+      <w:r>
+        <w:rPr>
+          <w:b/>
+          <w:bCs/>
+        </w:rPr>
+        <w:t>PowerUp</w:t>
+      </w:r>
+      <w:proofErr w:type="spellEnd"/>
+      <w:r>
+        <w:rPr>
+          <w:b/>
+          <w:bCs/>
+        </w:rPr>
+        <w:t xml:space="preserve">, </w:t>
+      </w:r>
+      <w:proofErr w:type="spellStart"/>
+      <w:r>
+        <w:rPr>
+          <w:b/>
+          <w:bCs/>
+        </w:rPr>
+        <w:t>DoubleBall</w:t>
+      </w:r>
+      <w:proofErr w:type="spellEnd"/>
+      <w:r>
+        <w:rPr>
+          <w:b/>
+          <w:bCs/>
+        </w:rPr>
+        <w:t xml:space="preserve"> &amp; </w:t>
+      </w:r>
+      <w:proofErr w:type="spellStart"/>
+      <w:r>
+        <w:rPr>
+          <w:b/>
+          <w:bCs/>
+        </w:rPr>
+        <w:t>DeathZone</w:t>
+      </w:r>
+      <w:proofErr w:type="spellEnd"/>
+    </w:p>
+    <w:p>
+      <w:pPr>
+        <w:numPr>
+          <w:ilvl w:val="0"/>
+          <w:numId w:val="10"/>
+        </w:numPr>
+        <w:rPr>
+          <w:lang w:val="de-DE"/>
+        </w:rPr>
+      </w:pPr>
+      <w:r>
+        <w:rPr>
+          <w:b/>
+          <w:bCs/>
+          <w:lang w:val="de-DE"/>
+        </w:rPr>
+        <w:t>PowerUp:</w:t>
+      </w:r>
+      <w:r>
+        <w:rPr>
+          <w:lang w:val="de-DE"/>
+        </w:rPr>
+        <w:t xml:space="preserve"> Ein "Trigger"-Objekt, das beim Einsammeln die Spezialfähigkeiten im Paddle auslöst.</w:t>
+      </w:r>
+    </w:p>
+    <w:p>
+      <w:pPr>
+        <w:numPr>
+          <w:ilvl w:val="0"/>
+          <w:numId w:val="10"/>
+        </w:numPr>
+        <w:rPr>
+          <w:lang w:val="de-DE"/>
+        </w:rPr>
+      </w:pPr>
+      <w:r>
+        <w:rPr>
+          <w:b/>
+          <w:bCs/>
+          <w:lang w:val="de-DE"/>
+        </w:rPr>
+        <w:t>DoubleBall:</w:t>
+      </w:r>
+      <w:r>
+        <w:rPr>
+          <w:lang w:val="de-DE"/>
+        </w:rPr>
+        <w:t xml:space="preserve"> Die kleinen Projektile, die von den Paddle-Kanonen erzeugt werden. Sie haben eine kurze Lebensdauer (lifespan), damit sie nicht ewig im Bild bleiben.</w:t>
+      </w:r>
+    </w:p>
+    <w:p>
+      <w:pPr>
+        <w:numPr>
+          <w:ilvl w:val="0"/>
+          <w:numId w:val="10"/>
+        </w:numPr>
+        <w:rPr>
+          <w:lang w:val="de-DE"/>
+        </w:rPr>
+      </w:pPr>
+      <w:r>
+        <w:rPr>
+          <w:b/>
+          <w:bCs/>
+          <w:lang w:val="de-DE"/>
+        </w:rPr>
+        <w:t>BreakoutDeathZone:</w:t>
+      </w:r>
+      <w:r>
+        <w:rPr>
+          <w:lang w:val="de-DE"/>
+        </w:rPr>
+        <w:t xml:space="preserve"> Die "Aufräum-Instanz" am unteren Bildschirmrand. Sie sagt dem Manager: "Ball ist weg, zieh ein Leben ab!" oder löscht verpasste Power-Ups.</w:t>
+      </w:r>
+    </w:p>
+    <w:p>
+      <w:r>
+        <w:pict w14:anchorId="053A8F53">
+          <v:rect id="_x0000_i1032" style="width:0;height:1.5pt" o:hralign="center" o:hrstd="t" o:hr="t" fillcolor="#a0a0a0" stroked="f"/>
+        </w:pict>
+      </w:r>
+    </w:p>
+    <w:p>
+      <w:pPr>
+        <w:rPr>
+          <w:b/>
+          <w:bCs/>
+          <w:lang w:val="de-DE"/>
+        </w:rPr>
+      </w:pPr>
+      <w:r>
+        <w:rPr>
+          <w:b/>
+          <w:bCs/>
+          <w:lang w:val="de-DE"/>
+        </w:rPr>
+        <w:t>Visuelle Logik-Zusammenfassung</w:t>
+      </w:r>
+    </w:p>
+    <w:p>
+      <w:pPr>
+        <w:rPr>
+          <w:lang w:val="de-DE"/>
+        </w:rPr>
+      </w:pPr>
+      <w:r>
+        <w:rPr>
+          <w:b/>
+          <w:bCs/>
+          <w:lang w:val="de-DE"/>
+        </w:rPr>
+        <w:t>Der Datenfluss:</w:t>
+      </w:r>
+    </w:p>
+    <w:p>
+      <w:pPr>
+        <w:numPr>
+          <w:ilvl w:val="0"/>
+          <w:numId w:val="11"/>
+        </w:numPr>
+      </w:pPr>
+      <w:proofErr w:type="spellStart"/>
+      <w:r>
+        <w:rPr>
+          <w:b/>
+          <w:bCs/>
+        </w:rPr>
+        <w:t>Input</w:t>
+      </w:r>
+      <w:proofErr w:type="spellEnd"/>
+      <w:r>
+        <w:rPr>
+          <w:b/>
+          <w:bCs/>
+        </w:rPr>
+        <w:t>:</w:t>
+      </w:r>
+      <w:r>
+        <w:t xml:space="preserve"> </w:t>
+      </w:r>
+      <w:proofErr w:type="spellStart"/>
+      <w:r>
+        <w:t>Spieler</w:t>
+      </w:r>
+      <w:proofErr w:type="spellEnd"/>
+      <w:r>
+        <w:t xml:space="preserve"> </w:t>
+      </w:r>
+      <w:proofErr w:type="spellStart"/>
+      <w:r>
+        <w:t>bewegt</w:t>
+      </w:r>
+      <w:proofErr w:type="spellEnd"/>
+      <w:r>
+        <w:t xml:space="preserve"> </w:t>
+      </w:r>
+      <w:proofErr w:type="spellStart"/>
+      <w:r>
+        <w:t>Paddle</w:t>
+      </w:r>
+      <w:proofErr w:type="spellEnd"/>
+      <w:r>
+        <w:t xml:space="preserve"> $\</w:t>
+      </w:r>
+      <w:proofErr w:type="spellStart"/>
+      <w:r>
+        <w:t>rightarrow</w:t>
+      </w:r>
+      <w:proofErr w:type="spellEnd"/>
+      <w:r>
+        <w:t xml:space="preserve">$ </w:t>
+      </w:r>
+      <w:proofErr w:type="spellStart"/>
+      <w:r>
+        <w:rPr>
+          <w:b/>
+          <w:bCs/>
+        </w:rPr>
+        <w:t>Physik</w:t>
+      </w:r>
+      <w:proofErr w:type="spellEnd"/>
+      <w:r>
+        <w:rPr>
+          <w:b/>
+          <w:bCs/>
+        </w:rPr>
+        <w:t>:</w:t>
+      </w:r>
+      <w:r>
+        <w:t xml:space="preserve"> </w:t>
+      </w:r>
+      <w:proofErr w:type="spellStart"/>
+      <w:r>
+        <w:t>Paddle</w:t>
+      </w:r>
+      <w:proofErr w:type="spellEnd"/>
+      <w:r>
+        <w:t xml:space="preserve"> </w:t>
+      </w:r>
+      <w:proofErr w:type="spellStart"/>
+      <w:r>
+        <w:t>lenkt</w:t>
+      </w:r>
+      <w:proofErr w:type="spellEnd"/>
+      <w:r>
+        <w:t xml:space="preserve"> </w:t>
+      </w:r>
+      <w:proofErr w:type="spellStart"/>
+      <w:r>
+        <w:t>Ball</w:t>
+      </w:r>
+      <w:proofErr w:type="spellEnd"/>
+      <w:r>
+        <w:t xml:space="preserve"> $\</w:t>
+      </w:r>
+      <w:proofErr w:type="spellStart"/>
+      <w:r>
+        <w:t>rightarrow</w:t>
+      </w:r>
+      <w:proofErr w:type="spellEnd"/>
+      <w:r>
+        <w:t xml:space="preserve">$ </w:t>
+      </w:r>
+      <w:proofErr w:type="spellStart"/>
+      <w:r>
+        <w:rPr>
+          <w:b/>
+          <w:bCs/>
+        </w:rPr>
+        <w:t>Kollision</w:t>
+      </w:r>
+      <w:proofErr w:type="spellEnd"/>
+      <w:r>
+        <w:rPr>
+          <w:b/>
+          <w:bCs/>
+        </w:rPr>
+        <w:t>:</w:t>
+      </w:r>
+      <w:r>
+        <w:t xml:space="preserve"> </w:t>
+      </w:r>
+      <w:proofErr w:type="spellStart"/>
+      <w:r>
+        <w:t>Ball</w:t>
+      </w:r>
+      <w:proofErr w:type="spellEnd"/>
+      <w:r>
+        <w:t xml:space="preserve"> </w:t>
+      </w:r>
+      <w:proofErr w:type="spellStart"/>
+      <w:r>
+        <w:t>trifft</w:t>
+      </w:r>
+      <w:proofErr w:type="spellEnd"/>
+      <w:r>
+        <w:t xml:space="preserve"> Block.</w:t>
+      </w:r>
+    </w:p>
+    <w:p>
+      <w:pPr>
+        <w:numPr>
+          <w:ilvl w:val="0"/>
+          <w:numId w:val="11"/>
+        </w:numPr>
+      </w:pPr>
+      <w:r>
+        <w:rPr>
+          <w:b/>
+          <w:bCs/>
+          <w:lang w:val="de-DE"/>
+        </w:rPr>
+        <w:t>Reaktion:</w:t>
+      </w:r>
+      <w:r>
+        <w:rPr>
+          <w:lang w:val="de-DE"/>
+        </w:rPr>
+        <w:t xml:space="preserve"> Block HP sinkt $\rightarrow$ Block sagt Manager: "Bin kaputt!" </w:t>
+      </w:r>
+      <w:r>
+        <w:t>$\</w:t>
+      </w:r>
+      <w:proofErr w:type="spellStart"/>
+      <w:r>
+        <w:t>rightarrow</w:t>
+      </w:r>
+      <w:proofErr w:type="spellEnd"/>
+      <w:r>
+        <w:t xml:space="preserve">$ Manager </w:t>
+      </w:r>
+      <w:proofErr w:type="spellStart"/>
+      <w:r>
+        <w:t>sagt</w:t>
+      </w:r>
+      <w:proofErr w:type="spellEnd"/>
+      <w:r>
+        <w:t>: "</w:t>
+      </w:r>
+      <w:proofErr w:type="spellStart"/>
+      <w:r>
+        <w:t>Spiele</w:t>
+      </w:r>
+      <w:proofErr w:type="spellEnd"/>
+      <w:r>
+        <w:t xml:space="preserve"> Sound </w:t>
+      </w:r>
+      <w:proofErr w:type="spellStart"/>
+      <w:r>
+        <w:t>und</w:t>
+      </w:r>
+      <w:proofErr w:type="spellEnd"/>
+      <w:r>
+        <w:t xml:space="preserve"> </w:t>
+      </w:r>
+      <w:proofErr w:type="spellStart"/>
+      <w:r>
+        <w:t>prüfe</w:t>
+      </w:r>
+      <w:proofErr w:type="spellEnd"/>
+      <w:r>
+        <w:t xml:space="preserve"> </w:t>
+      </w:r>
+      <w:proofErr w:type="spellStart"/>
+      <w:r>
+        <w:t>Sieg</w:t>
+      </w:r>
+      <w:proofErr w:type="spellEnd"/>
+      <w:r>
+        <w:t>!".</w:t>
+      </w:r>
+    </w:p>
+    <w:p>
+      <w:pPr>
+        <w:numPr>
+          <w:ilvl w:val="0"/>
+          <w:numId w:val="11"/>
+        </w:numPr>
+      </w:pPr>
+      <w:r>
+        <w:rPr>
+          <w:b/>
+          <w:bCs/>
+        </w:rPr>
+        <w:t>Power-Up:</w:t>
+      </w:r>
+      <w:r>
+        <w:t xml:space="preserve"> Block </w:t>
+      </w:r>
+      <w:proofErr w:type="spellStart"/>
+      <w:r>
+        <w:t>spawnt</w:t>
+      </w:r>
+      <w:proofErr w:type="spellEnd"/>
+      <w:r>
+        <w:t xml:space="preserve"> </w:t>
+      </w:r>
+      <w:proofErr w:type="spellStart"/>
+      <w:r>
+        <w:t>Item</w:t>
+      </w:r>
+      <w:proofErr w:type="spellEnd"/>
+      <w:r>
+        <w:t xml:space="preserve"> $\</w:t>
+      </w:r>
+      <w:proofErr w:type="spellStart"/>
+      <w:r>
+        <w:t>rightarrow</w:t>
+      </w:r>
+      <w:proofErr w:type="spellEnd"/>
+      <w:r>
+        <w:t xml:space="preserve">$ </w:t>
+      </w:r>
+      <w:proofErr w:type="spellStart"/>
+      <w:r>
+        <w:t>Paddle</w:t>
+      </w:r>
+      <w:proofErr w:type="spellEnd"/>
+      <w:r>
+        <w:t xml:space="preserve"> </w:t>
+      </w:r>
+      <w:proofErr w:type="spellStart"/>
+      <w:r>
+        <w:t>sammelt</w:t>
+      </w:r>
+      <w:proofErr w:type="spellEnd"/>
+      <w:r>
+        <w:t xml:space="preserve"> </w:t>
+      </w:r>
+      <w:proofErr w:type="spellStart"/>
+      <w:r>
+        <w:t>es</w:t>
+      </w:r>
+      <w:proofErr w:type="spellEnd"/>
+      <w:r>
+        <w:t xml:space="preserve"> $\</w:t>
+      </w:r>
+      <w:proofErr w:type="spellStart"/>
+      <w:r>
+        <w:t>rightarrow</w:t>
+      </w:r>
+      <w:proofErr w:type="spellEnd"/>
+      <w:r>
+        <w:t xml:space="preserve">$ </w:t>
+      </w:r>
+      <w:proofErr w:type="spellStart"/>
+      <w:r>
+        <w:t>Paddle</w:t>
+      </w:r>
+      <w:proofErr w:type="spellEnd"/>
+      <w:r>
+        <w:t xml:space="preserve"> </w:t>
+      </w:r>
+      <w:proofErr w:type="spellStart"/>
+      <w:r>
+        <w:t>schaltet</w:t>
+      </w:r>
+      <w:proofErr w:type="spellEnd"/>
+      <w:r>
+        <w:t xml:space="preserve"> </w:t>
+      </w:r>
+      <w:proofErr w:type="spellStart"/>
+      <w:r>
+        <w:t>Kanonen</w:t>
+      </w:r>
+      <w:proofErr w:type="spellEnd"/>
+      <w:r>
+        <w:t xml:space="preserve"> </w:t>
+      </w:r>
+      <w:proofErr w:type="spellStart"/>
+      <w:r>
+        <w:t>frei</w:t>
+      </w:r>
+      <w:proofErr w:type="spellEnd"/>
+      <w:r>
+        <w:t xml:space="preserve"> $\</w:t>
+      </w:r>
+      <w:proofErr w:type="spellStart"/>
+      <w:r>
+        <w:t>rightarrow</w:t>
+      </w:r>
+      <w:proofErr w:type="spellEnd"/>
+      <w:r>
+        <w:t xml:space="preserve">$ </w:t>
+      </w:r>
+      <w:proofErr w:type="spellStart"/>
+      <w:r>
+        <w:t>Kanonen</w:t>
+      </w:r>
+      <w:proofErr w:type="spellEnd"/>
+      <w:r>
+        <w:t xml:space="preserve"> </w:t>
+      </w:r>
+      <w:proofErr w:type="spellStart"/>
+      <w:r>
+        <w:t>schießen</w:t>
+      </w:r>
+      <w:proofErr w:type="spellEnd"/>
+      <w:r>
+        <w:t xml:space="preserve"> </w:t>
+      </w:r>
+      <w:proofErr w:type="spellStart"/>
+      <w:r>
+        <w:t>DoubleBall</w:t>
+      </w:r>
+      <w:proofErr w:type="spellEnd"/>
+      <w:r>
+        <w:t>.</w:t>
+      </w:r>
+    </w:p>
+    <w:p>
+      <w:pPr>
+        <w:rPr>
+          <w:lang w:val="de-DE"/>
         </w:rPr>
       </w:pPr>
     </w:p>
@@ -3163,6 +5006,304 @@
 <file path=word/numbering.xml><?xml version="1.0" encoding="utf-8"?>
 <w:numbering xmlns:wpc="http://schemas.microsoft.com/office/word/2010/wordprocessingCanvas" xmlns:cx="http://schemas.microsoft.com/office/drawing/2014/chartex" xmlns:cx1="http://schemas.microsoft.com/office/drawing/2015/9/8/chartex" xmlns:cx2="http://schemas.microsoft.com/office/drawing/2015/10/21/chartex" xmlns:cx3="http://schemas.microsoft.com/office/drawing/2016/5/9/chartex" xmlns:cx4="http://schemas.microsoft.com/office/drawing/2016/5/10/chartex" xmlns:cx5="http://schemas.microsoft.com/office/drawing/2016/5/11/chartex" xmlns:cx6="http://schemas.microsoft.com/office/drawing/2016/5/12/chartex" xmlns:cx7="http://schemas.microsoft.com/office/drawing/2016/5/13/chartex" xmlns:cx8="http://schemas.microsoft.com/office/drawing/2016/5/14/chartex" xmlns:mc="http://schemas.openxmlformats.org/markup-compatibility/2006" xmlns:aink="http://schemas.microsoft.com/office/drawing/2016/ink" xmlns:am3d="http://schemas.microsoft.com/office/drawing/2017/model3d" xmlns:o="urn:schemas-microsoft-com:office:office" xmlns:oel="http://schemas.microsoft.com/office/2019/extlst" xmlns:r="http://schemas.openxmlformats.org/officeDocument/2006/relationships" xmlns:m="http://schemas.openxmlformats.org/officeDocument/2006/math" xmlns:v="urn:schemas-microsoft-com:vml" xmlns:wp14="http://schemas.microsoft.com/office/word/2010/wordprocessingDrawing" xmlns:wp="http://schemas.openxmlformats.org/drawingml/2006/wordprocessingDrawing" xmlns:w10="urn:schemas-microsoft-com:office:word" xmlns:w="http://schemas.openxmlformats.org/wordprocessingml/2006/main" xmlns:w14="http://schemas.microsoft.com/office/word/2010/wordml" xmlns:w15="http://schemas.microsoft.com/office/word/2012/wordml" xmlns:w16cex="http://schemas.microsoft.com/office/word/2018/wordml/cex" xmlns:w16cid="http://schemas.microsoft.com/office/word/2016/wordml/cid" xmlns:w16="http://schemas.microsoft.com/office/word/2018/wordml" xmlns:w16du="http://schemas.microsoft.com/office/word/2023/wordml/word16du" xmlns:w16sdtdh="http://schemas.microsoft.com/office/word/2020/wordml/sdtdatahash" xmlns:w16se="http://schemas.microsoft.com/office/word/2015/wordml/symex" xmlns:wpg="http://schemas.microsoft.com/office/word/2010/wordprocessingGroup" xmlns:wpi="http://schemas.microsoft.com/office/word/2010/wordprocessingInk" xmlns:wne="http://schemas.microsoft.com/office/word/2006/wordml" xmlns:wps="http://schemas.microsoft.com/office/word/2010/wordprocessingShape" mc:Ignorable="w14 w15 w16se w16cid w16 w16cex w16sdtdh w16du wp14">
   <w:abstractNum w:abstractNumId="0" w15:restartNumberingAfterBreak="0">
+    <w:nsid w:val="0B2A74FA"/>
+    <w:multiLevelType w:val="multilevel"/>
+    <w:tmpl w:val="F6AA8280"/>
+    <w:lvl w:ilvl="0">
+      <w:start w:val="1"/>
+      <w:numFmt w:val="bullet"/>
+      <w:lvlText w:val=""/>
+      <w:lvlJc w:val="left"/>
+      <w:pPr>
+        <w:tabs>
+          <w:tab w:val="num" w:pos="720"/>
+        </w:tabs>
+        <w:ind w:left="720" w:hanging="360"/>
+      </w:pPr>
+      <w:rPr>
+        <w:rFonts w:ascii="Symbol" w:hAnsi="Symbol" w:hint="default"/>
+        <w:sz w:val="20"/>
+      </w:rPr>
+    </w:lvl>
+    <w:lvl w:ilvl="1" w:tentative="1">
+      <w:start w:val="1"/>
+      <w:numFmt w:val="bullet"/>
+      <w:lvlText w:val="o"/>
+      <w:lvlJc w:val="left"/>
+      <w:pPr>
+        <w:tabs>
+          <w:tab w:val="num" w:pos="1440"/>
+        </w:tabs>
+        <w:ind w:left="1440" w:hanging="360"/>
+      </w:pPr>
+      <w:rPr>
+        <w:rFonts w:ascii="Courier New" w:hAnsi="Courier New" w:hint="default"/>
+        <w:sz w:val="20"/>
+      </w:rPr>
+    </w:lvl>
+    <w:lvl w:ilvl="2" w:tentative="1">
+      <w:start w:val="1"/>
+      <w:numFmt w:val="bullet"/>
+      <w:lvlText w:val=""/>
+      <w:lvlJc w:val="left"/>
+      <w:pPr>
+        <w:tabs>
+          <w:tab w:val="num" w:pos="2160"/>
+        </w:tabs>
+        <w:ind w:left="2160" w:hanging="360"/>
+      </w:pPr>
+      <w:rPr>
+        <w:rFonts w:ascii="Wingdings" w:hAnsi="Wingdings" w:hint="default"/>
+        <w:sz w:val="20"/>
+      </w:rPr>
+    </w:lvl>
+    <w:lvl w:ilvl="3" w:tentative="1">
+      <w:start w:val="1"/>
+      <w:numFmt w:val="bullet"/>
+      <w:lvlText w:val=""/>
+      <w:lvlJc w:val="left"/>
+      <w:pPr>
+        <w:tabs>
+          <w:tab w:val="num" w:pos="2880"/>
+        </w:tabs>
+        <w:ind w:left="2880" w:hanging="360"/>
+      </w:pPr>
+      <w:rPr>
+        <w:rFonts w:ascii="Wingdings" w:hAnsi="Wingdings" w:hint="default"/>
+        <w:sz w:val="20"/>
+      </w:rPr>
+    </w:lvl>
+    <w:lvl w:ilvl="4" w:tentative="1">
+      <w:start w:val="1"/>
+      <w:numFmt w:val="bullet"/>
+      <w:lvlText w:val=""/>
+      <w:lvlJc w:val="left"/>
+      <w:pPr>
+        <w:tabs>
+          <w:tab w:val="num" w:pos="3600"/>
+        </w:tabs>
+        <w:ind w:left="3600" w:hanging="360"/>
+      </w:pPr>
+      <w:rPr>
+        <w:rFonts w:ascii="Wingdings" w:hAnsi="Wingdings" w:hint="default"/>
+        <w:sz w:val="20"/>
+      </w:rPr>
+    </w:lvl>
+    <w:lvl w:ilvl="5" w:tentative="1">
+      <w:start w:val="1"/>
+      <w:numFmt w:val="bullet"/>
+      <w:lvlText w:val=""/>
+      <w:lvlJc w:val="left"/>
+      <w:pPr>
+        <w:tabs>
+          <w:tab w:val="num" w:pos="4320"/>
+        </w:tabs>
+        <w:ind w:left="4320" w:hanging="360"/>
+      </w:pPr>
+      <w:rPr>
+        <w:rFonts w:ascii="Wingdings" w:hAnsi="Wingdings" w:hint="default"/>
+        <w:sz w:val="20"/>
+      </w:rPr>
+    </w:lvl>
+    <w:lvl w:ilvl="6" w:tentative="1">
+      <w:start w:val="1"/>
+      <w:numFmt w:val="bullet"/>
+      <w:lvlText w:val=""/>
+      <w:lvlJc w:val="left"/>
+      <w:pPr>
+        <w:tabs>
+          <w:tab w:val="num" w:pos="5040"/>
+        </w:tabs>
+        <w:ind w:left="5040" w:hanging="360"/>
+      </w:pPr>
+      <w:rPr>
+        <w:rFonts w:ascii="Wingdings" w:hAnsi="Wingdings" w:hint="default"/>
+        <w:sz w:val="20"/>
+      </w:rPr>
+    </w:lvl>
+    <w:lvl w:ilvl="7" w:tentative="1">
+      <w:start w:val="1"/>
+      <w:numFmt w:val="bullet"/>
+      <w:lvlText w:val=""/>
+      <w:lvlJc w:val="left"/>
+      <w:pPr>
+        <w:tabs>
+          <w:tab w:val="num" w:pos="5760"/>
+        </w:tabs>
+        <w:ind w:left="5760" w:hanging="360"/>
+      </w:pPr>
+      <w:rPr>
+        <w:rFonts w:ascii="Wingdings" w:hAnsi="Wingdings" w:hint="default"/>
+        <w:sz w:val="20"/>
+      </w:rPr>
+    </w:lvl>
+    <w:lvl w:ilvl="8" w:tentative="1">
+      <w:start w:val="1"/>
+      <w:numFmt w:val="bullet"/>
+      <w:lvlText w:val=""/>
+      <w:lvlJc w:val="left"/>
+      <w:pPr>
+        <w:tabs>
+          <w:tab w:val="num" w:pos="6480"/>
+        </w:tabs>
+        <w:ind w:left="6480" w:hanging="360"/>
+      </w:pPr>
+      <w:rPr>
+        <w:rFonts w:ascii="Wingdings" w:hAnsi="Wingdings" w:hint="default"/>
+        <w:sz w:val="20"/>
+      </w:rPr>
+    </w:lvl>
+  </w:abstractNum>
+  <w:abstractNum w:abstractNumId="1" w15:restartNumberingAfterBreak="0">
+    <w:nsid w:val="0E546081"/>
+    <w:multiLevelType w:val="multilevel"/>
+    <w:tmpl w:val="DF14B01A"/>
+    <w:lvl w:ilvl="0">
+      <w:start w:val="1"/>
+      <w:numFmt w:val="bullet"/>
+      <w:lvlText w:val=""/>
+      <w:lvlJc w:val="left"/>
+      <w:pPr>
+        <w:tabs>
+          <w:tab w:val="num" w:pos="720"/>
+        </w:tabs>
+        <w:ind w:left="720" w:hanging="360"/>
+      </w:pPr>
+      <w:rPr>
+        <w:rFonts w:ascii="Symbol" w:hAnsi="Symbol" w:hint="default"/>
+        <w:sz w:val="20"/>
+      </w:rPr>
+    </w:lvl>
+    <w:lvl w:ilvl="1" w:tentative="1">
+      <w:start w:val="1"/>
+      <w:numFmt w:val="bullet"/>
+      <w:lvlText w:val="o"/>
+      <w:lvlJc w:val="left"/>
+      <w:pPr>
+        <w:tabs>
+          <w:tab w:val="num" w:pos="1440"/>
+        </w:tabs>
+        <w:ind w:left="1440" w:hanging="360"/>
+      </w:pPr>
+      <w:rPr>
+        <w:rFonts w:ascii="Courier New" w:hAnsi="Courier New" w:hint="default"/>
+        <w:sz w:val="20"/>
+      </w:rPr>
+    </w:lvl>
+    <w:lvl w:ilvl="2" w:tentative="1">
+      <w:start w:val="1"/>
+      <w:numFmt w:val="bullet"/>
+      <w:lvlText w:val=""/>
+      <w:lvlJc w:val="left"/>
+      <w:pPr>
+        <w:tabs>
+          <w:tab w:val="num" w:pos="2160"/>
+        </w:tabs>
+        <w:ind w:left="2160" w:hanging="360"/>
+      </w:pPr>
+      <w:rPr>
+        <w:rFonts w:ascii="Wingdings" w:hAnsi="Wingdings" w:hint="default"/>
+        <w:sz w:val="20"/>
+      </w:rPr>
+    </w:lvl>
+    <w:lvl w:ilvl="3" w:tentative="1">
+      <w:start w:val="1"/>
+      <w:numFmt w:val="bullet"/>
+      <w:lvlText w:val=""/>
+      <w:lvlJc w:val="left"/>
+      <w:pPr>
+        <w:tabs>
+          <w:tab w:val="num" w:pos="2880"/>
+        </w:tabs>
+        <w:ind w:left="2880" w:hanging="360"/>
+      </w:pPr>
+      <w:rPr>
+        <w:rFonts w:ascii="Wingdings" w:hAnsi="Wingdings" w:hint="default"/>
+        <w:sz w:val="20"/>
+      </w:rPr>
+    </w:lvl>
+    <w:lvl w:ilvl="4" w:tentative="1">
+      <w:start w:val="1"/>
+      <w:numFmt w:val="bullet"/>
+      <w:lvlText w:val=""/>
+      <w:lvlJc w:val="left"/>
+      <w:pPr>
+        <w:tabs>
+          <w:tab w:val="num" w:pos="3600"/>
+        </w:tabs>
+        <w:ind w:left="3600" w:hanging="360"/>
+      </w:pPr>
+      <w:rPr>
+        <w:rFonts w:ascii="Wingdings" w:hAnsi="Wingdings" w:hint="default"/>
+        <w:sz w:val="20"/>
+      </w:rPr>
+    </w:lvl>
+    <w:lvl w:ilvl="5" w:tentative="1">
+      <w:start w:val="1"/>
+      <w:numFmt w:val="bullet"/>
+      <w:lvlText w:val=""/>
+      <w:lvlJc w:val="left"/>
+      <w:pPr>
+        <w:tabs>
+          <w:tab w:val="num" w:pos="4320"/>
+        </w:tabs>
+        <w:ind w:left="4320" w:hanging="360"/>
+      </w:pPr>
+      <w:rPr>
+        <w:rFonts w:ascii="Wingdings" w:hAnsi="Wingdings" w:hint="default"/>
+        <w:sz w:val="20"/>
+      </w:rPr>
+    </w:lvl>
+    <w:lvl w:ilvl="6" w:tentative="1">
+      <w:start w:val="1"/>
+      <w:numFmt w:val="bullet"/>
+      <w:lvlText w:val=""/>
+      <w:lvlJc w:val="left"/>
+      <w:pPr>
+        <w:tabs>
+          <w:tab w:val="num" w:pos="5040"/>
+        </w:tabs>
+        <w:ind w:left="5040" w:hanging="360"/>
+      </w:pPr>
+      <w:rPr>
+        <w:rFonts w:ascii="Wingdings" w:hAnsi="Wingdings" w:hint="default"/>
+        <w:sz w:val="20"/>
+      </w:rPr>
+    </w:lvl>
+    <w:lvl w:ilvl="7" w:tentative="1">
+      <w:start w:val="1"/>
+      <w:numFmt w:val="bullet"/>
+      <w:lvlText w:val=""/>
+      <w:lvlJc w:val="left"/>
+      <w:pPr>
+        <w:tabs>
+          <w:tab w:val="num" w:pos="5760"/>
+        </w:tabs>
+        <w:ind w:left="5760" w:hanging="360"/>
+      </w:pPr>
+      <w:rPr>
+        <w:rFonts w:ascii="Wingdings" w:hAnsi="Wingdings" w:hint="default"/>
+        <w:sz w:val="20"/>
+      </w:rPr>
+    </w:lvl>
+    <w:lvl w:ilvl="8" w:tentative="1">
+      <w:start w:val="1"/>
+      <w:numFmt w:val="bullet"/>
+      <w:lvlText w:val=""/>
+      <w:lvlJc w:val="left"/>
+      <w:pPr>
+        <w:tabs>
+          <w:tab w:val="num" w:pos="6480"/>
+        </w:tabs>
+        <w:ind w:left="6480" w:hanging="360"/>
+      </w:pPr>
+      <w:rPr>
+        <w:rFonts w:ascii="Wingdings" w:hAnsi="Wingdings" w:hint="default"/>
+        <w:sz w:val="20"/>
+      </w:rPr>
+    </w:lvl>
+  </w:abstractNum>
+  <w:abstractNum w:abstractNumId="2" w15:restartNumberingAfterBreak="0">
     <w:nsid w:val="198711E8"/>
     <w:multiLevelType w:val="multilevel"/>
     <w:tmpl w:val="4E36CD6E"/>
@@ -3311,7 +5452,7 @@
       </w:rPr>
     </w:lvl>
   </w:abstractNum>
-  <w:abstractNum w:abstractNumId="1" w15:restartNumberingAfterBreak="0">
+  <w:abstractNum w:abstractNumId="3" w15:restartNumberingAfterBreak="0">
     <w:nsid w:val="307B1D8C"/>
     <w:multiLevelType w:val="multilevel"/>
     <w:tmpl w:val="8E62B546"/>
@@ -3460,7 +5601,305 @@
       </w:rPr>
     </w:lvl>
   </w:abstractNum>
-  <w:abstractNum w:abstractNumId="2" w15:restartNumberingAfterBreak="0">
+  <w:abstractNum w:abstractNumId="4" w15:restartNumberingAfterBreak="0">
+    <w:nsid w:val="33766B52"/>
+    <w:multiLevelType w:val="multilevel"/>
+    <w:tmpl w:val="D74C36B2"/>
+    <w:lvl w:ilvl="0">
+      <w:start w:val="1"/>
+      <w:numFmt w:val="bullet"/>
+      <w:lvlText w:val=""/>
+      <w:lvlJc w:val="left"/>
+      <w:pPr>
+        <w:tabs>
+          <w:tab w:val="num" w:pos="720"/>
+        </w:tabs>
+        <w:ind w:left="720" w:hanging="360"/>
+      </w:pPr>
+      <w:rPr>
+        <w:rFonts w:ascii="Symbol" w:hAnsi="Symbol" w:hint="default"/>
+        <w:sz w:val="20"/>
+      </w:rPr>
+    </w:lvl>
+    <w:lvl w:ilvl="1" w:tentative="1">
+      <w:start w:val="1"/>
+      <w:numFmt w:val="bullet"/>
+      <w:lvlText w:val="o"/>
+      <w:lvlJc w:val="left"/>
+      <w:pPr>
+        <w:tabs>
+          <w:tab w:val="num" w:pos="1440"/>
+        </w:tabs>
+        <w:ind w:left="1440" w:hanging="360"/>
+      </w:pPr>
+      <w:rPr>
+        <w:rFonts w:ascii="Courier New" w:hAnsi="Courier New" w:hint="default"/>
+        <w:sz w:val="20"/>
+      </w:rPr>
+    </w:lvl>
+    <w:lvl w:ilvl="2" w:tentative="1">
+      <w:start w:val="1"/>
+      <w:numFmt w:val="bullet"/>
+      <w:lvlText w:val=""/>
+      <w:lvlJc w:val="left"/>
+      <w:pPr>
+        <w:tabs>
+          <w:tab w:val="num" w:pos="2160"/>
+        </w:tabs>
+        <w:ind w:left="2160" w:hanging="360"/>
+      </w:pPr>
+      <w:rPr>
+        <w:rFonts w:ascii="Wingdings" w:hAnsi="Wingdings" w:hint="default"/>
+        <w:sz w:val="20"/>
+      </w:rPr>
+    </w:lvl>
+    <w:lvl w:ilvl="3" w:tentative="1">
+      <w:start w:val="1"/>
+      <w:numFmt w:val="bullet"/>
+      <w:lvlText w:val=""/>
+      <w:lvlJc w:val="left"/>
+      <w:pPr>
+        <w:tabs>
+          <w:tab w:val="num" w:pos="2880"/>
+        </w:tabs>
+        <w:ind w:left="2880" w:hanging="360"/>
+      </w:pPr>
+      <w:rPr>
+        <w:rFonts w:ascii="Wingdings" w:hAnsi="Wingdings" w:hint="default"/>
+        <w:sz w:val="20"/>
+      </w:rPr>
+    </w:lvl>
+    <w:lvl w:ilvl="4" w:tentative="1">
+      <w:start w:val="1"/>
+      <w:numFmt w:val="bullet"/>
+      <w:lvlText w:val=""/>
+      <w:lvlJc w:val="left"/>
+      <w:pPr>
+        <w:tabs>
+          <w:tab w:val="num" w:pos="3600"/>
+        </w:tabs>
+        <w:ind w:left="3600" w:hanging="360"/>
+      </w:pPr>
+      <w:rPr>
+        <w:rFonts w:ascii="Wingdings" w:hAnsi="Wingdings" w:hint="default"/>
+        <w:sz w:val="20"/>
+      </w:rPr>
+    </w:lvl>
+    <w:lvl w:ilvl="5" w:tentative="1">
+      <w:start w:val="1"/>
+      <w:numFmt w:val="bullet"/>
+      <w:lvlText w:val=""/>
+      <w:lvlJc w:val="left"/>
+      <w:pPr>
+        <w:tabs>
+          <w:tab w:val="num" w:pos="4320"/>
+        </w:tabs>
+        <w:ind w:left="4320" w:hanging="360"/>
+      </w:pPr>
+      <w:rPr>
+        <w:rFonts w:ascii="Wingdings" w:hAnsi="Wingdings" w:hint="default"/>
+        <w:sz w:val="20"/>
+      </w:rPr>
+    </w:lvl>
+    <w:lvl w:ilvl="6" w:tentative="1">
+      <w:start w:val="1"/>
+      <w:numFmt w:val="bullet"/>
+      <w:lvlText w:val=""/>
+      <w:lvlJc w:val="left"/>
+      <w:pPr>
+        <w:tabs>
+          <w:tab w:val="num" w:pos="5040"/>
+        </w:tabs>
+        <w:ind w:left="5040" w:hanging="360"/>
+      </w:pPr>
+      <w:rPr>
+        <w:rFonts w:ascii="Wingdings" w:hAnsi="Wingdings" w:hint="default"/>
+        <w:sz w:val="20"/>
+      </w:rPr>
+    </w:lvl>
+    <w:lvl w:ilvl="7" w:tentative="1">
+      <w:start w:val="1"/>
+      <w:numFmt w:val="bullet"/>
+      <w:lvlText w:val=""/>
+      <w:lvlJc w:val="left"/>
+      <w:pPr>
+        <w:tabs>
+          <w:tab w:val="num" w:pos="5760"/>
+        </w:tabs>
+        <w:ind w:left="5760" w:hanging="360"/>
+      </w:pPr>
+      <w:rPr>
+        <w:rFonts w:ascii="Wingdings" w:hAnsi="Wingdings" w:hint="default"/>
+        <w:sz w:val="20"/>
+      </w:rPr>
+    </w:lvl>
+    <w:lvl w:ilvl="8" w:tentative="1">
+      <w:start w:val="1"/>
+      <w:numFmt w:val="bullet"/>
+      <w:lvlText w:val=""/>
+      <w:lvlJc w:val="left"/>
+      <w:pPr>
+        <w:tabs>
+          <w:tab w:val="num" w:pos="6480"/>
+        </w:tabs>
+        <w:ind w:left="6480" w:hanging="360"/>
+      </w:pPr>
+      <w:rPr>
+        <w:rFonts w:ascii="Wingdings" w:hAnsi="Wingdings" w:hint="default"/>
+        <w:sz w:val="20"/>
+      </w:rPr>
+    </w:lvl>
+  </w:abstractNum>
+  <w:abstractNum w:abstractNumId="5" w15:restartNumberingAfterBreak="0">
+    <w:nsid w:val="400F4338"/>
+    <w:multiLevelType w:val="multilevel"/>
+    <w:tmpl w:val="0A84AB7C"/>
+    <w:lvl w:ilvl="0">
+      <w:start w:val="1"/>
+      <w:numFmt w:val="bullet"/>
+      <w:lvlText w:val=""/>
+      <w:lvlJc w:val="left"/>
+      <w:pPr>
+        <w:tabs>
+          <w:tab w:val="num" w:pos="720"/>
+        </w:tabs>
+        <w:ind w:left="720" w:hanging="360"/>
+      </w:pPr>
+      <w:rPr>
+        <w:rFonts w:ascii="Symbol" w:hAnsi="Symbol" w:hint="default"/>
+        <w:sz w:val="20"/>
+      </w:rPr>
+    </w:lvl>
+    <w:lvl w:ilvl="1" w:tentative="1">
+      <w:start w:val="1"/>
+      <w:numFmt w:val="bullet"/>
+      <w:lvlText w:val="o"/>
+      <w:lvlJc w:val="left"/>
+      <w:pPr>
+        <w:tabs>
+          <w:tab w:val="num" w:pos="1440"/>
+        </w:tabs>
+        <w:ind w:left="1440" w:hanging="360"/>
+      </w:pPr>
+      <w:rPr>
+        <w:rFonts w:ascii="Courier New" w:hAnsi="Courier New" w:hint="default"/>
+        <w:sz w:val="20"/>
+      </w:rPr>
+    </w:lvl>
+    <w:lvl w:ilvl="2" w:tentative="1">
+      <w:start w:val="1"/>
+      <w:numFmt w:val="bullet"/>
+      <w:lvlText w:val=""/>
+      <w:lvlJc w:val="left"/>
+      <w:pPr>
+        <w:tabs>
+          <w:tab w:val="num" w:pos="2160"/>
+        </w:tabs>
+        <w:ind w:left="2160" w:hanging="360"/>
+      </w:pPr>
+      <w:rPr>
+        <w:rFonts w:ascii="Wingdings" w:hAnsi="Wingdings" w:hint="default"/>
+        <w:sz w:val="20"/>
+      </w:rPr>
+    </w:lvl>
+    <w:lvl w:ilvl="3" w:tentative="1">
+      <w:start w:val="1"/>
+      <w:numFmt w:val="bullet"/>
+      <w:lvlText w:val=""/>
+      <w:lvlJc w:val="left"/>
+      <w:pPr>
+        <w:tabs>
+          <w:tab w:val="num" w:pos="2880"/>
+        </w:tabs>
+        <w:ind w:left="2880" w:hanging="360"/>
+      </w:pPr>
+      <w:rPr>
+        <w:rFonts w:ascii="Wingdings" w:hAnsi="Wingdings" w:hint="default"/>
+        <w:sz w:val="20"/>
+      </w:rPr>
+    </w:lvl>
+    <w:lvl w:ilvl="4" w:tentative="1">
+      <w:start w:val="1"/>
+      <w:numFmt w:val="bullet"/>
+      <w:lvlText w:val=""/>
+      <w:lvlJc w:val="left"/>
+      <w:pPr>
+        <w:tabs>
+          <w:tab w:val="num" w:pos="3600"/>
+        </w:tabs>
+        <w:ind w:left="3600" w:hanging="360"/>
+      </w:pPr>
+      <w:rPr>
+        <w:rFonts w:ascii="Wingdings" w:hAnsi="Wingdings" w:hint="default"/>
+        <w:sz w:val="20"/>
+      </w:rPr>
+    </w:lvl>
+    <w:lvl w:ilvl="5" w:tentative="1">
+      <w:start w:val="1"/>
+      <w:numFmt w:val="bullet"/>
+      <w:lvlText w:val=""/>
+      <w:lvlJc w:val="left"/>
+      <w:pPr>
+        <w:tabs>
+          <w:tab w:val="num" w:pos="4320"/>
+        </w:tabs>
+        <w:ind w:left="4320" w:hanging="360"/>
+      </w:pPr>
+      <w:rPr>
+        <w:rFonts w:ascii="Wingdings" w:hAnsi="Wingdings" w:hint="default"/>
+        <w:sz w:val="20"/>
+      </w:rPr>
+    </w:lvl>
+    <w:lvl w:ilvl="6" w:tentative="1">
+      <w:start w:val="1"/>
+      <w:numFmt w:val="bullet"/>
+      <w:lvlText w:val=""/>
+      <w:lvlJc w:val="left"/>
+      <w:pPr>
+        <w:tabs>
+          <w:tab w:val="num" w:pos="5040"/>
+        </w:tabs>
+        <w:ind w:left="5040" w:hanging="360"/>
+      </w:pPr>
+      <w:rPr>
+        <w:rFonts w:ascii="Wingdings" w:hAnsi="Wingdings" w:hint="default"/>
+        <w:sz w:val="20"/>
+      </w:rPr>
+    </w:lvl>
+    <w:lvl w:ilvl="7" w:tentative="1">
+      <w:start w:val="1"/>
+      <w:numFmt w:val="bullet"/>
+      <w:lvlText w:val=""/>
+      <w:lvlJc w:val="left"/>
+      <w:pPr>
+        <w:tabs>
+          <w:tab w:val="num" w:pos="5760"/>
+        </w:tabs>
+        <w:ind w:left="5760" w:hanging="360"/>
+      </w:pPr>
+      <w:rPr>
+        <w:rFonts w:ascii="Wingdings" w:hAnsi="Wingdings" w:hint="default"/>
+        <w:sz w:val="20"/>
+      </w:rPr>
+    </w:lvl>
+    <w:lvl w:ilvl="8" w:tentative="1">
+      <w:start w:val="1"/>
+      <w:numFmt w:val="bullet"/>
+      <w:lvlText w:val=""/>
+      <w:lvlJc w:val="left"/>
+      <w:pPr>
+        <w:tabs>
+          <w:tab w:val="num" w:pos="6480"/>
+        </w:tabs>
+        <w:ind w:left="6480" w:hanging="360"/>
+      </w:pPr>
+      <w:rPr>
+        <w:rFonts w:ascii="Wingdings" w:hAnsi="Wingdings" w:hint="default"/>
+        <w:sz w:val="20"/>
+      </w:rPr>
+    </w:lvl>
+  </w:abstractNum>
+  <w:abstractNum w:abstractNumId="6" w15:restartNumberingAfterBreak="0">
     <w:nsid w:val="46EC7E1D"/>
     <w:multiLevelType w:val="multilevel"/>
     <w:tmpl w:val="F8B8647A"/>
@@ -3609,7 +6048,7 @@
       </w:rPr>
     </w:lvl>
   </w:abstractNum>
-  <w:abstractNum w:abstractNumId="3" w15:restartNumberingAfterBreak="0">
+  <w:abstractNum w:abstractNumId="7" w15:restartNumberingAfterBreak="0">
     <w:nsid w:val="583A5E92"/>
     <w:multiLevelType w:val="multilevel"/>
     <w:tmpl w:val="B0A8930E"/>
@@ -3758,17 +6197,449 @@
       </w:rPr>
     </w:lvl>
   </w:abstractNum>
+  <w:abstractNum w:abstractNumId="8" w15:restartNumberingAfterBreak="0">
+    <w:nsid w:val="59C92DFD"/>
+    <w:multiLevelType w:val="multilevel"/>
+    <w:tmpl w:val="0C72DB2E"/>
+    <w:lvl w:ilvl="0">
+      <w:start w:val="1"/>
+      <w:numFmt w:val="decimal"/>
+      <w:lvlText w:val="%1."/>
+      <w:lvlJc w:val="left"/>
+      <w:pPr>
+        <w:tabs>
+          <w:tab w:val="num" w:pos="720"/>
+        </w:tabs>
+        <w:ind w:left="720" w:hanging="360"/>
+      </w:pPr>
+    </w:lvl>
+    <w:lvl w:ilvl="1" w:tentative="1">
+      <w:start w:val="1"/>
+      <w:numFmt w:val="decimal"/>
+      <w:lvlText w:val="%2."/>
+      <w:lvlJc w:val="left"/>
+      <w:pPr>
+        <w:tabs>
+          <w:tab w:val="num" w:pos="1440"/>
+        </w:tabs>
+        <w:ind w:left="1440" w:hanging="360"/>
+      </w:pPr>
+    </w:lvl>
+    <w:lvl w:ilvl="2" w:tentative="1">
+      <w:start w:val="1"/>
+      <w:numFmt w:val="decimal"/>
+      <w:lvlText w:val="%3."/>
+      <w:lvlJc w:val="left"/>
+      <w:pPr>
+        <w:tabs>
+          <w:tab w:val="num" w:pos="2160"/>
+        </w:tabs>
+        <w:ind w:left="2160" w:hanging="360"/>
+      </w:pPr>
+    </w:lvl>
+    <w:lvl w:ilvl="3" w:tentative="1">
+      <w:start w:val="1"/>
+      <w:numFmt w:val="decimal"/>
+      <w:lvlText w:val="%4."/>
+      <w:lvlJc w:val="left"/>
+      <w:pPr>
+        <w:tabs>
+          <w:tab w:val="num" w:pos="2880"/>
+        </w:tabs>
+        <w:ind w:left="2880" w:hanging="360"/>
+      </w:pPr>
+    </w:lvl>
+    <w:lvl w:ilvl="4" w:tentative="1">
+      <w:start w:val="1"/>
+      <w:numFmt w:val="decimal"/>
+      <w:lvlText w:val="%5."/>
+      <w:lvlJc w:val="left"/>
+      <w:pPr>
+        <w:tabs>
+          <w:tab w:val="num" w:pos="3600"/>
+        </w:tabs>
+        <w:ind w:left="3600" w:hanging="360"/>
+      </w:pPr>
+    </w:lvl>
+    <w:lvl w:ilvl="5" w:tentative="1">
+      <w:start w:val="1"/>
+      <w:numFmt w:val="decimal"/>
+      <w:lvlText w:val="%6."/>
+      <w:lvlJc w:val="left"/>
+      <w:pPr>
+        <w:tabs>
+          <w:tab w:val="num" w:pos="4320"/>
+        </w:tabs>
+        <w:ind w:left="4320" w:hanging="360"/>
+      </w:pPr>
+    </w:lvl>
+    <w:lvl w:ilvl="6" w:tentative="1">
+      <w:start w:val="1"/>
+      <w:numFmt w:val="decimal"/>
+      <w:lvlText w:val="%7."/>
+      <w:lvlJc w:val="left"/>
+      <w:pPr>
+        <w:tabs>
+          <w:tab w:val="num" w:pos="5040"/>
+        </w:tabs>
+        <w:ind w:left="5040" w:hanging="360"/>
+      </w:pPr>
+    </w:lvl>
+    <w:lvl w:ilvl="7" w:tentative="1">
+      <w:start w:val="1"/>
+      <w:numFmt w:val="decimal"/>
+      <w:lvlText w:val="%8."/>
+      <w:lvlJc w:val="left"/>
+      <w:pPr>
+        <w:tabs>
+          <w:tab w:val="num" w:pos="5760"/>
+        </w:tabs>
+        <w:ind w:left="5760" w:hanging="360"/>
+      </w:pPr>
+    </w:lvl>
+    <w:lvl w:ilvl="8" w:tentative="1">
+      <w:start w:val="1"/>
+      <w:numFmt w:val="decimal"/>
+      <w:lvlText w:val="%9."/>
+      <w:lvlJc w:val="left"/>
+      <w:pPr>
+        <w:tabs>
+          <w:tab w:val="num" w:pos="6480"/>
+        </w:tabs>
+        <w:ind w:left="6480" w:hanging="360"/>
+      </w:pPr>
+    </w:lvl>
+  </w:abstractNum>
+  <w:abstractNum w:abstractNumId="9" w15:restartNumberingAfterBreak="0">
+    <w:nsid w:val="65EE1553"/>
+    <w:multiLevelType w:val="multilevel"/>
+    <w:tmpl w:val="84D8D260"/>
+    <w:lvl w:ilvl="0">
+      <w:start w:val="1"/>
+      <w:numFmt w:val="bullet"/>
+      <w:lvlText w:val=""/>
+      <w:lvlJc w:val="left"/>
+      <w:pPr>
+        <w:tabs>
+          <w:tab w:val="num" w:pos="720"/>
+        </w:tabs>
+        <w:ind w:left="720" w:hanging="360"/>
+      </w:pPr>
+      <w:rPr>
+        <w:rFonts w:ascii="Symbol" w:hAnsi="Symbol" w:hint="default"/>
+        <w:sz w:val="20"/>
+      </w:rPr>
+    </w:lvl>
+    <w:lvl w:ilvl="1" w:tentative="1">
+      <w:start w:val="1"/>
+      <w:numFmt w:val="bullet"/>
+      <w:lvlText w:val="o"/>
+      <w:lvlJc w:val="left"/>
+      <w:pPr>
+        <w:tabs>
+          <w:tab w:val="num" w:pos="1440"/>
+        </w:tabs>
+        <w:ind w:left="1440" w:hanging="360"/>
+      </w:pPr>
+      <w:rPr>
+        <w:rFonts w:ascii="Courier New" w:hAnsi="Courier New" w:hint="default"/>
+        <w:sz w:val="20"/>
+      </w:rPr>
+    </w:lvl>
+    <w:lvl w:ilvl="2" w:tentative="1">
+      <w:start w:val="1"/>
+      <w:numFmt w:val="bullet"/>
+      <w:lvlText w:val=""/>
+      <w:lvlJc w:val="left"/>
+      <w:pPr>
+        <w:tabs>
+          <w:tab w:val="num" w:pos="2160"/>
+        </w:tabs>
+        <w:ind w:left="2160" w:hanging="360"/>
+      </w:pPr>
+      <w:rPr>
+        <w:rFonts w:ascii="Wingdings" w:hAnsi="Wingdings" w:hint="default"/>
+        <w:sz w:val="20"/>
+      </w:rPr>
+    </w:lvl>
+    <w:lvl w:ilvl="3" w:tentative="1">
+      <w:start w:val="1"/>
+      <w:numFmt w:val="bullet"/>
+      <w:lvlText w:val=""/>
+      <w:lvlJc w:val="left"/>
+      <w:pPr>
+        <w:tabs>
+          <w:tab w:val="num" w:pos="2880"/>
+        </w:tabs>
+        <w:ind w:left="2880" w:hanging="360"/>
+      </w:pPr>
+      <w:rPr>
+        <w:rFonts w:ascii="Wingdings" w:hAnsi="Wingdings" w:hint="default"/>
+        <w:sz w:val="20"/>
+      </w:rPr>
+    </w:lvl>
+    <w:lvl w:ilvl="4" w:tentative="1">
+      <w:start w:val="1"/>
+      <w:numFmt w:val="bullet"/>
+      <w:lvlText w:val=""/>
+      <w:lvlJc w:val="left"/>
+      <w:pPr>
+        <w:tabs>
+          <w:tab w:val="num" w:pos="3600"/>
+        </w:tabs>
+        <w:ind w:left="3600" w:hanging="360"/>
+      </w:pPr>
+      <w:rPr>
+        <w:rFonts w:ascii="Wingdings" w:hAnsi="Wingdings" w:hint="default"/>
+        <w:sz w:val="20"/>
+      </w:rPr>
+    </w:lvl>
+    <w:lvl w:ilvl="5" w:tentative="1">
+      <w:start w:val="1"/>
+      <w:numFmt w:val="bullet"/>
+      <w:lvlText w:val=""/>
+      <w:lvlJc w:val="left"/>
+      <w:pPr>
+        <w:tabs>
+          <w:tab w:val="num" w:pos="4320"/>
+        </w:tabs>
+        <w:ind w:left="4320" w:hanging="360"/>
+      </w:pPr>
+      <w:rPr>
+        <w:rFonts w:ascii="Wingdings" w:hAnsi="Wingdings" w:hint="default"/>
+        <w:sz w:val="20"/>
+      </w:rPr>
+    </w:lvl>
+    <w:lvl w:ilvl="6" w:tentative="1">
+      <w:start w:val="1"/>
+      <w:numFmt w:val="bullet"/>
+      <w:lvlText w:val=""/>
+      <w:lvlJc w:val="left"/>
+      <w:pPr>
+        <w:tabs>
+          <w:tab w:val="num" w:pos="5040"/>
+        </w:tabs>
+        <w:ind w:left="5040" w:hanging="360"/>
+      </w:pPr>
+      <w:rPr>
+        <w:rFonts w:ascii="Wingdings" w:hAnsi="Wingdings" w:hint="default"/>
+        <w:sz w:val="20"/>
+      </w:rPr>
+    </w:lvl>
+    <w:lvl w:ilvl="7" w:tentative="1">
+      <w:start w:val="1"/>
+      <w:numFmt w:val="bullet"/>
+      <w:lvlText w:val=""/>
+      <w:lvlJc w:val="left"/>
+      <w:pPr>
+        <w:tabs>
+          <w:tab w:val="num" w:pos="5760"/>
+        </w:tabs>
+        <w:ind w:left="5760" w:hanging="360"/>
+      </w:pPr>
+      <w:rPr>
+        <w:rFonts w:ascii="Wingdings" w:hAnsi="Wingdings" w:hint="default"/>
+        <w:sz w:val="20"/>
+      </w:rPr>
+    </w:lvl>
+    <w:lvl w:ilvl="8" w:tentative="1">
+      <w:start w:val="1"/>
+      <w:numFmt w:val="bullet"/>
+      <w:lvlText w:val=""/>
+      <w:lvlJc w:val="left"/>
+      <w:pPr>
+        <w:tabs>
+          <w:tab w:val="num" w:pos="6480"/>
+        </w:tabs>
+        <w:ind w:left="6480" w:hanging="360"/>
+      </w:pPr>
+      <w:rPr>
+        <w:rFonts w:ascii="Wingdings" w:hAnsi="Wingdings" w:hint="default"/>
+        <w:sz w:val="20"/>
+      </w:rPr>
+    </w:lvl>
+  </w:abstractNum>
+  <w:abstractNum w:abstractNumId="10" w15:restartNumberingAfterBreak="0">
+    <w:nsid w:val="70C0357A"/>
+    <w:multiLevelType w:val="multilevel"/>
+    <w:tmpl w:val="8B40AC02"/>
+    <w:lvl w:ilvl="0">
+      <w:start w:val="1"/>
+      <w:numFmt w:val="bullet"/>
+      <w:lvlText w:val=""/>
+      <w:lvlJc w:val="left"/>
+      <w:pPr>
+        <w:tabs>
+          <w:tab w:val="num" w:pos="720"/>
+        </w:tabs>
+        <w:ind w:left="720" w:hanging="360"/>
+      </w:pPr>
+      <w:rPr>
+        <w:rFonts w:ascii="Symbol" w:hAnsi="Symbol" w:hint="default"/>
+        <w:sz w:val="20"/>
+      </w:rPr>
+    </w:lvl>
+    <w:lvl w:ilvl="1" w:tentative="1">
+      <w:start w:val="1"/>
+      <w:numFmt w:val="bullet"/>
+      <w:lvlText w:val="o"/>
+      <w:lvlJc w:val="left"/>
+      <w:pPr>
+        <w:tabs>
+          <w:tab w:val="num" w:pos="1440"/>
+        </w:tabs>
+        <w:ind w:left="1440" w:hanging="360"/>
+      </w:pPr>
+      <w:rPr>
+        <w:rFonts w:ascii="Courier New" w:hAnsi="Courier New" w:hint="default"/>
+        <w:sz w:val="20"/>
+      </w:rPr>
+    </w:lvl>
+    <w:lvl w:ilvl="2" w:tentative="1">
+      <w:start w:val="1"/>
+      <w:numFmt w:val="bullet"/>
+      <w:lvlText w:val=""/>
+      <w:lvlJc w:val="left"/>
+      <w:pPr>
+        <w:tabs>
+          <w:tab w:val="num" w:pos="2160"/>
+        </w:tabs>
+        <w:ind w:left="2160" w:hanging="360"/>
+      </w:pPr>
+      <w:rPr>
+        <w:rFonts w:ascii="Wingdings" w:hAnsi="Wingdings" w:hint="default"/>
+        <w:sz w:val="20"/>
+      </w:rPr>
+    </w:lvl>
+    <w:lvl w:ilvl="3" w:tentative="1">
+      <w:start w:val="1"/>
+      <w:numFmt w:val="bullet"/>
+      <w:lvlText w:val=""/>
+      <w:lvlJc w:val="left"/>
+      <w:pPr>
+        <w:tabs>
+          <w:tab w:val="num" w:pos="2880"/>
+        </w:tabs>
+        <w:ind w:left="2880" w:hanging="360"/>
+      </w:pPr>
+      <w:rPr>
+        <w:rFonts w:ascii="Wingdings" w:hAnsi="Wingdings" w:hint="default"/>
+        <w:sz w:val="20"/>
+      </w:rPr>
+    </w:lvl>
+    <w:lvl w:ilvl="4" w:tentative="1">
+      <w:start w:val="1"/>
+      <w:numFmt w:val="bullet"/>
+      <w:lvlText w:val=""/>
+      <w:lvlJc w:val="left"/>
+      <w:pPr>
+        <w:tabs>
+          <w:tab w:val="num" w:pos="3600"/>
+        </w:tabs>
+        <w:ind w:left="3600" w:hanging="360"/>
+      </w:pPr>
+      <w:rPr>
+        <w:rFonts w:ascii="Wingdings" w:hAnsi="Wingdings" w:hint="default"/>
+        <w:sz w:val="20"/>
+      </w:rPr>
+    </w:lvl>
+    <w:lvl w:ilvl="5" w:tentative="1">
+      <w:start w:val="1"/>
+      <w:numFmt w:val="bullet"/>
+      <w:lvlText w:val=""/>
+      <w:lvlJc w:val="left"/>
+      <w:pPr>
+        <w:tabs>
+          <w:tab w:val="num" w:pos="4320"/>
+        </w:tabs>
+        <w:ind w:left="4320" w:hanging="360"/>
+      </w:pPr>
+      <w:rPr>
+        <w:rFonts w:ascii="Wingdings" w:hAnsi="Wingdings" w:hint="default"/>
+        <w:sz w:val="20"/>
+      </w:rPr>
+    </w:lvl>
+    <w:lvl w:ilvl="6" w:tentative="1">
+      <w:start w:val="1"/>
+      <w:numFmt w:val="bullet"/>
+      <w:lvlText w:val=""/>
+      <w:lvlJc w:val="left"/>
+      <w:pPr>
+        <w:tabs>
+          <w:tab w:val="num" w:pos="5040"/>
+        </w:tabs>
+        <w:ind w:left="5040" w:hanging="360"/>
+      </w:pPr>
+      <w:rPr>
+        <w:rFonts w:ascii="Wingdings" w:hAnsi="Wingdings" w:hint="default"/>
+        <w:sz w:val="20"/>
+      </w:rPr>
+    </w:lvl>
+    <w:lvl w:ilvl="7" w:tentative="1">
+      <w:start w:val="1"/>
+      <w:numFmt w:val="bullet"/>
+      <w:lvlText w:val=""/>
+      <w:lvlJc w:val="left"/>
+      <w:pPr>
+        <w:tabs>
+          <w:tab w:val="num" w:pos="5760"/>
+        </w:tabs>
+        <w:ind w:left="5760" w:hanging="360"/>
+      </w:pPr>
+      <w:rPr>
+        <w:rFonts w:ascii="Wingdings" w:hAnsi="Wingdings" w:hint="default"/>
+        <w:sz w:val="20"/>
+      </w:rPr>
+    </w:lvl>
+    <w:lvl w:ilvl="8" w:tentative="1">
+      <w:start w:val="1"/>
+      <w:numFmt w:val="bullet"/>
+      <w:lvlText w:val=""/>
+      <w:lvlJc w:val="left"/>
+      <w:pPr>
+        <w:tabs>
+          <w:tab w:val="num" w:pos="6480"/>
+        </w:tabs>
+        <w:ind w:left="6480" w:hanging="360"/>
+      </w:pPr>
+      <w:rPr>
+        <w:rFonts w:ascii="Wingdings" w:hAnsi="Wingdings" w:hint="default"/>
+        <w:sz w:val="20"/>
+      </w:rPr>
+    </w:lvl>
+  </w:abstractNum>
   <w:num w:numId="1" w16cid:durableId="172304416">
+    <w:abstractNumId w:val="7"/>
+  </w:num>
+  <w:num w:numId="2" w16cid:durableId="1295989334">
+    <w:abstractNumId w:val="2"/>
+  </w:num>
+  <w:num w:numId="3" w16cid:durableId="1527132909">
     <w:abstractNumId w:val="3"/>
   </w:num>
-  <w:num w:numId="2" w16cid:durableId="1295989334">
+  <w:num w:numId="4" w16cid:durableId="174347943">
+    <w:abstractNumId w:val="6"/>
+  </w:num>
+  <w:num w:numId="5" w16cid:durableId="1769229952">
+    <w:abstractNumId w:val="4"/>
+  </w:num>
+  <w:num w:numId="6" w16cid:durableId="674183752">
+    <w:abstractNumId w:val="10"/>
+  </w:num>
+  <w:num w:numId="7" w16cid:durableId="1069351333">
+    <w:abstractNumId w:val="1"/>
+  </w:num>
+  <w:num w:numId="8" w16cid:durableId="437675310">
+    <w:abstractNumId w:val="5"/>
+  </w:num>
+  <w:num w:numId="9" w16cid:durableId="474838477">
+    <w:abstractNumId w:val="9"/>
+  </w:num>
+  <w:num w:numId="10" w16cid:durableId="1951933000">
     <w:abstractNumId w:val="0"/>
   </w:num>
-  <w:num w:numId="3" w16cid:durableId="1527132909">
-    <w:abstractNumId w:val="1"/>
-  </w:num>
-  <w:num w:numId="4" w16cid:durableId="174347943">
-    <w:abstractNumId w:val="2"/>
+  <w:num w:numId="11" w16cid:durableId="1982340444">
+    <w:abstractNumId w:val="8"/>
   </w:num>
 </w:numbering>
 </file>
@@ -4175,7 +7046,6 @@
   <w:style w:type="character" w:default="1" w:styleId="a0">
     <w:name w:val="Default Paragraph Font"/>
     <w:uiPriority w:val="1"/>
-    <w:semiHidden/>
     <w:unhideWhenUsed/>
   </w:style>
   <w:style w:type="table" w:default="1" w:styleId="a1">

</xml_diff>

<commit_message>
feat: finished all three games
</commit_message>
<xml_diff>
--- a/Assets/project/Dokumentationen/dokumentation TicTacTo.docx
+++ b/Assets/project/Dokumentationen/dokumentation TicTacTo.docx
@@ -804,37 +804,21 @@
         <w:rPr>
           <w:lang w:val="en-US"/>
         </w:rPr>
-        <w:t xml:space="preserve">│ + bombButtonPlayer1: </w:t>
-      </w:r>
-      <w:proofErr w:type="gramStart"/>
-      <w:r>
-        <w:rPr>
-          <w:lang w:val="en-US"/>
-        </w:rPr>
-        <w:t>Button  │</w:t>
-      </w:r>
-      <w:proofErr w:type="gramEnd"/>
-    </w:p>
-    <w:p>
-      <w:pPr>
-        <w:rPr>
-          <w:lang w:val="en-US"/>
-        </w:rPr>
-      </w:pPr>
-      <w:r>
-        <w:rPr>
-          <w:lang w:val="en-US"/>
-        </w:rPr>
-        <w:t xml:space="preserve">│ + bombButtonPlayer2: </w:t>
-      </w:r>
-      <w:proofErr w:type="gramStart"/>
-      <w:r>
-        <w:rPr>
-          <w:lang w:val="en-US"/>
-        </w:rPr>
-        <w:t>Button  │</w:t>
-      </w:r>
-      <w:proofErr w:type="gramEnd"/>
+        <w:t>│ + bombButtonPlayer1: Button  │</w:t>
+      </w:r>
+    </w:p>
+    <w:p>
+      <w:pPr>
+        <w:rPr>
+          <w:lang w:val="en-US"/>
+        </w:rPr>
+      </w:pPr>
+      <w:r>
+        <w:rPr>
+          <w:lang w:val="en-US"/>
+        </w:rPr>
+        <w:t>│ + bombButtonPlayer2: Button  │</w:t>
+      </w:r>
     </w:p>
     <w:p>
       <w:pPr>
@@ -849,7 +833,6 @@
         <w:t xml:space="preserve">│ + featureButtonsPlayer1: </w:t>
       </w:r>
       <w:proofErr w:type="spellStart"/>
-      <w:proofErr w:type="gramStart"/>
       <w:r>
         <w:rPr>
           <w:lang w:val="en-US"/>
@@ -861,14 +844,7 @@
         <w:rPr>
           <w:lang w:val="en-US"/>
         </w:rPr>
-        <w:t>[</w:t>
-      </w:r>
-      <w:proofErr w:type="gramEnd"/>
-      <w:r>
-        <w:rPr>
-          <w:lang w:val="en-US"/>
-        </w:rPr>
-        <w:t>]│</w:t>
+        <w:t>[]│</w:t>
       </w:r>
     </w:p>
     <w:p>
@@ -884,7 +860,6 @@
         <w:t xml:space="preserve">│ + featureButtonsPlayer2: </w:t>
       </w:r>
       <w:proofErr w:type="spellStart"/>
-      <w:proofErr w:type="gramStart"/>
       <w:r>
         <w:rPr>
           <w:lang w:val="en-US"/>
@@ -896,14 +871,7 @@
         <w:rPr>
           <w:lang w:val="en-US"/>
         </w:rPr>
-        <w:t>[</w:t>
-      </w:r>
-      <w:proofErr w:type="gramEnd"/>
-      <w:r>
-        <w:rPr>
-          <w:lang w:val="en-US"/>
-        </w:rPr>
-        <w:t>]│</w:t>
+        <w:t>[]│</w:t>
       </w:r>
     </w:p>
     <w:p>
@@ -930,21 +898,263 @@
         <w:rPr>
           <w:lang w:val="en-US"/>
         </w:rPr>
+        <w:t>: FieldButton[]│</w:t>
+      </w:r>
+    </w:p>
+    <w:p>
+      <w:pPr>
+        <w:rPr>
+          <w:lang w:val="en-US"/>
+        </w:rPr>
+      </w:pPr>
+      <w:r>
+        <w:rPr>
+          <w:lang w:val="en-US"/>
+        </w:rPr>
+        <w:t>│                               │</w:t>
+      </w:r>
+    </w:p>
+    <w:p>
+      <w:pPr>
+        <w:rPr>
+          <w:lang w:val="en-US"/>
+        </w:rPr>
+      </w:pPr>
+      <w:r>
+        <w:rPr>
+          <w:lang w:val="en-US"/>
+        </w:rPr>
+        <w:t xml:space="preserve">│ - </w:t>
+      </w:r>
+      <w:proofErr w:type="spellStart"/>
+      <w:r>
+        <w:rPr>
+          <w:lang w:val="en-US"/>
+        </w:rPr>
+        <w:t>currentPlayer</w:t>
+      </w:r>
+      <w:proofErr w:type="spellEnd"/>
+      <w:r>
+        <w:rPr>
+          <w:lang w:val="en-US"/>
+        </w:rPr>
+        <w:t>: int          │</w:t>
+      </w:r>
+    </w:p>
+    <w:p>
+      <w:pPr>
+        <w:rPr>
+          <w:lang w:val="en-US"/>
+        </w:rPr>
+      </w:pPr>
+      <w:r>
+        <w:rPr>
+          <w:lang w:val="en-US"/>
+        </w:rPr>
+        <w:t xml:space="preserve">│ - </w:t>
+      </w:r>
+      <w:proofErr w:type="spellStart"/>
+      <w:r>
+        <w:rPr>
+          <w:lang w:val="en-US"/>
+        </w:rPr>
+        <w:t>gameEnded</w:t>
+      </w:r>
+      <w:proofErr w:type="spellEnd"/>
+      <w:r>
+        <w:rPr>
+          <w:lang w:val="en-US"/>
+        </w:rPr>
+        <w:t>: bool             │</w:t>
+      </w:r>
+    </w:p>
+    <w:p>
+      <w:pPr>
+        <w:rPr>
+          <w:lang w:val="en-US"/>
+        </w:rPr>
+      </w:pPr>
+      <w:r>
+        <w:rPr>
+          <w:lang w:val="en-US"/>
+        </w:rPr>
+        <w:t xml:space="preserve">│ - </w:t>
+      </w:r>
+      <w:proofErr w:type="spellStart"/>
+      <w:r>
+        <w:rPr>
+          <w:lang w:val="en-US"/>
+        </w:rPr>
+        <w:t>gameStarted</w:t>
+      </w:r>
+      <w:proofErr w:type="spellEnd"/>
+      <w:r>
+        <w:rPr>
+          <w:lang w:val="en-US"/>
+        </w:rPr>
+        <w:t>: bool           │</w:t>
+      </w:r>
+    </w:p>
+    <w:p>
+      <w:pPr>
+        <w:rPr>
+          <w:lang w:val="en-US"/>
+        </w:rPr>
+      </w:pPr>
+      <w:r>
+        <w:rPr>
+          <w:lang w:val="en-US"/>
+        </w:rPr>
+        <w:t>│                               │</w:t>
+      </w:r>
+    </w:p>
+    <w:p>
+      <w:pPr>
+        <w:rPr>
+          <w:lang w:val="en-US"/>
+        </w:rPr>
+      </w:pPr>
+      <w:r>
+        <w:rPr>
+          <w:lang w:val="en-US"/>
+        </w:rPr>
+        <w:t xml:space="preserve">│ - </w:t>
+      </w:r>
+      <w:proofErr w:type="spellStart"/>
+      <w:r>
+        <w:rPr>
+          <w:lang w:val="en-US"/>
+        </w:rPr>
+        <w:t>activeFeature</w:t>
+      </w:r>
+      <w:proofErr w:type="spellEnd"/>
+      <w:r>
+        <w:rPr>
+          <w:lang w:val="en-US"/>
+        </w:rPr>
         <w:t xml:space="preserve">: </w:t>
       </w:r>
-      <w:proofErr w:type="gramStart"/>
-      <w:r>
-        <w:rPr>
-          <w:lang w:val="en-US"/>
-        </w:rPr>
-        <w:t>FieldButton[</w:t>
-      </w:r>
-      <w:proofErr w:type="gramEnd"/>
-      <w:r>
-        <w:rPr>
-          <w:lang w:val="en-US"/>
-        </w:rPr>
-        <w:t>]│</w:t>
+      <w:proofErr w:type="spellStart"/>
+      <w:r>
+        <w:rPr>
+          <w:lang w:val="en-US"/>
+        </w:rPr>
+        <w:t>FeatureType</w:t>
+      </w:r>
+      <w:proofErr w:type="spellEnd"/>
+      <w:r>
+        <w:rPr>
+          <w:lang w:val="en-US"/>
+        </w:rPr>
+        <w:t>? │</w:t>
+      </w:r>
+    </w:p>
+    <w:p>
+      <w:pPr>
+        <w:rPr>
+          <w:lang w:val="en-US"/>
+        </w:rPr>
+      </w:pPr>
+      <w:r>
+        <w:rPr>
+          <w:lang w:val="en-US"/>
+        </w:rPr>
+        <w:t xml:space="preserve">│ - </w:t>
+      </w:r>
+      <w:proofErr w:type="spellStart"/>
+      <w:r>
+        <w:rPr>
+          <w:lang w:val="en-US"/>
+        </w:rPr>
+        <w:t>extraTurnsRemaining</w:t>
+      </w:r>
+      <w:proofErr w:type="spellEnd"/>
+      <w:r>
+        <w:rPr>
+          <w:lang w:val="en-US"/>
+        </w:rPr>
+        <w:t>: int    │</w:t>
+      </w:r>
+    </w:p>
+    <w:p>
+      <w:pPr>
+        <w:rPr>
+          <w:lang w:val="en-US"/>
+        </w:rPr>
+      </w:pPr>
+      <w:r>
+        <w:rPr>
+          <w:lang w:val="en-US"/>
+        </w:rPr>
+        <w:t xml:space="preserve">│ - </w:t>
+      </w:r>
+      <w:proofErr w:type="spellStart"/>
+      <w:r>
+        <w:rPr>
+          <w:lang w:val="en-US"/>
+        </w:rPr>
+        <w:t>isBombActive</w:t>
+      </w:r>
+      <w:proofErr w:type="spellEnd"/>
+      <w:r>
+        <w:rPr>
+          <w:lang w:val="en-US"/>
+        </w:rPr>
+        <w:t>: bool          │</w:t>
+      </w:r>
+    </w:p>
+    <w:p>
+      <w:pPr>
+        <w:rPr>
+          <w:lang w:val="en-US"/>
+        </w:rPr>
+      </w:pPr>
+      <w:r>
+        <w:rPr>
+          <w:lang w:val="en-US"/>
+        </w:rPr>
+        <w:t xml:space="preserve">│ - </w:t>
+      </w:r>
+      <w:proofErr w:type="spellStart"/>
+      <w:r>
+        <w:rPr>
+          <w:lang w:val="en-US"/>
+        </w:rPr>
+        <w:t>bombUsed</w:t>
+      </w:r>
+      <w:proofErr w:type="spellEnd"/>
+      <w:r>
+        <w:rPr>
+          <w:lang w:val="en-US"/>
+        </w:rPr>
+        <w:t>: bool[]            │</w:t>
+      </w:r>
+    </w:p>
+    <w:p>
+      <w:pPr>
+        <w:rPr>
+          <w:lang w:val="en-US"/>
+        </w:rPr>
+      </w:pPr>
+      <w:r>
+        <w:rPr>
+          <w:lang w:val="en-US"/>
+        </w:rPr>
+        <w:t xml:space="preserve">│ - </w:t>
+      </w:r>
+      <w:proofErr w:type="spellStart"/>
+      <w:r>
+        <w:rPr>
+          <w:lang w:val="en-US"/>
+        </w:rPr>
+        <w:t>movesPerPlayer</w:t>
+      </w:r>
+      <w:proofErr w:type="spellEnd"/>
+      <w:r>
+        <w:rPr>
+          <w:lang w:val="en-US"/>
+        </w:rPr>
+        <w:t>: int[]       │</w:t>
       </w:r>
     </w:p>
     <w:p>
@@ -977,290 +1187,6 @@
         <w:rPr>
           <w:lang w:val="en-US"/>
         </w:rPr>
-        <w:t>currentPlayer</w:t>
-      </w:r>
-      <w:proofErr w:type="spellEnd"/>
-      <w:r>
-        <w:rPr>
-          <w:lang w:val="en-US"/>
-        </w:rPr>
-        <w:t>: int          │</w:t>
-      </w:r>
-    </w:p>
-    <w:p>
-      <w:pPr>
-        <w:rPr>
-          <w:lang w:val="en-US"/>
-        </w:rPr>
-      </w:pPr>
-      <w:r>
-        <w:rPr>
-          <w:lang w:val="en-US"/>
-        </w:rPr>
-        <w:t xml:space="preserve">│ - </w:t>
-      </w:r>
-      <w:proofErr w:type="spellStart"/>
-      <w:r>
-        <w:rPr>
-          <w:lang w:val="en-US"/>
-        </w:rPr>
-        <w:t>gameEnded</w:t>
-      </w:r>
-      <w:proofErr w:type="spellEnd"/>
-      <w:r>
-        <w:rPr>
-          <w:lang w:val="en-US"/>
-        </w:rPr>
-        <w:t>: bool             │</w:t>
-      </w:r>
-    </w:p>
-    <w:p>
-      <w:pPr>
-        <w:rPr>
-          <w:lang w:val="en-US"/>
-        </w:rPr>
-      </w:pPr>
-      <w:r>
-        <w:rPr>
-          <w:lang w:val="en-US"/>
-        </w:rPr>
-        <w:t xml:space="preserve">│ - </w:t>
-      </w:r>
-      <w:proofErr w:type="spellStart"/>
-      <w:r>
-        <w:rPr>
-          <w:lang w:val="en-US"/>
-        </w:rPr>
-        <w:t>gameStarted</w:t>
-      </w:r>
-      <w:proofErr w:type="spellEnd"/>
-      <w:r>
-        <w:rPr>
-          <w:lang w:val="en-US"/>
-        </w:rPr>
-        <w:t>: bool           │</w:t>
-      </w:r>
-    </w:p>
-    <w:p>
-      <w:pPr>
-        <w:rPr>
-          <w:lang w:val="en-US"/>
-        </w:rPr>
-      </w:pPr>
-      <w:r>
-        <w:rPr>
-          <w:lang w:val="en-US"/>
-        </w:rPr>
-        <w:t>│                               │</w:t>
-      </w:r>
-    </w:p>
-    <w:p>
-      <w:pPr>
-        <w:rPr>
-          <w:lang w:val="en-US"/>
-        </w:rPr>
-      </w:pPr>
-      <w:r>
-        <w:rPr>
-          <w:lang w:val="en-US"/>
-        </w:rPr>
-        <w:t xml:space="preserve">│ - </w:t>
-      </w:r>
-      <w:proofErr w:type="spellStart"/>
-      <w:r>
-        <w:rPr>
-          <w:lang w:val="en-US"/>
-        </w:rPr>
-        <w:t>activeFeature</w:t>
-      </w:r>
-      <w:proofErr w:type="spellEnd"/>
-      <w:r>
-        <w:rPr>
-          <w:lang w:val="en-US"/>
-        </w:rPr>
-        <w:t xml:space="preserve">: </w:t>
-      </w:r>
-      <w:proofErr w:type="spellStart"/>
-      <w:r>
-        <w:rPr>
-          <w:lang w:val="en-US"/>
-        </w:rPr>
-        <w:t>FeatureType</w:t>
-      </w:r>
-      <w:proofErr w:type="spellEnd"/>
-      <w:r>
-        <w:rPr>
-          <w:lang w:val="en-US"/>
-        </w:rPr>
-        <w:t>? │</w:t>
-      </w:r>
-    </w:p>
-    <w:p>
-      <w:pPr>
-        <w:rPr>
-          <w:lang w:val="en-US"/>
-        </w:rPr>
-      </w:pPr>
-      <w:r>
-        <w:rPr>
-          <w:lang w:val="en-US"/>
-        </w:rPr>
-        <w:t xml:space="preserve">│ - </w:t>
-      </w:r>
-      <w:proofErr w:type="spellStart"/>
-      <w:r>
-        <w:rPr>
-          <w:lang w:val="en-US"/>
-        </w:rPr>
-        <w:t>extraTurnsRemaining</w:t>
-      </w:r>
-      <w:proofErr w:type="spellEnd"/>
-      <w:r>
-        <w:rPr>
-          <w:lang w:val="en-US"/>
-        </w:rPr>
-        <w:t>: int    │</w:t>
-      </w:r>
-    </w:p>
-    <w:p>
-      <w:pPr>
-        <w:rPr>
-          <w:lang w:val="en-US"/>
-        </w:rPr>
-      </w:pPr>
-      <w:r>
-        <w:rPr>
-          <w:lang w:val="en-US"/>
-        </w:rPr>
-        <w:t xml:space="preserve">│ - </w:t>
-      </w:r>
-      <w:proofErr w:type="spellStart"/>
-      <w:r>
-        <w:rPr>
-          <w:lang w:val="en-US"/>
-        </w:rPr>
-        <w:t>isBombActive</w:t>
-      </w:r>
-      <w:proofErr w:type="spellEnd"/>
-      <w:r>
-        <w:rPr>
-          <w:lang w:val="en-US"/>
-        </w:rPr>
-        <w:t>: bool          │</w:t>
-      </w:r>
-    </w:p>
-    <w:p>
-      <w:pPr>
-        <w:rPr>
-          <w:lang w:val="en-US"/>
-        </w:rPr>
-      </w:pPr>
-      <w:r>
-        <w:rPr>
-          <w:lang w:val="en-US"/>
-        </w:rPr>
-        <w:t xml:space="preserve">│ - </w:t>
-      </w:r>
-      <w:proofErr w:type="spellStart"/>
-      <w:r>
-        <w:rPr>
-          <w:lang w:val="en-US"/>
-        </w:rPr>
-        <w:t>bombUsed</w:t>
-      </w:r>
-      <w:proofErr w:type="spellEnd"/>
-      <w:r>
-        <w:rPr>
-          <w:lang w:val="en-US"/>
-        </w:rPr>
-        <w:t xml:space="preserve">: </w:t>
-      </w:r>
-      <w:proofErr w:type="gramStart"/>
-      <w:r>
-        <w:rPr>
-          <w:lang w:val="en-US"/>
-        </w:rPr>
-        <w:t>bool[</w:t>
-      </w:r>
-      <w:proofErr w:type="gramEnd"/>
-      <w:r>
-        <w:rPr>
-          <w:lang w:val="en-US"/>
-        </w:rPr>
-        <w:t>]            │</w:t>
-      </w:r>
-    </w:p>
-    <w:p>
-      <w:pPr>
-        <w:rPr>
-          <w:lang w:val="en-US"/>
-        </w:rPr>
-      </w:pPr>
-      <w:r>
-        <w:rPr>
-          <w:lang w:val="en-US"/>
-        </w:rPr>
-        <w:t xml:space="preserve">│ - </w:t>
-      </w:r>
-      <w:proofErr w:type="spellStart"/>
-      <w:r>
-        <w:rPr>
-          <w:lang w:val="en-US"/>
-        </w:rPr>
-        <w:t>movesPerPlayer</w:t>
-      </w:r>
-      <w:proofErr w:type="spellEnd"/>
-      <w:r>
-        <w:rPr>
-          <w:lang w:val="en-US"/>
-        </w:rPr>
-        <w:t xml:space="preserve">: </w:t>
-      </w:r>
-      <w:proofErr w:type="gramStart"/>
-      <w:r>
-        <w:rPr>
-          <w:lang w:val="en-US"/>
-        </w:rPr>
-        <w:t>int[</w:t>
-      </w:r>
-      <w:proofErr w:type="gramEnd"/>
-      <w:r>
-        <w:rPr>
-          <w:lang w:val="en-US"/>
-        </w:rPr>
-        <w:t>]       │</w:t>
-      </w:r>
-    </w:p>
-    <w:p>
-      <w:pPr>
-        <w:rPr>
-          <w:lang w:val="en-US"/>
-        </w:rPr>
-      </w:pPr>
-      <w:r>
-        <w:rPr>
-          <w:lang w:val="en-US"/>
-        </w:rPr>
-        <w:t>│                               │</w:t>
-      </w:r>
-    </w:p>
-    <w:p>
-      <w:pPr>
-        <w:rPr>
-          <w:lang w:val="en-US"/>
-        </w:rPr>
-      </w:pPr>
-      <w:r>
-        <w:rPr>
-          <w:lang w:val="en-US"/>
-        </w:rPr>
-        <w:t xml:space="preserve">│ - </w:t>
-      </w:r>
-      <w:proofErr w:type="spellStart"/>
-      <w:r>
-        <w:rPr>
-          <w:lang w:val="en-US"/>
-        </w:rPr>
         <w:t>winningCombinations</w:t>
       </w:r>
       <w:proofErr w:type="spellEnd"/>
@@ -1268,21 +1194,7 @@
         <w:rPr>
           <w:lang w:val="en-US"/>
         </w:rPr>
-        <w:t xml:space="preserve">: </w:t>
-      </w:r>
-      <w:proofErr w:type="gramStart"/>
-      <w:r>
-        <w:rPr>
-          <w:lang w:val="en-US"/>
-        </w:rPr>
-        <w:t>int[</w:t>
-      </w:r>
-      <w:proofErr w:type="gramEnd"/>
-      <w:r>
-        <w:rPr>
-          <w:lang w:val="en-US"/>
-        </w:rPr>
-        <w:t>][]│</w:t>
+        <w:t>: int[][]│</w:t>
       </w:r>
     </w:p>
     <w:p>
@@ -1323,21 +1235,34 @@
         <w:rPr>
           <w:lang w:val="en-US"/>
         </w:rPr>
+        <w:t>│ + Start(): void               │</w:t>
+      </w:r>
+    </w:p>
+    <w:p>
+      <w:pPr>
+        <w:rPr>
+          <w:lang w:val="en-US"/>
+        </w:rPr>
+      </w:pPr>
+      <w:r>
+        <w:rPr>
+          <w:lang w:val="en-US"/>
+        </w:rPr>
         <w:t xml:space="preserve">│ + </w:t>
       </w:r>
-      <w:proofErr w:type="gramStart"/>
-      <w:r>
-        <w:rPr>
-          <w:lang w:val="en-US"/>
-        </w:rPr>
-        <w:t>Start(</w:t>
-      </w:r>
-      <w:proofErr w:type="gramEnd"/>
-      <w:r>
-        <w:rPr>
-          <w:lang w:val="en-US"/>
-        </w:rPr>
-        <w:t>): void               │</w:t>
+      <w:proofErr w:type="spellStart"/>
+      <w:r>
+        <w:rPr>
+          <w:lang w:val="en-US"/>
+        </w:rPr>
+        <w:t>StartGame</w:t>
+      </w:r>
+      <w:proofErr w:type="spellEnd"/>
+      <w:r>
+        <w:rPr>
+          <w:lang w:val="en-US"/>
+        </w:rPr>
+        <w:t>(): void           │</w:t>
       </w:r>
     </w:p>
     <w:p>
@@ -1353,26 +1278,18 @@
         <w:t xml:space="preserve">│ + </w:t>
       </w:r>
       <w:proofErr w:type="spellStart"/>
-      <w:proofErr w:type="gramStart"/>
-      <w:r>
-        <w:rPr>
-          <w:lang w:val="en-US"/>
-        </w:rPr>
-        <w:t>StartGame</w:t>
-      </w:r>
-      <w:proofErr w:type="spellEnd"/>
-      <w:r>
-        <w:rPr>
-          <w:lang w:val="en-US"/>
-        </w:rPr>
-        <w:t>(</w:t>
-      </w:r>
-      <w:proofErr w:type="gramEnd"/>
-      <w:r>
-        <w:rPr>
-          <w:lang w:val="en-US"/>
-        </w:rPr>
-        <w:t>): void           │</w:t>
+      <w:r>
+        <w:rPr>
+          <w:lang w:val="en-US"/>
+        </w:rPr>
+        <w:t>OnButtonClickedInManager</w:t>
+      </w:r>
+      <w:proofErr w:type="spellEnd"/>
+      <w:r>
+        <w:rPr>
+          <w:lang w:val="en-US"/>
+        </w:rPr>
+        <w:t>()  │</w:t>
       </w:r>
     </w:p>
     <w:p>
@@ -1388,26 +1305,18 @@
         <w:t xml:space="preserve">│ + </w:t>
       </w:r>
       <w:proofErr w:type="spellStart"/>
-      <w:proofErr w:type="gramStart"/>
-      <w:r>
-        <w:rPr>
-          <w:lang w:val="en-US"/>
-        </w:rPr>
-        <w:t>OnButtonClickedInManager</w:t>
-      </w:r>
-      <w:proofErr w:type="spellEnd"/>
-      <w:r>
-        <w:rPr>
-          <w:lang w:val="en-US"/>
-        </w:rPr>
-        <w:t>(</w:t>
-      </w:r>
-      <w:proofErr w:type="gramEnd"/>
-      <w:r>
-        <w:rPr>
-          <w:lang w:val="en-US"/>
-        </w:rPr>
-        <w:t>)  │</w:t>
+      <w:r>
+        <w:rPr>
+          <w:lang w:val="en-US"/>
+        </w:rPr>
+        <w:t>ActivateFeature</w:t>
+      </w:r>
+      <w:proofErr w:type="spellEnd"/>
+      <w:r>
+        <w:rPr>
+          <w:lang w:val="en-US"/>
+        </w:rPr>
+        <w:t>(): void     │</w:t>
       </w:r>
     </w:p>
     <w:p>
@@ -1423,26 +1332,18 @@
         <w:t xml:space="preserve">│ + </w:t>
       </w:r>
       <w:proofErr w:type="spellStart"/>
-      <w:proofErr w:type="gramStart"/>
-      <w:r>
-        <w:rPr>
-          <w:lang w:val="en-US"/>
-        </w:rPr>
-        <w:t>ActivateFeature</w:t>
-      </w:r>
-      <w:proofErr w:type="spellEnd"/>
-      <w:r>
-        <w:rPr>
-          <w:lang w:val="en-US"/>
-        </w:rPr>
-        <w:t>(</w:t>
-      </w:r>
-      <w:proofErr w:type="gramEnd"/>
-      <w:r>
-        <w:rPr>
-          <w:lang w:val="en-US"/>
-        </w:rPr>
-        <w:t>): void     │</w:t>
+      <w:r>
+        <w:rPr>
+          <w:lang w:val="en-US"/>
+        </w:rPr>
+        <w:t>EndTurn</w:t>
+      </w:r>
+      <w:proofErr w:type="spellEnd"/>
+      <w:r>
+        <w:rPr>
+          <w:lang w:val="en-US"/>
+        </w:rPr>
+        <w:t>(): void             │</w:t>
       </w:r>
     </w:p>
     <w:p>
@@ -1458,26 +1359,18 @@
         <w:t xml:space="preserve">│ + </w:t>
       </w:r>
       <w:proofErr w:type="spellStart"/>
-      <w:proofErr w:type="gramStart"/>
-      <w:r>
-        <w:rPr>
-          <w:lang w:val="en-US"/>
-        </w:rPr>
-        <w:t>EndTurn</w:t>
-      </w:r>
-      <w:proofErr w:type="spellEnd"/>
-      <w:r>
-        <w:rPr>
-          <w:lang w:val="en-US"/>
-        </w:rPr>
-        <w:t>(</w:t>
-      </w:r>
-      <w:proofErr w:type="gramEnd"/>
-      <w:r>
-        <w:rPr>
-          <w:lang w:val="en-US"/>
-        </w:rPr>
-        <w:t>): void             │</w:t>
+      <w:r>
+        <w:rPr>
+          <w:lang w:val="en-US"/>
+        </w:rPr>
+        <w:t>ActivateBomb</w:t>
+      </w:r>
+      <w:proofErr w:type="spellEnd"/>
+      <w:r>
+        <w:rPr>
+          <w:lang w:val="en-US"/>
+        </w:rPr>
+        <w:t>(): void        │</w:t>
       </w:r>
     </w:p>
     <w:p>
@@ -1493,26 +1386,18 @@
         <w:t xml:space="preserve">│ + </w:t>
       </w:r>
       <w:proofErr w:type="spellStart"/>
-      <w:proofErr w:type="gramStart"/>
-      <w:r>
-        <w:rPr>
-          <w:lang w:val="en-US"/>
-        </w:rPr>
-        <w:t>ActivateBomb</w:t>
-      </w:r>
-      <w:proofErr w:type="spellEnd"/>
-      <w:r>
-        <w:rPr>
-          <w:lang w:val="en-US"/>
-        </w:rPr>
-        <w:t>(</w:t>
-      </w:r>
-      <w:proofErr w:type="gramEnd"/>
-      <w:r>
-        <w:rPr>
-          <w:lang w:val="en-US"/>
-        </w:rPr>
-        <w:t>): void        │</w:t>
+      <w:r>
+        <w:rPr>
+          <w:lang w:val="en-US"/>
+        </w:rPr>
+        <w:t>HandleBomb</w:t>
+      </w:r>
+      <w:proofErr w:type="spellEnd"/>
+      <w:r>
+        <w:rPr>
+          <w:lang w:val="en-US"/>
+        </w:rPr>
+        <w:t>(): void          │</w:t>
       </w:r>
     </w:p>
     <w:p>
@@ -1528,77 +1413,58 @@
         <w:t xml:space="preserve">│ + </w:t>
       </w:r>
       <w:proofErr w:type="spellStart"/>
-      <w:proofErr w:type="gramStart"/>
-      <w:r>
-        <w:rPr>
-          <w:lang w:val="en-US"/>
-        </w:rPr>
-        <w:t>HandleBomb</w:t>
-      </w:r>
-      <w:proofErr w:type="spellEnd"/>
-      <w:r>
-        <w:rPr>
-          <w:lang w:val="en-US"/>
-        </w:rPr>
-        <w:t>(</w:t>
-      </w:r>
-      <w:proofErr w:type="gramEnd"/>
-      <w:r>
-        <w:rPr>
-          <w:lang w:val="en-US"/>
-        </w:rPr>
-        <w:t>): void          │</w:t>
-      </w:r>
-    </w:p>
-    <w:p>
-      <w:r>
+      <w:r>
+        <w:rPr>
+          <w:lang w:val="en-US"/>
+        </w:rPr>
+        <w:t>CheckForWinOrDraw</w:t>
+      </w:r>
+      <w:proofErr w:type="spellEnd"/>
+      <w:r>
+        <w:rPr>
+          <w:lang w:val="en-US"/>
+        </w:rPr>
+        <w:t>(): void   │</w:t>
+      </w:r>
+    </w:p>
+    <w:p>
+      <w:pPr>
+        <w:rPr>
+          <w:lang w:val="en-US"/>
+        </w:rPr>
+      </w:pPr>
+      <w:r>
+        <w:rPr>
+          <w:lang w:val="en-US"/>
+        </w:rPr>
         <w:t xml:space="preserve">│ + </w:t>
       </w:r>
       <w:proofErr w:type="spellStart"/>
-      <w:proofErr w:type="gramStart"/>
-      <w:r>
-        <w:t>CheckForWinOrDraw</w:t>
-      </w:r>
-      <w:proofErr w:type="spellEnd"/>
-      <w:r>
-        <w:t>(</w:t>
-      </w:r>
-      <w:proofErr w:type="gramEnd"/>
-      <w:r>
-        <w:t xml:space="preserve">): </w:t>
-      </w:r>
-      <w:proofErr w:type="spellStart"/>
-      <w:r>
-        <w:t>void</w:t>
-      </w:r>
-      <w:proofErr w:type="spellEnd"/>
-      <w:r>
-        <w:t xml:space="preserve">   │</w:t>
-      </w:r>
-    </w:p>
-    <w:p>
-      <w:r>
-        <w:t xml:space="preserve">│ + </w:t>
-      </w:r>
-      <w:proofErr w:type="spellStart"/>
-      <w:proofErr w:type="gramStart"/>
-      <w:r>
+      <w:r>
+        <w:rPr>
+          <w:lang w:val="en-US"/>
+        </w:rPr>
         <w:t>RestartWithSound</w:t>
       </w:r>
       <w:proofErr w:type="spellEnd"/>
       <w:r>
-        <w:t>(</w:t>
-      </w:r>
-      <w:proofErr w:type="gramEnd"/>
-      <w:r>
-        <w:t xml:space="preserve">): </w:t>
-      </w:r>
-      <w:proofErr w:type="spellStart"/>
-      <w:r>
+        <w:rPr>
+          <w:lang w:val="en-US"/>
+        </w:rPr>
+        <w:t xml:space="preserve">(): </w:t>
+      </w:r>
+      <w:proofErr w:type="spellStart"/>
+      <w:r>
+        <w:rPr>
+          <w:lang w:val="en-US"/>
+        </w:rPr>
         <w:t>IEnumerator</w:t>
       </w:r>
       <w:proofErr w:type="spellEnd"/>
       <w:r>
+        <w:rPr>
+          <w:lang w:val="en-US"/>
+        </w:rPr>
         <w:t xml:space="preserve"> │</w:t>
       </w:r>
     </w:p>
@@ -1620,7 +1486,7 @@
           <w:p>
             <w:pPr>
               <w:rPr>
-                <w:lang w:val="de-DE"/>
+                <w:lang w:val="en-US"/>
               </w:rPr>
             </w:pPr>
           </w:p>
@@ -1630,21 +1496,21 @@
     <w:p>
       <w:pPr>
         <w:rPr>
-          <w:lang w:val="de-DE"/>
-        </w:rPr>
-      </w:pPr>
-    </w:p>
-    <w:p>
-      <w:pPr>
-        <w:rPr>
-          <w:lang w:val="de-DE"/>
-        </w:rPr>
-      </w:pPr>
-    </w:p>
-    <w:p>
-      <w:pPr>
-        <w:rPr>
-          <w:lang w:val="de-DE"/>
+          <w:lang w:val="en-US"/>
+        </w:rPr>
+      </w:pPr>
+    </w:p>
+    <w:p>
+      <w:pPr>
+        <w:rPr>
+          <w:lang w:val="en-US"/>
+        </w:rPr>
+      </w:pPr>
+    </w:p>
+    <w:p>
+      <w:pPr>
+        <w:rPr>
+          <w:lang w:val="en-US"/>
         </w:rPr>
       </w:pPr>
     </w:p>
@@ -1654,12 +1520,12 @@
           <w:tab w:val="left" w:pos="1380"/>
         </w:tabs>
         <w:rPr>
-          <w:lang w:val="de-DE"/>
-        </w:rPr>
-      </w:pPr>
-      <w:r>
-        <w:rPr>
-          <w:lang w:val="de-DE"/>
+          <w:lang w:val="en-US"/>
+        </w:rPr>
+      </w:pPr>
+      <w:r>
+        <w:rPr>
+          <w:lang w:val="en-US"/>
         </w:rPr>
         <w:lastRenderedPageBreak/>
         <w:t>┌───────────────────────────────┐</w:t>
@@ -1671,26 +1537,26 @@
           <w:tab w:val="left" w:pos="1380"/>
         </w:tabs>
         <w:rPr>
-          <w:lang w:val="de-DE"/>
-        </w:rPr>
-      </w:pPr>
-      <w:r>
-        <w:rPr>
-          <w:lang w:val="de-DE"/>
+          <w:lang w:val="en-US"/>
+        </w:rPr>
+      </w:pPr>
+      <w:r>
+        <w:rPr>
+          <w:lang w:val="en-US"/>
         </w:rPr>
         <w:t xml:space="preserve">│          </w:t>
       </w:r>
       <w:proofErr w:type="spellStart"/>
       <w:r>
         <w:rPr>
-          <w:lang w:val="de-DE"/>
+          <w:lang w:val="en-US"/>
         </w:rPr>
         <w:t>FieldButton</w:t>
       </w:r>
       <w:proofErr w:type="spellEnd"/>
       <w:r>
         <w:rPr>
-          <w:lang w:val="de-DE"/>
+          <w:lang w:val="en-US"/>
         </w:rPr>
         <w:t xml:space="preserve">          │</w:t>
       </w:r>
@@ -1701,27 +1567,27 @@
           <w:tab w:val="left" w:pos="1380"/>
         </w:tabs>
         <w:rPr>
-          <w:lang w:val="de-DE"/>
+          <w:lang w:val="en-US"/>
         </w:rPr>
       </w:pPr>
       <w:r>
         <w:rPr>
           <w:rFonts w:ascii="MS Gothic" w:eastAsia="MS Gothic" w:hAnsi="MS Gothic" w:cs="MS Gothic" w:hint="eastAsia"/>
-          <w:lang w:val="de-DE"/>
+          <w:lang w:val="en-US"/>
         </w:rPr>
         <w:t>├</w:t>
       </w:r>
       <w:r>
         <w:rPr>
           <w:rFonts w:ascii="Calibri" w:hAnsi="Calibri" w:cs="Calibri"/>
-          <w:lang w:val="de-DE"/>
+          <w:lang w:val="en-US"/>
         </w:rPr>
         <w:t>───────────────────────────────</w:t>
       </w:r>
       <w:r>
         <w:rPr>
           <w:rFonts w:ascii="MS Gothic" w:eastAsia="MS Gothic" w:hAnsi="MS Gothic" w:cs="MS Gothic" w:hint="eastAsia"/>
-          <w:lang w:val="de-DE"/>
+          <w:lang w:val="en-US"/>
         </w:rPr>
         <w:t>┤</w:t>
       </w:r>
@@ -1732,42 +1598,120 @@
           <w:tab w:val="left" w:pos="1380"/>
         </w:tabs>
         <w:rPr>
-          <w:lang w:val="de-DE"/>
-        </w:rPr>
-      </w:pPr>
-      <w:r>
-        <w:rPr>
-          <w:lang w:val="de-DE"/>
+          <w:lang w:val="en-US"/>
+        </w:rPr>
+      </w:pPr>
+      <w:r>
+        <w:rPr>
+          <w:lang w:val="en-US"/>
+        </w:rPr>
+        <w:t>│ + index: int                 │</w:t>
+      </w:r>
+    </w:p>
+    <w:p>
+      <w:pPr>
+        <w:tabs>
+          <w:tab w:val="left" w:pos="1380"/>
+        </w:tabs>
+        <w:rPr>
+          <w:lang w:val="en-US"/>
+        </w:rPr>
+      </w:pPr>
+      <w:r>
+        <w:rPr>
+          <w:lang w:val="en-US"/>
+        </w:rPr>
+        <w:t>│ + Player: int                │</w:t>
+      </w:r>
+    </w:p>
+    <w:p>
+      <w:pPr>
+        <w:tabs>
+          <w:tab w:val="left" w:pos="1380"/>
+        </w:tabs>
+        <w:rPr>
+          <w:lang w:val="en-US"/>
+        </w:rPr>
+      </w:pPr>
+      <w:r>
+        <w:rPr>
+          <w:lang w:val="en-US"/>
         </w:rPr>
         <w:t xml:space="preserve">│ + </w:t>
       </w:r>
       <w:proofErr w:type="spellStart"/>
       <w:r>
         <w:rPr>
-          <w:lang w:val="de-DE"/>
-        </w:rPr>
-        <w:t>index</w:t>
-      </w:r>
-      <w:proofErr w:type="spellEnd"/>
-      <w:r>
-        <w:rPr>
-          <w:lang w:val="de-DE"/>
+          <w:lang w:val="en-US"/>
+        </w:rPr>
+        <w:t>IsBlocked</w:t>
+      </w:r>
+      <w:proofErr w:type="spellEnd"/>
+      <w:r>
+        <w:rPr>
+          <w:lang w:val="en-US"/>
+        </w:rPr>
+        <w:t>: bool            │</w:t>
+      </w:r>
+    </w:p>
+    <w:p>
+      <w:pPr>
+        <w:tabs>
+          <w:tab w:val="left" w:pos="1380"/>
+        </w:tabs>
+        <w:rPr>
+          <w:lang w:val="en-US"/>
+        </w:rPr>
+      </w:pPr>
+      <w:r>
+        <w:rPr>
+          <w:lang w:val="en-US"/>
+        </w:rPr>
+        <w:t>│                               │</w:t>
+      </w:r>
+    </w:p>
+    <w:p>
+      <w:pPr>
+        <w:tabs>
+          <w:tab w:val="left" w:pos="1380"/>
+        </w:tabs>
+        <w:rPr>
+          <w:lang w:val="en-US"/>
+        </w:rPr>
+      </w:pPr>
+      <w:r>
+        <w:rPr>
+          <w:lang w:val="en-US"/>
+        </w:rPr>
+        <w:t xml:space="preserve">│ - </w:t>
+      </w:r>
+      <w:proofErr w:type="spellStart"/>
+      <w:r>
+        <w:rPr>
+          <w:lang w:val="en-US"/>
+        </w:rPr>
+        <w:t>buttonText</w:t>
+      </w:r>
+      <w:proofErr w:type="spellEnd"/>
+      <w:r>
+        <w:rPr>
+          <w:lang w:val="en-US"/>
         </w:rPr>
         <w:t xml:space="preserve">: </w:t>
       </w:r>
       <w:proofErr w:type="spellStart"/>
       <w:r>
         <w:rPr>
-          <w:lang w:val="de-DE"/>
-        </w:rPr>
-        <w:t>int</w:t>
-      </w:r>
-      <w:proofErr w:type="spellEnd"/>
-      <w:r>
-        <w:rPr>
-          <w:lang w:val="de-DE"/>
-        </w:rPr>
-        <w:t xml:space="preserve">                 │</w:t>
+          <w:lang w:val="en-US"/>
+        </w:rPr>
+        <w:t>TextMeshProUGUI</w:t>
+      </w:r>
+      <w:proofErr w:type="spellEnd"/>
+      <w:r>
+        <w:rPr>
+          <w:lang w:val="en-US"/>
+        </w:rPr>
+        <w:t xml:space="preserve"> │</w:t>
       </w:r>
     </w:p>
     <w:p>
@@ -1776,28 +1720,28 @@
           <w:tab w:val="left" w:pos="1380"/>
         </w:tabs>
         <w:rPr>
-          <w:lang w:val="de-DE"/>
-        </w:rPr>
-      </w:pPr>
-      <w:r>
-        <w:rPr>
-          <w:lang w:val="de-DE"/>
-        </w:rPr>
-        <w:t xml:space="preserve">│ + Player: </w:t>
-      </w:r>
-      <w:proofErr w:type="spellStart"/>
-      <w:r>
-        <w:rPr>
-          <w:lang w:val="de-DE"/>
-        </w:rPr>
-        <w:t>int</w:t>
-      </w:r>
-      <w:proofErr w:type="spellEnd"/>
-      <w:r>
-        <w:rPr>
-          <w:lang w:val="de-DE"/>
-        </w:rPr>
-        <w:t xml:space="preserve">                │</w:t>
+          <w:lang w:val="en-US"/>
+        </w:rPr>
+      </w:pPr>
+      <w:r>
+        <w:rPr>
+          <w:lang w:val="en-US"/>
+        </w:rPr>
+        <w:t xml:space="preserve">│ - manager: </w:t>
+      </w:r>
+      <w:proofErr w:type="spellStart"/>
+      <w:r>
+        <w:rPr>
+          <w:lang w:val="en-US"/>
+        </w:rPr>
+        <w:t>TicTacToManager</w:t>
+      </w:r>
+      <w:proofErr w:type="spellEnd"/>
+      <w:r>
+        <w:rPr>
+          <w:lang w:val="en-US"/>
+        </w:rPr>
+        <w:t xml:space="preserve">   │</w:t>
       </w:r>
     </w:p>
     <w:p>
@@ -1811,6 +1755,53 @@
       </w:pPr>
       <w:r>
         <w:rPr>
+          <w:rFonts w:ascii="MS Gothic" w:eastAsia="MS Gothic" w:hAnsi="MS Gothic" w:cs="MS Gothic" w:hint="eastAsia"/>
+          <w:lang w:val="en-US"/>
+        </w:rPr>
+        <w:t>├</w:t>
+      </w:r>
+      <w:r>
+        <w:rPr>
+          <w:rFonts w:ascii="Calibri" w:hAnsi="Calibri" w:cs="Calibri"/>
+          <w:lang w:val="en-US"/>
+        </w:rPr>
+        <w:t>───────────────────────────────</w:t>
+      </w:r>
+      <w:r>
+        <w:rPr>
+          <w:rFonts w:ascii="MS Gothic" w:eastAsia="MS Gothic" w:hAnsi="MS Gothic" w:cs="MS Gothic" w:hint="eastAsia"/>
+          <w:lang w:val="en-US"/>
+        </w:rPr>
+        <w:t>┤</w:t>
+      </w:r>
+    </w:p>
+    <w:p>
+      <w:pPr>
+        <w:tabs>
+          <w:tab w:val="left" w:pos="1380"/>
+        </w:tabs>
+        <w:rPr>
+          <w:lang w:val="en-US"/>
+        </w:rPr>
+      </w:pPr>
+      <w:r>
+        <w:rPr>
+          <w:lang w:val="en-US"/>
+        </w:rPr>
+        <w:t>│ + Start(): void               │</w:t>
+      </w:r>
+    </w:p>
+    <w:p>
+      <w:pPr>
+        <w:tabs>
+          <w:tab w:val="left" w:pos="1380"/>
+        </w:tabs>
+        <w:rPr>
+          <w:lang w:val="en-US"/>
+        </w:rPr>
+      </w:pPr>
+      <w:r>
+        <w:rPr>
           <w:lang w:val="en-US"/>
         </w:rPr>
         <w:t xml:space="preserve">│ + </w:t>
@@ -1820,14 +1811,14 @@
         <w:rPr>
           <w:lang w:val="en-US"/>
         </w:rPr>
-        <w:t>IsBlocked</w:t>
-      </w:r>
-      <w:proofErr w:type="spellEnd"/>
-      <w:r>
-        <w:rPr>
-          <w:lang w:val="en-US"/>
-        </w:rPr>
-        <w:t>: bool            │</w:t>
+        <w:t>OnButtonClicked</w:t>
+      </w:r>
+      <w:proofErr w:type="spellEnd"/>
+      <w:r>
+        <w:rPr>
+          <w:lang w:val="en-US"/>
+        </w:rPr>
+        <w:t>(): void     │</w:t>
       </w:r>
     </w:p>
     <w:p>
@@ -1843,7 +1834,21 @@
         <w:rPr>
           <w:lang w:val="en-US"/>
         </w:rPr>
-        <w:t>│                               │</w:t>
+        <w:t xml:space="preserve">│ + </w:t>
+      </w:r>
+      <w:proofErr w:type="spellStart"/>
+      <w:r>
+        <w:rPr>
+          <w:lang w:val="en-US"/>
+        </w:rPr>
+        <w:t>SetField</w:t>
+      </w:r>
+      <w:proofErr w:type="spellEnd"/>
+      <w:r>
+        <w:rPr>
+          <w:lang w:val="en-US"/>
+        </w:rPr>
+        <w:t>(): void            │</w:t>
       </w:r>
     </w:p>
     <w:p>
@@ -1859,35 +1864,21 @@
         <w:rPr>
           <w:lang w:val="en-US"/>
         </w:rPr>
-        <w:t xml:space="preserve">│ - </w:t>
-      </w:r>
-      <w:proofErr w:type="spellStart"/>
-      <w:r>
-        <w:rPr>
-          <w:lang w:val="en-US"/>
-        </w:rPr>
-        <w:t>buttonText</w:t>
-      </w:r>
-      <w:proofErr w:type="spellEnd"/>
-      <w:r>
-        <w:rPr>
-          <w:lang w:val="en-US"/>
-        </w:rPr>
-        <w:t xml:space="preserve">: </w:t>
-      </w:r>
-      <w:proofErr w:type="spellStart"/>
-      <w:r>
-        <w:rPr>
-          <w:lang w:val="en-US"/>
-        </w:rPr>
-        <w:t>TextMeshProUGUI</w:t>
-      </w:r>
-      <w:proofErr w:type="spellEnd"/>
-      <w:r>
-        <w:rPr>
-          <w:lang w:val="en-US"/>
-        </w:rPr>
-        <w:t xml:space="preserve"> │</w:t>
+        <w:t xml:space="preserve">│ + </w:t>
+      </w:r>
+      <w:proofErr w:type="spellStart"/>
+      <w:r>
+        <w:rPr>
+          <w:lang w:val="en-US"/>
+        </w:rPr>
+        <w:t>ForceSetField</w:t>
+      </w:r>
+      <w:proofErr w:type="spellEnd"/>
+      <w:r>
+        <w:rPr>
+          <w:lang w:val="en-US"/>
+        </w:rPr>
+        <w:t>(): void       │</w:t>
       </w:r>
     </w:p>
     <w:p>
@@ -1903,338 +1894,103 @@
         <w:rPr>
           <w:lang w:val="en-US"/>
         </w:rPr>
-        <w:t xml:space="preserve">│ - manager: </w:t>
-      </w:r>
-      <w:proofErr w:type="spellStart"/>
-      <w:r>
-        <w:rPr>
+        <w:t>│ + SetBlocked(): void          │</w:t>
+      </w:r>
+    </w:p>
+    <w:p>
+      <w:pPr>
+        <w:tabs>
+          <w:tab w:val="left" w:pos="1380"/>
+        </w:tabs>
+        <w:rPr>
+          <w:lang w:val="en-US"/>
+        </w:rPr>
+      </w:pPr>
+      <w:r>
+        <w:rPr>
+          <w:lang w:val="en-US"/>
+        </w:rPr>
+        <w:t xml:space="preserve">│ + </w:t>
+      </w:r>
+      <w:proofErr w:type="spellStart"/>
+      <w:r>
+        <w:rPr>
+          <w:lang w:val="en-US"/>
+        </w:rPr>
+        <w:t>ReleaseBlock</w:t>
+      </w:r>
+      <w:proofErr w:type="spellEnd"/>
+      <w:r>
+        <w:rPr>
+          <w:lang w:val="en-US"/>
+        </w:rPr>
+        <w:t>(): void        │</w:t>
+      </w:r>
+    </w:p>
+    <w:p>
+      <w:pPr>
+        <w:tabs>
+          <w:tab w:val="left" w:pos="1380"/>
+        </w:tabs>
+        <w:rPr>
+          <w:lang w:val="en-US"/>
+        </w:rPr>
+      </w:pPr>
+      <w:r>
+        <w:rPr>
+          <w:lang w:val="en-US"/>
+        </w:rPr>
+        <w:t xml:space="preserve">│ + </w:t>
+      </w:r>
+      <w:proofErr w:type="spellStart"/>
+      <w:r>
+        <w:rPr>
+          <w:lang w:val="en-US"/>
+        </w:rPr>
+        <w:t>ResetField</w:t>
+      </w:r>
+      <w:proofErr w:type="spellEnd"/>
+      <w:r>
+        <w:rPr>
+          <w:lang w:val="en-US"/>
+        </w:rPr>
+        <w:t>(): void          │</w:t>
+      </w:r>
+    </w:p>
+    <w:p>
+      <w:pPr>
+        <w:tabs>
+          <w:tab w:val="left" w:pos="1380"/>
+        </w:tabs>
+        <w:rPr>
+          <w:lang w:val="en-US"/>
+        </w:rPr>
+      </w:pPr>
+      <w:r>
+        <w:rPr>
+          <w:lang w:val="en-US"/>
+        </w:rPr>
+        <w:t>└───────────────────────────────┘</w:t>
+      </w:r>
+    </w:p>
+    <w:p>
+      <w:pPr>
+        <w:rPr>
+          <w:b/>
+          <w:bCs/>
+          <w:lang w:val="en-US"/>
+        </w:rPr>
+      </w:pPr>
+      <w:proofErr w:type="spellStart"/>
+      <w:r>
+        <w:rPr>
+          <w:b/>
+          <w:bCs/>
           <w:lang w:val="en-US"/>
         </w:rPr>
         <w:t>TicTacToManager</w:t>
       </w:r>
       <w:proofErr w:type="spellEnd"/>
-      <w:r>
-        <w:rPr>
-          <w:lang w:val="en-US"/>
-        </w:rPr>
-        <w:t xml:space="preserve">   │</w:t>
-      </w:r>
-    </w:p>
-    <w:p>
-      <w:pPr>
-        <w:tabs>
-          <w:tab w:val="left" w:pos="1380"/>
-        </w:tabs>
-        <w:rPr>
-          <w:lang w:val="en-US"/>
-        </w:rPr>
-      </w:pPr>
-      <w:r>
-        <w:rPr>
-          <w:rFonts w:ascii="MS Gothic" w:eastAsia="MS Gothic" w:hAnsi="MS Gothic" w:cs="MS Gothic" w:hint="eastAsia"/>
-          <w:lang w:val="en-US"/>
-        </w:rPr>
-        <w:t>├</w:t>
-      </w:r>
-      <w:r>
-        <w:rPr>
-          <w:rFonts w:ascii="Calibri" w:hAnsi="Calibri" w:cs="Calibri"/>
-          <w:lang w:val="en-US"/>
-        </w:rPr>
-        <w:t>───────────────────────────────</w:t>
-      </w:r>
-      <w:r>
-        <w:rPr>
-          <w:rFonts w:ascii="MS Gothic" w:eastAsia="MS Gothic" w:hAnsi="MS Gothic" w:cs="MS Gothic" w:hint="eastAsia"/>
-          <w:lang w:val="en-US"/>
-        </w:rPr>
-        <w:t>┤</w:t>
-      </w:r>
-    </w:p>
-    <w:p>
-      <w:pPr>
-        <w:tabs>
-          <w:tab w:val="left" w:pos="1380"/>
-        </w:tabs>
-        <w:rPr>
-          <w:lang w:val="en-US"/>
-        </w:rPr>
-      </w:pPr>
-      <w:r>
-        <w:rPr>
-          <w:lang w:val="en-US"/>
-        </w:rPr>
-        <w:t xml:space="preserve">│ + </w:t>
-      </w:r>
-      <w:proofErr w:type="gramStart"/>
-      <w:r>
-        <w:rPr>
-          <w:lang w:val="en-US"/>
-        </w:rPr>
-        <w:t>Start(</w:t>
-      </w:r>
-      <w:proofErr w:type="gramEnd"/>
-      <w:r>
-        <w:rPr>
-          <w:lang w:val="en-US"/>
-        </w:rPr>
-        <w:t>): void               │</w:t>
-      </w:r>
-    </w:p>
-    <w:p>
-      <w:pPr>
-        <w:tabs>
-          <w:tab w:val="left" w:pos="1380"/>
-        </w:tabs>
-        <w:rPr>
-          <w:lang w:val="en-US"/>
-        </w:rPr>
-      </w:pPr>
-      <w:r>
-        <w:rPr>
-          <w:lang w:val="en-US"/>
-        </w:rPr>
-        <w:t xml:space="preserve">│ + </w:t>
-      </w:r>
-      <w:proofErr w:type="spellStart"/>
-      <w:proofErr w:type="gramStart"/>
-      <w:r>
-        <w:rPr>
-          <w:lang w:val="en-US"/>
-        </w:rPr>
-        <w:t>OnButtonClicked</w:t>
-      </w:r>
-      <w:proofErr w:type="spellEnd"/>
-      <w:r>
-        <w:rPr>
-          <w:lang w:val="en-US"/>
-        </w:rPr>
-        <w:t>(</w:t>
-      </w:r>
-      <w:proofErr w:type="gramEnd"/>
-      <w:r>
-        <w:rPr>
-          <w:lang w:val="en-US"/>
-        </w:rPr>
-        <w:t>): void     │</w:t>
-      </w:r>
-    </w:p>
-    <w:p>
-      <w:pPr>
-        <w:tabs>
-          <w:tab w:val="left" w:pos="1380"/>
-        </w:tabs>
-        <w:rPr>
-          <w:lang w:val="en-US"/>
-        </w:rPr>
-      </w:pPr>
-      <w:r>
-        <w:rPr>
-          <w:lang w:val="en-US"/>
-        </w:rPr>
-        <w:t xml:space="preserve">│ + </w:t>
-      </w:r>
-      <w:proofErr w:type="spellStart"/>
-      <w:proofErr w:type="gramStart"/>
-      <w:r>
-        <w:rPr>
-          <w:lang w:val="en-US"/>
-        </w:rPr>
-        <w:t>SetField</w:t>
-      </w:r>
-      <w:proofErr w:type="spellEnd"/>
-      <w:r>
-        <w:rPr>
-          <w:lang w:val="en-US"/>
-        </w:rPr>
-        <w:t>(</w:t>
-      </w:r>
-      <w:proofErr w:type="gramEnd"/>
-      <w:r>
-        <w:rPr>
-          <w:lang w:val="en-US"/>
-        </w:rPr>
-        <w:t>): void            │</w:t>
-      </w:r>
-    </w:p>
-    <w:p>
-      <w:pPr>
-        <w:tabs>
-          <w:tab w:val="left" w:pos="1380"/>
-        </w:tabs>
-        <w:rPr>
-          <w:lang w:val="en-US"/>
-        </w:rPr>
-      </w:pPr>
-      <w:r>
-        <w:rPr>
-          <w:lang w:val="en-US"/>
-        </w:rPr>
-        <w:t xml:space="preserve">│ + </w:t>
-      </w:r>
-      <w:proofErr w:type="spellStart"/>
-      <w:proofErr w:type="gramStart"/>
-      <w:r>
-        <w:rPr>
-          <w:lang w:val="en-US"/>
-        </w:rPr>
-        <w:t>ForceSetField</w:t>
-      </w:r>
-      <w:proofErr w:type="spellEnd"/>
-      <w:r>
-        <w:rPr>
-          <w:lang w:val="en-US"/>
-        </w:rPr>
-        <w:t>(</w:t>
-      </w:r>
-      <w:proofErr w:type="gramEnd"/>
-      <w:r>
-        <w:rPr>
-          <w:lang w:val="en-US"/>
-        </w:rPr>
-        <w:t>): void       │</w:t>
-      </w:r>
-    </w:p>
-    <w:p>
-      <w:pPr>
-        <w:tabs>
-          <w:tab w:val="left" w:pos="1380"/>
-        </w:tabs>
-        <w:rPr>
-          <w:lang w:val="en-US"/>
-        </w:rPr>
-      </w:pPr>
-      <w:r>
-        <w:rPr>
-          <w:lang w:val="en-US"/>
-        </w:rPr>
-        <w:t xml:space="preserve">│ + </w:t>
-      </w:r>
-      <w:proofErr w:type="gramStart"/>
-      <w:r>
-        <w:rPr>
-          <w:lang w:val="en-US"/>
-        </w:rPr>
-        <w:t>SetBlocked(</w:t>
-      </w:r>
-      <w:proofErr w:type="gramEnd"/>
-      <w:r>
-        <w:rPr>
-          <w:lang w:val="en-US"/>
-        </w:rPr>
-        <w:t>): void          │</w:t>
-      </w:r>
-    </w:p>
-    <w:p>
-      <w:pPr>
-        <w:tabs>
-          <w:tab w:val="left" w:pos="1380"/>
-        </w:tabs>
-        <w:rPr>
-          <w:lang w:val="en-US"/>
-        </w:rPr>
-      </w:pPr>
-      <w:r>
-        <w:rPr>
-          <w:lang w:val="en-US"/>
-        </w:rPr>
-        <w:t xml:space="preserve">│ + </w:t>
-      </w:r>
-      <w:proofErr w:type="spellStart"/>
-      <w:proofErr w:type="gramStart"/>
-      <w:r>
-        <w:rPr>
-          <w:lang w:val="en-US"/>
-        </w:rPr>
-        <w:t>ReleaseBlock</w:t>
-      </w:r>
-      <w:proofErr w:type="spellEnd"/>
-      <w:r>
-        <w:rPr>
-          <w:lang w:val="en-US"/>
-        </w:rPr>
-        <w:t>(</w:t>
-      </w:r>
-      <w:proofErr w:type="gramEnd"/>
-      <w:r>
-        <w:rPr>
-          <w:lang w:val="en-US"/>
-        </w:rPr>
-        <w:t>): void        │</w:t>
-      </w:r>
-    </w:p>
-    <w:p>
-      <w:pPr>
-        <w:tabs>
-          <w:tab w:val="left" w:pos="1380"/>
-        </w:tabs>
-        <w:rPr>
-          <w:lang w:val="en-US"/>
-        </w:rPr>
-      </w:pPr>
-      <w:r>
-        <w:rPr>
-          <w:lang w:val="en-US"/>
-        </w:rPr>
-        <w:t xml:space="preserve">│ + </w:t>
-      </w:r>
-      <w:proofErr w:type="spellStart"/>
-      <w:proofErr w:type="gramStart"/>
-      <w:r>
-        <w:rPr>
-          <w:lang w:val="en-US"/>
-        </w:rPr>
-        <w:t>ResetField</w:t>
-      </w:r>
-      <w:proofErr w:type="spellEnd"/>
-      <w:r>
-        <w:rPr>
-          <w:lang w:val="en-US"/>
-        </w:rPr>
-        <w:t>(</w:t>
-      </w:r>
-      <w:proofErr w:type="gramEnd"/>
-      <w:r>
-        <w:rPr>
-          <w:lang w:val="en-US"/>
-        </w:rPr>
-        <w:t>): void          │</w:t>
-      </w:r>
-    </w:p>
-    <w:p>
-      <w:pPr>
-        <w:tabs>
-          <w:tab w:val="left" w:pos="1380"/>
-        </w:tabs>
-        <w:rPr>
-          <w:lang w:val="en-US"/>
-        </w:rPr>
-      </w:pPr>
-      <w:r>
-        <w:rPr>
-          <w:lang w:val="en-US"/>
-        </w:rPr>
-        <w:t>└───────────────────────────────┘</w:t>
-      </w:r>
-    </w:p>
-    <w:p>
-      <w:pPr>
-        <w:rPr>
-          <w:b/>
-          <w:bCs/>
-          <w:lang w:val="en-US"/>
-        </w:rPr>
-      </w:pPr>
-      <w:proofErr w:type="spellStart"/>
-      <w:r>
-        <w:rPr>
-          <w:b/>
-          <w:bCs/>
-          <w:lang w:val="en-US"/>
-        </w:rPr>
-        <w:t>TicTacToManager</w:t>
-      </w:r>
-      <w:proofErr w:type="spellEnd"/>
     </w:p>
     <w:p>
       <w:pPr>
@@ -2434,49 +2190,17 @@
         <w:rPr>
           <w:b/>
           <w:bCs/>
-        </w:rPr>
-      </w:pPr>
-      <w:proofErr w:type="spellStart"/>
-      <w:r>
-        <w:rPr>
-          <w:b/>
-          <w:bCs/>
-        </w:rPr>
-        <w:t>Erklärung</w:t>
-      </w:r>
-      <w:proofErr w:type="spellEnd"/>
-      <w:r>
-        <w:rPr>
-          <w:b/>
-          <w:bCs/>
-        </w:rPr>
-        <w:t xml:space="preserve"> </w:t>
-      </w:r>
-      <w:proofErr w:type="spellStart"/>
-      <w:r>
-        <w:rPr>
-          <w:b/>
-          <w:bCs/>
-        </w:rPr>
-        <w:t>der</w:t>
-      </w:r>
-      <w:proofErr w:type="spellEnd"/>
-      <w:r>
-        <w:rPr>
-          <w:b/>
-          <w:bCs/>
-        </w:rPr>
-        <w:t xml:space="preserve"> </w:t>
-      </w:r>
-      <w:proofErr w:type="spellStart"/>
-      <w:r>
-        <w:rPr>
-          <w:b/>
-          <w:bCs/>
-        </w:rPr>
-        <w:t>Beziehung</w:t>
-      </w:r>
-      <w:proofErr w:type="spellEnd"/>
+          <w:lang w:val="de-DE"/>
+        </w:rPr>
+      </w:pPr>
+      <w:r>
+        <w:rPr>
+          <w:b/>
+          <w:bCs/>
+          <w:lang w:val="de-DE"/>
+        </w:rPr>
+        <w:t>Erklärung der Beziehung</w:t>
+      </w:r>
     </w:p>
     <w:p>
       <w:pPr>
@@ -2685,7 +2409,6 @@
         <w:t>[</w:t>
       </w:r>
       <w:proofErr w:type="spellStart"/>
-      <w:proofErr w:type="gramStart"/>
       <w:r>
         <w:rPr>
           <w:lang w:val="en-US"/>
@@ -2697,14 +2420,7 @@
         <w:rPr>
           <w:lang w:val="en-US"/>
         </w:rPr>
-        <w:t>(</w:t>
-      </w:r>
-      <w:proofErr w:type="gramEnd"/>
-      <w:r>
-        <w:rPr>
-          <w:lang w:val="en-US"/>
-        </w:rPr>
-        <w:t>)]</w:t>
+        <w:t>()]</w:t>
       </w:r>
     </w:p>
     <w:p>
@@ -2805,7 +2521,6 @@
         <w:t xml:space="preserve">[Bombe aktiv?] ── Ja → </w:t>
       </w:r>
       <w:proofErr w:type="spellStart"/>
-      <w:proofErr w:type="gramStart"/>
       <w:r>
         <w:rPr>
           <w:lang w:val="de-DE"/>
@@ -2817,14 +2532,7 @@
         <w:rPr>
           <w:lang w:val="de-DE"/>
         </w:rPr>
-        <w:t>(</w:t>
-      </w:r>
-      <w:proofErr w:type="gramEnd"/>
-      <w:r>
-        <w:rPr>
-          <w:lang w:val="de-DE"/>
-        </w:rPr>
-        <w:t>)</w:t>
+        <w:t>()</w:t>
       </w:r>
     </w:p>
     <w:p>
@@ -2853,7 +2561,6 @@
         <w:t xml:space="preserve">[Feature aktiv?] ── Ja → </w:t>
       </w:r>
       <w:proofErr w:type="spellStart"/>
-      <w:proofErr w:type="gramStart"/>
       <w:r>
         <w:rPr>
           <w:lang w:val="de-DE"/>
@@ -2865,14 +2572,7 @@
         <w:rPr>
           <w:lang w:val="de-DE"/>
         </w:rPr>
-        <w:t>(</w:t>
-      </w:r>
-      <w:proofErr w:type="gramEnd"/>
-      <w:r>
-        <w:rPr>
-          <w:lang w:val="de-DE"/>
-        </w:rPr>
-        <w:t>)</w:t>
+        <w:t>()</w:t>
       </w:r>
     </w:p>
     <w:p>
@@ -2933,7 +2633,6 @@
         <w:t>[</w:t>
       </w:r>
       <w:proofErr w:type="spellStart"/>
-      <w:proofErr w:type="gramStart"/>
       <w:r>
         <w:rPr>
           <w:lang w:val="en-US"/>
@@ -2945,14 +2644,7 @@
         <w:rPr>
           <w:lang w:val="en-US"/>
         </w:rPr>
-        <w:t>(</w:t>
-      </w:r>
-      <w:proofErr w:type="gramEnd"/>
-      <w:r>
-        <w:rPr>
-          <w:lang w:val="en-US"/>
-        </w:rPr>
-        <w:t>)]</w:t>
+        <w:t>()]</w:t>
       </w:r>
     </w:p>
     <w:p>
@@ -2971,47 +2663,39 @@
     <w:p>
       <w:pPr>
         <w:rPr>
-          <w:lang w:val="en-US"/>
-        </w:rPr>
-      </w:pPr>
-      <w:r>
-        <w:rPr>
-          <w:lang w:val="en-US"/>
+          <w:lang w:val="de-DE"/>
+        </w:rPr>
+      </w:pPr>
+      <w:r>
+        <w:rPr>
+          <w:lang w:val="de-DE"/>
         </w:rPr>
         <w:t>[</w:t>
       </w:r>
       <w:proofErr w:type="spellStart"/>
-      <w:proofErr w:type="gramStart"/>
-      <w:r>
-        <w:rPr>
-          <w:lang w:val="en-US"/>
+      <w:r>
+        <w:rPr>
+          <w:lang w:val="de-DE"/>
         </w:rPr>
         <w:t>EndTurn</w:t>
       </w:r>
       <w:proofErr w:type="spellEnd"/>
       <w:r>
         <w:rPr>
-          <w:lang w:val="en-US"/>
-        </w:rPr>
-        <w:t>(</w:t>
-      </w:r>
-      <w:proofErr w:type="gramEnd"/>
-      <w:r>
-        <w:rPr>
-          <w:lang w:val="en-US"/>
-        </w:rPr>
-        <w:t>)]</w:t>
-      </w:r>
-    </w:p>
-    <w:p>
-      <w:pPr>
-        <w:rPr>
-          <w:lang w:val="en-US"/>
-        </w:rPr>
-      </w:pPr>
-      <w:r>
-        <w:rPr>
-          <w:lang w:val="en-US"/>
+          <w:lang w:val="de-DE"/>
+        </w:rPr>
+        <w:t>()]</w:t>
+      </w:r>
+    </w:p>
+    <w:p>
+      <w:pPr>
+        <w:rPr>
+          <w:lang w:val="de-DE"/>
+        </w:rPr>
+      </w:pPr>
+      <w:r>
+        <w:rPr>
+          <w:lang w:val="de-DE"/>
         </w:rPr>
         <w:t xml:space="preserve">        ↓</w:t>
       </w:r>
@@ -3019,28 +2703,28 @@
     <w:p>
       <w:pPr>
         <w:rPr>
-          <w:lang w:val="en-US"/>
-        </w:rPr>
-      </w:pPr>
-      <w:r>
-        <w:rPr>
-          <w:lang w:val="en-US"/>
-        </w:rPr>
-        <w:t xml:space="preserve">[Win / Draw </w:t>
-      </w:r>
-      <w:proofErr w:type="spellStart"/>
-      <w:r>
-        <w:rPr>
-          <w:lang w:val="en-US"/>
-        </w:rPr>
-        <w:t>prüfen</w:t>
-      </w:r>
-      <w:proofErr w:type="spellEnd"/>
-      <w:r>
-        <w:rPr>
-          <w:lang w:val="en-US"/>
-        </w:rPr>
-        <w:t>]</w:t>
+          <w:lang w:val="de-DE"/>
+        </w:rPr>
+      </w:pPr>
+      <w:r>
+        <w:rPr>
+          <w:lang w:val="de-DE"/>
+        </w:rPr>
+        <w:t>[</w:t>
+      </w:r>
+      <w:proofErr w:type="spellStart"/>
+      <w:r>
+        <w:rPr>
+          <w:lang w:val="de-DE"/>
+        </w:rPr>
+        <w:t>Win</w:t>
+      </w:r>
+      <w:proofErr w:type="spellEnd"/>
+      <w:r>
+        <w:rPr>
+          <w:lang w:val="de-DE"/>
+        </w:rPr>
+        <w:t xml:space="preserve"> / Draw prüfen]</w:t>
       </w:r>
     </w:p>
     <w:p>
@@ -3161,12 +2845,12 @@
     <w:p>
       <w:pPr>
         <w:rPr>
-          <w:lang w:val="en-US"/>
-        </w:rPr>
-      </w:pPr>
-      <w:r>
-        <w:rPr>
-          <w:lang w:val="en-US"/>
+          <w:lang w:val="de-DE"/>
+        </w:rPr>
+      </w:pPr>
+      <w:r>
+        <w:rPr>
+          <w:lang w:val="de-DE"/>
         </w:rPr>
         <w:t>Start</w:t>
       </w:r>
@@ -3360,47 +3044,41 @@
     <w:p>
       <w:pPr>
         <w:rPr>
-          <w:lang w:val="de-DE"/>
-        </w:rPr>
-      </w:pPr>
-      <w:proofErr w:type="spellStart"/>
-      <w:r>
-        <w:rPr>
-          <w:lang w:val="de-DE"/>
-        </w:rPr>
-        <w:t>Powerup</w:t>
-      </w:r>
-      <w:proofErr w:type="spellEnd"/>
-      <w:r>
-        <w:rPr>
-          <w:lang w:val="de-DE"/>
-        </w:rPr>
-        <w:t xml:space="preserve"> einsammeln: </w:t>
-      </w:r>
-      <w:r>
-        <w:rPr>
-          <w:lang w:val="de-DE"/>
-        </w:rPr>
-        <w:t>https://pixabay.com/de/sound-effects/film-spezialeffekte-coin-c-02-102844/</w:t>
-      </w:r>
-    </w:p>
-    <w:p>
-      <w:pPr>
-        <w:rPr>
-          <w:lang w:val="de-DE"/>
-        </w:rPr>
-      </w:pPr>
-      <w:r>
-        <w:rPr>
-          <w:lang w:val="de-DE"/>
-        </w:rPr>
-        <w:t xml:space="preserve">Explosion: </w:t>
-      </w:r>
-      <w:r>
-        <w:rPr>
-          <w:lang w:val="de-DE"/>
-        </w:rPr>
-        <w:t>https://pixabay.com/de/sound-effects/film-spezialeffekte-coin-upaif-14631/</w:t>
+          <w:lang w:val="en-US"/>
+        </w:rPr>
+      </w:pPr>
+      <w:r>
+        <w:rPr>
+          <w:lang w:val="en-US"/>
+        </w:rPr>
+        <w:t xml:space="preserve">Powerup </w:t>
+      </w:r>
+      <w:proofErr w:type="spellStart"/>
+      <w:r>
+        <w:rPr>
+          <w:lang w:val="en-US"/>
+        </w:rPr>
+        <w:t>einsammeln</w:t>
+      </w:r>
+      <w:proofErr w:type="spellEnd"/>
+      <w:r>
+        <w:rPr>
+          <w:lang w:val="en-US"/>
+        </w:rPr>
+        <w:t>: https://pixabay.com/de/sound-effects/film-spezialeffekte-coin-c-02-102844/</w:t>
+      </w:r>
+    </w:p>
+    <w:p>
+      <w:pPr>
+        <w:rPr>
+          <w:lang w:val="en-US"/>
+        </w:rPr>
+      </w:pPr>
+      <w:r>
+        <w:rPr>
+          <w:lang w:val="en-US"/>
+        </w:rPr>
+        <w:t>Explosion: https://pixabay.com/de/sound-effects/film-spezialeffekte-coin-upaif-14631/</w:t>
       </w:r>
     </w:p>
     <w:p>
@@ -3584,51 +3262,133 @@
     <w:p>
       <w:pPr>
         <w:rPr>
-          <w:lang w:val="en-US"/>
-        </w:rPr>
-      </w:pPr>
-    </w:p>
-    <w:p>
-      <w:pPr>
-        <w:rPr>
-          <w:lang w:val="en-US"/>
-        </w:rPr>
-      </w:pPr>
-    </w:p>
-    <w:p>
-      <w:pPr>
-        <w:rPr>
-          <w:lang w:val="en-US"/>
-        </w:rPr>
-      </w:pPr>
-    </w:p>
-    <w:p>
-      <w:pPr>
-        <w:rPr>
-          <w:lang w:val="en-US"/>
-        </w:rPr>
-      </w:pPr>
-    </w:p>
-    <w:p>
-      <w:pPr>
-        <w:rPr>
-          <w:lang w:val="en-US"/>
-        </w:rPr>
-      </w:pPr>
-    </w:p>
-    <w:p>
-      <w:pPr>
-        <w:rPr>
-          <w:lang w:val="en-US"/>
-        </w:rPr>
-      </w:pPr>
-    </w:p>
-    <w:p>
-      <w:pPr>
-        <w:rPr>
-          <w:lang w:val="en-US"/>
-        </w:rPr>
-      </w:pPr>
+          <w:lang w:val="de-DE"/>
+        </w:rPr>
+      </w:pPr>
+      <w:proofErr w:type="spellStart"/>
+      <w:r>
+        <w:rPr>
+          <w:lang w:val="de-DE"/>
+        </w:rPr>
+        <w:t>pong</w:t>
+      </w:r>
+      <w:proofErr w:type="spellEnd"/>
+    </w:p>
+    <w:p>
+      <w:pPr>
+        <w:rPr>
+          <w:lang w:val="en-US"/>
+        </w:rPr>
+      </w:pPr>
+      <w:r>
+        <w:rPr>
+          <w:lang w:val="en-US"/>
+        </w:rPr>
+        <w:t xml:space="preserve">background music: </w:t>
+      </w:r>
+      <w:hyperlink r:id="rId12" w:history="1">
+        <w:r>
+          <w:rPr>
+            <w:rStyle w:val="a4"/>
+            <w:lang w:val="en-US"/>
+          </w:rPr>
+          <w:t>https://pixabay.com/de/sound-effects/musical-game-music-loop-6-144641/</w:t>
+        </w:r>
+      </w:hyperlink>
+    </w:p>
+    <w:p>
+      <w:pPr>
+        <w:rPr>
+          <w:lang w:val="en-US"/>
+        </w:rPr>
+      </w:pPr>
+      <w:r>
+        <w:rPr>
+          <w:lang w:val="en-US"/>
+        </w:rPr>
+        <w:t>https://pixabay.com/de/sound-effects/musical-game-music-loop-4-144341/</w:t>
+      </w:r>
+    </w:p>
+    <w:p>
+      <w:pPr>
+        <w:rPr>
+          <w:lang w:val="en-US"/>
+        </w:rPr>
+      </w:pPr>
+      <w:r>
+        <w:rPr>
+          <w:lang w:val="en-US"/>
+        </w:rPr>
+        <w:t xml:space="preserve">ball hit: </w:t>
+      </w:r>
+      <w:hyperlink r:id="rId13" w:history="1">
+        <w:r>
+          <w:rPr>
+            <w:rStyle w:val="a4"/>
+            <w:lang w:val="en-US"/>
+          </w:rPr>
+          <w:t>https://pixabay.com/de/sound-effects/film-spezialeffekte-071658-pongwav-93028/</w:t>
+        </w:r>
+      </w:hyperlink>
+    </w:p>
+    <w:p>
+      <w:pPr>
+        <w:rPr>
+          <w:lang w:val="en-US"/>
+        </w:rPr>
+      </w:pPr>
+    </w:p>
+    <w:p>
+      <w:pPr>
+        <w:rPr>
+          <w:lang w:val="en-US"/>
+        </w:rPr>
+      </w:pPr>
+      <w:proofErr w:type="spellStart"/>
+      <w:r>
+        <w:rPr>
+          <w:lang w:val="en-US"/>
+        </w:rPr>
+        <w:t>winsound</w:t>
+      </w:r>
+      <w:proofErr w:type="spellEnd"/>
+      <w:r>
+        <w:rPr>
+          <w:lang w:val="en-US"/>
+        </w:rPr>
+        <w:t xml:space="preserve">_ </w:t>
+      </w:r>
+      <w:hyperlink r:id="rId14" w:history="1">
+        <w:r>
+          <w:rPr>
+            <w:rStyle w:val="a4"/>
+            <w:lang w:val="en-US"/>
+          </w:rPr>
+          <w:t>https://pixabay.com/de/sound-effects/film-spezialeffekte-decidemp3-14575/</w:t>
+        </w:r>
+      </w:hyperlink>
+    </w:p>
+    <w:p>
+      <w:pPr>
+        <w:rPr>
+          <w:lang w:val="en-US"/>
+        </w:rPr>
+      </w:pPr>
+      <w:r>
+        <w:rPr>
+          <w:lang w:val="en-US"/>
+        </w:rPr>
+        <w:t xml:space="preserve">goal sound: </w:t>
+      </w:r>
+      <w:hyperlink r:id="rId15" w:history="1">
+        <w:r>
+          <w:rPr>
+            <w:rStyle w:val="a4"/>
+            <w:lang w:val="en-US"/>
+          </w:rPr>
+          <w:t>https://pixabay.com/de/sound-effects/film-spezialeffekte-scale-e6-14577/</w:t>
+        </w:r>
+      </w:hyperlink>
     </w:p>
     <w:p>
       <w:pPr>
@@ -3641,13 +3401,146 @@
           <w:lang w:val="en-US"/>
         </w:rPr>
         <w:lastRenderedPageBreak/>
+        <w:t xml:space="preserve">button: </w:t>
+      </w:r>
+      <w:r>
+        <w:rPr>
+          <w:lang w:val="en-US"/>
+        </w:rPr>
+        <w:t>https://pixabay.com/de/sound-effects/film-spezialeffekte-button-pressed-38129/</w:t>
+      </w:r>
+    </w:p>
+    <w:p>
+      <w:pPr>
+        <w:rPr>
+          <w:lang w:val="en-US"/>
+        </w:rPr>
+      </w:pPr>
+      <w:hyperlink r:id="rId16" w:history="1">
+        <w:r>
+          <w:rPr>
+            <w:rStyle w:val="a4"/>
+            <w:lang w:val="en-US"/>
+          </w:rPr>
+          <w:t>https://pixabay.com/de/sound-effects/film-spezialeffekte-button-305770/</w:t>
+        </w:r>
+      </w:hyperlink>
+    </w:p>
+    <w:p>
+      <w:pPr>
+        <w:rPr>
+          <w:lang w:val="en-US"/>
+        </w:rPr>
+      </w:pPr>
+    </w:p>
+    <w:p>
+      <w:pPr>
+        <w:rPr>
+          <w:lang w:val="en-US"/>
+        </w:rPr>
+      </w:pPr>
+      <w:r>
+        <w:rPr>
+          <w:lang w:val="en-US"/>
+        </w:rPr>
+        <w:t xml:space="preserve">This: </w:t>
+      </w:r>
+      <w:hyperlink r:id="rId17" w:history="1">
+        <w:r>
+          <w:rPr>
+            <w:rStyle w:val="a4"/>
+            <w:lang w:val="en-US"/>
+          </w:rPr>
+          <w:t>https://pixabay.com/de/sound-effects/film-spezialeffekte-xylo-fx-11-37611/</w:t>
+        </w:r>
+      </w:hyperlink>
+    </w:p>
+    <w:p>
+      <w:pPr>
+        <w:rPr>
+          <w:lang w:val="en-US"/>
+        </w:rPr>
+      </w:pPr>
+    </w:p>
+    <w:p>
+      <w:pPr>
+        <w:rPr>
+          <w:lang w:val="en-US"/>
+        </w:rPr>
+      </w:pPr>
+      <w:proofErr w:type="spellStart"/>
+      <w:r>
+        <w:rPr>
+          <w:lang w:val="en-US"/>
+        </w:rPr>
+        <w:t>Levls</w:t>
+      </w:r>
+      <w:proofErr w:type="spellEnd"/>
+      <w:r>
+        <w:rPr>
+          <w:lang w:val="en-US"/>
+        </w:rPr>
+        <w:t xml:space="preserve">: </w:t>
+      </w:r>
+      <w:r>
+        <w:rPr>
+          <w:lang w:val="en-US"/>
+        </w:rPr>
+        <w:t>https://pixabay.com/de/sound-effects/film-spezialeffekte-level-passed-143039/</w:t>
+      </w:r>
+    </w:p>
+    <w:p>
+      <w:pPr>
+        <w:rPr>
+          <w:lang w:val="en-US"/>
+        </w:rPr>
+      </w:pPr>
+      <w:r>
+        <w:rPr>
+          <w:lang w:val="en-US"/>
+        </w:rPr>
+        <w:t xml:space="preserve">This: </w:t>
+      </w:r>
+      <w:r>
+        <w:rPr>
+          <w:lang w:val="en-US"/>
+        </w:rPr>
+        <w:t>https://pixabay.com/de/sound-effects/film-spezialeffekte-get-coin-351945/</w:t>
+      </w:r>
+    </w:p>
+    <w:p>
+      <w:pPr>
+        <w:rPr>
+          <w:lang w:val="en-US"/>
+        </w:rPr>
+      </w:pPr>
+    </w:p>
+    <w:p>
+      <w:pPr>
+        <w:rPr>
+          <w:lang w:val="en-US"/>
+        </w:rPr>
+      </w:pPr>
+    </w:p>
+    <w:p>
+      <w:pPr>
+        <w:rPr>
+          <w:lang w:val="de-DE"/>
+        </w:rPr>
+      </w:pPr>
+      <w:proofErr w:type="spellStart"/>
+      <w:r>
+        <w:rPr>
+          <w:lang w:val="de-DE"/>
+        </w:rPr>
         <w:t>Breakout</w:t>
       </w:r>
-    </w:p>
-    <w:p>
-      <w:pPr>
-        <w:rPr>
-          <w:lang w:val="en-US"/>
+      <w:proofErr w:type="spellEnd"/>
+    </w:p>
+    <w:p>
+      <w:pPr>
+        <w:rPr>
+          <w:lang w:val="de-DE"/>
         </w:rPr>
       </w:pPr>
     </w:p>
@@ -4033,21 +3926,7 @@
         <w:rPr>
           <w:lang w:val="de-DE"/>
         </w:rPr>
-        <w:t xml:space="preserve"> Mit </w:t>
-      </w:r>
-      <w:proofErr w:type="gramStart"/>
-      <w:r>
-        <w:rPr>
-          <w:lang w:val="de-DE"/>
-        </w:rPr>
-        <w:t>PlaySFX(</w:t>
-      </w:r>
-      <w:proofErr w:type="gramEnd"/>
-      <w:r>
-        <w:rPr>
-          <w:lang w:val="de-DE"/>
-        </w:rPr>
-        <w:t>) ist er die zentrale Soundmaschine für das ganze Spiel.</w:t>
+        <w:t xml:space="preserve"> Mit PlaySFX() ist er die zentrale Soundmaschine für das ganze Spiel.</w:t>
       </w:r>
     </w:p>
     <w:p>
@@ -4236,6 +4115,7 @@
           <w:b/>
           <w:bCs/>
         </w:rPr>
+        <w:lastRenderedPageBreak/>
         <w:t xml:space="preserve">3. Die </w:t>
       </w:r>
       <w:proofErr w:type="spellStart"/>
@@ -4311,21 +4191,7 @@
         <w:rPr>
           <w:lang w:val="de-DE"/>
         </w:rPr>
-        <w:t xml:space="preserve"> Mit </w:t>
-      </w:r>
-      <w:proofErr w:type="gramStart"/>
-      <w:r>
-        <w:rPr>
-          <w:lang w:val="de-DE"/>
-        </w:rPr>
-        <w:t>UpdateCracks(</w:t>
-      </w:r>
-      <w:proofErr w:type="gramEnd"/>
-      <w:r>
-        <w:rPr>
-          <w:lang w:val="de-DE"/>
-        </w:rPr>
-        <w:t>) wechselt er die Bilder, um Schäden anzuzeigen.</w:t>
+        <w:t xml:space="preserve"> Mit UpdateCracks() wechselt er die Bilder, um Schäden anzuzeigen.</w:t>
       </w:r>
     </w:p>
     <w:p>
@@ -4455,7 +4321,6 @@
           <w:b/>
           <w:bCs/>
         </w:rPr>
-        <w:lastRenderedPageBreak/>
         <w:t xml:space="preserve">5. </w:t>
       </w:r>
       <w:proofErr w:type="spellStart"/>
@@ -4594,7 +4459,7 @@
     <w:p>
       <w:r>
         <w:pict w14:anchorId="053A8F53">
-          <v:rect id="_x0000_i1032" style="width:0;height:1.5pt" o:hralign="center" o:hrstd="t" o:hr="t" fillcolor="#a0a0a0" stroked="f"/>
+          <v:rect id="_x0000_i1026" style="width:0;height:1.5pt" o:hralign="center" o:hrstd="t" o:hr="t" fillcolor="#a0a0a0" stroked="f"/>
         </w:pict>
       </w:r>
     </w:p>
@@ -7046,6 +6911,7 @@
   <w:style w:type="character" w:default="1" w:styleId="a0">
     <w:name w:val="Default Paragraph Font"/>
     <w:uiPriority w:val="1"/>
+    <w:semiHidden/>
     <w:unhideWhenUsed/>
   </w:style>
   <w:style w:type="table" w:default="1" w:styleId="a1">

</xml_diff>